<commit_message>
ricerca su prezzi base in erp
</commit_message>
<xml_diff>
--- a/docs/Unita di misura e prezzi/Ricerca prezzi e listini/Best practice Prezzi e Listini.docx
+++ b/docs/Unita di misura e prezzi/Ricerca prezzi e listini/Best practice Prezzi e Listini.docx
@@ -4,7 +4,7 @@
   <w:body>
     <w:p>
       <w:pPr>
-        <w:pStyle w:val="Titolo"/>
+        <w:pStyle w:val="Title"/>
       </w:pPr>
       <w:r>
         <w:t>Gestione prezzi e listini degli erp best in class</w:t>
@@ -12,7 +12,7 @@
     </w:p>
     <w:p>
       <w:pPr>
-        <w:pStyle w:val="Sottotitolo"/>
+        <w:pStyle w:val="Subtitle"/>
       </w:pPr>
       <w:r>
         <w:t>Sia nella sezione prodotto sia nelle sezioni listino</w:t>
@@ -20,7 +20,7 @@
     </w:p>
     <w:p>
       <w:pPr>
-        <w:pStyle w:val="Titolo1"/>
+        <w:pStyle w:val="Heading1"/>
       </w:pPr>
       <w:r>
         <w:t>NetSuite</w:t>
@@ -43,25 +43,161 @@
     </w:p>
     <w:p>
       <w:pPr>
-        <w:pStyle w:val="Titolo2"/>
-      </w:pPr>
-      <w:r>
-        <w:t>NetSuite – sezione prodotto – Lato UX</w:t>
-      </w:r>
-    </w:p>
-    <w:p>
-      <w:r>
-        <w:t xml:space="preserve">Nella scheda dell'articolo (SKU), l'utente va nel tab </w:t>
+        <w:pStyle w:val="Heading2"/>
+      </w:pPr>
+      <w:r>
+        <w:t xml:space="preserve">NetSuite – </w:t>
+      </w:r>
+      <w:r>
+        <w:t>S</w:t>
+      </w:r>
+      <w:r>
+        <w:t>ezione prodotto – Lato UX</w:t>
+      </w:r>
+    </w:p>
+    <w:p>
+      <w:r>
+        <w:t>Nella scheda dell’articolo (il singolo SKU), le informazioni sono divise in due tab: “Sales/Pricing” e “Item vendor pricing”</w:t>
+      </w:r>
+    </w:p>
+    <w:p>
+      <w:r>
+        <w:t xml:space="preserve">Nel tab </w:t>
+      </w:r>
+      <w:r>
+        <w:rPr>
+          <w:i/>
+          <w:iCs/>
+        </w:rPr>
+        <w:t>Purchasing</w:t>
+      </w:r>
+      <w:r>
+        <w:t>, il costo interno e i listini fornitori sono mostrati in due punti diversi:</w:t>
+      </w:r>
+    </w:p>
+    <w:p>
+      <w:pPr>
+        <w:pStyle w:val="ListParagraph"/>
+        <w:numPr>
+          <w:ilvl w:val="0"/>
+          <w:numId w:val="24"/>
+        </w:numPr>
+      </w:pPr>
+      <w:r>
+        <w:t xml:space="preserve">c'è il campo </w:t>
       </w:r>
       <w:r>
         <w:rPr>
           <w:b/>
           <w:bCs/>
         </w:rPr>
+        <w:t>Purchase Price</w:t>
+      </w:r>
+      <w:r>
+        <w:t xml:space="preserve"> (Costo Base Standard) oppure </w:t>
+      </w:r>
+      <w:r>
+        <w:rPr>
+          <w:b/>
+          <w:bCs/>
+        </w:rPr>
+        <w:t>Average Cost</w:t>
+      </w:r>
+      <w:r>
+        <w:t xml:space="preserve"> (Costo Medio, in sola lettura).</w:t>
+      </w:r>
+    </w:p>
+    <w:p>
+      <w:pPr>
+        <w:pStyle w:val="ListParagraph"/>
+        <w:numPr>
+          <w:ilvl w:val="0"/>
+          <w:numId w:val="24"/>
+        </w:numPr>
+      </w:pPr>
+      <w:r>
+        <w:t>C’è la M</w:t>
+      </w:r>
+      <w:r>
+        <w:t>atrice Fornitori</w:t>
+      </w:r>
+    </w:p>
+    <w:p>
+      <w:pPr>
+        <w:pStyle w:val="ListParagraph"/>
+        <w:numPr>
+          <w:ilvl w:val="1"/>
+          <w:numId w:val="24"/>
+        </w:numPr>
+      </w:pPr>
+      <w:r>
+        <w:t>C'è una colonna Preferred (Fornitore Preferito) con un pallino/checkbox: indica quale fornitore usa il sistema di default se fai un'emissione automatica dell'ordine.</w:t>
+      </w:r>
+    </w:p>
+    <w:p>
+      <w:pPr>
+        <w:pStyle w:val="ListParagraph"/>
+        <w:numPr>
+          <w:ilvl w:val="1"/>
+          <w:numId w:val="24"/>
+        </w:numPr>
+      </w:pPr>
+      <w:r>
+        <w:t>Ogni riga rappresenta un fornitore associato.</w:t>
+      </w:r>
+    </w:p>
+    <w:p>
+      <w:pPr>
+        <w:pStyle w:val="ListParagraph"/>
+        <w:numPr>
+          <w:ilvl w:val="1"/>
+          <w:numId w:val="24"/>
+        </w:numPr>
+      </w:pPr>
+      <w:r>
+        <w:t>Le colonne mostrano: Fornitore, Codice Prodotto del Fornitore (Vendor Code), Prezzo Concordato, Quantità Minima (MOQ), Tempo di consegna (Lead Time).</w:t>
+      </w:r>
+    </w:p>
+    <w:p>
+      <w:pPr>
+        <w:pStyle w:val="ListParagraph"/>
+        <w:numPr>
+          <w:ilvl w:val="1"/>
+          <w:numId w:val="24"/>
+        </w:numPr>
+      </w:pPr>
+      <w:r>
+        <w:t>Per vedere gli scaglioni di quantità di quel specifico fornitore, si clicca sulla riga e si apre un popup con la scomposizione per quantità (es. 1-100 kg = 10€; 101+ kg = 8€).</w:t>
+      </w:r>
+    </w:p>
+    <w:p>
+      <w:pPr>
+        <w:pStyle w:val="ListParagraph"/>
+        <w:numPr>
+          <w:ilvl w:val="0"/>
+          <w:numId w:val="24"/>
+        </w:numPr>
+      </w:pPr>
+    </w:p>
+    <w:p>
+      <w:r>
+        <w:t>In</w:t>
+      </w:r>
+      <w:r>
+        <w:t xml:space="preserve"> </w:t>
+      </w:r>
+      <w:r>
+        <w:rPr>
+          <w:b/>
+          <w:bCs/>
+        </w:rPr>
         <w:t>"Sales / Pricing"</w:t>
       </w:r>
       <w:r>
-        <w:t xml:space="preserve">. Qui vede </w:t>
+        <w:t xml:space="preserve"> </w:t>
+      </w:r>
+      <w:r>
+        <w:t xml:space="preserve">vede </w:t>
       </w:r>
       <w:r>
         <w:rPr>
@@ -97,7 +233,7 @@
     </w:p>
     <w:p>
       <w:pPr>
-        <w:pStyle w:val="Paragrafoelenco"/>
+        <w:pStyle w:val="ListParagraph"/>
         <w:numPr>
           <w:ilvl w:val="0"/>
           <w:numId w:val="2"/>
@@ -114,10 +250,7 @@
         <w:t>Price Level</w:t>
       </w:r>
       <w:r>
-        <w:t>, cioè quello che chiamiamo</w:t>
-      </w:r>
-      <w:r>
-        <w:t xml:space="preserve"> listino:</w:t>
+        <w:t>, cioè quello che chiamiamo listino:</w:t>
       </w:r>
       <w:r>
         <w:t xml:space="preserve"> "Wholesale", "Retail", "Distributor", "VIP Client").</w:t>
@@ -125,22 +258,15 @@
     </w:p>
     <w:p>
       <w:pPr>
-        <w:pStyle w:val="Titolo4"/>
-        <w:spacing w:before="0"/>
-        <w:rPr>
-          <w:rFonts w:ascii="Arial" w:hAnsi="Arial" w:cs="Arial"/>
-        </w:rPr>
-      </w:pPr>
-      <w:r>
-        <w:rPr>
-          <w:rFonts w:ascii="Arial" w:hAnsi="Arial" w:cs="Arial"/>
-        </w:rPr>
+        <w:pStyle w:val="Heading3"/>
+      </w:pPr>
+      <w:r>
         <w:t>Come fa l'utente a capire la differenza visiva tra un listino e l'altro?</w:t>
       </w:r>
     </w:p>
     <w:p>
       <w:pPr>
-        <w:pStyle w:val="NormaleWeb"/>
+        <w:pStyle w:val="NormalWeb"/>
         <w:spacing w:before="0" w:beforeAutospacing="0"/>
         <w:rPr>
           <w:rFonts w:ascii="Arial" w:hAnsi="Arial" w:cs="Arial"/>
@@ -155,7 +281,7 @@
     </w:p>
     <w:tbl>
       <w:tblPr>
-        <w:tblStyle w:val="Tabellagriglia4-colore1"/>
+        <w:tblStyle w:val="GridTable4-Accent1"/>
         <w:tblW w:w="9351" w:type="dxa"/>
         <w:tblLook w:val="06A0" w:firstRow="1" w:lastRow="0" w:firstColumn="1" w:lastColumn="0" w:noHBand="1" w:noVBand="1"/>
       </w:tblPr>
@@ -184,7 +310,7 @@
             </w:pPr>
             <w:r>
               <w:rPr>
-                <w:rStyle w:val="Enfasigrassetto"/>
+                <w:rStyle w:val="Strong"/>
                 <w:rFonts w:ascii="Arial" w:hAnsi="Arial" w:cs="Arial"/>
               </w:rPr>
               <w:t>Price Level (Listino)</w:t>
@@ -205,7 +331,7 @@
             </w:pPr>
             <w:r>
               <w:rPr>
-                <w:rStyle w:val="Enfasigrassetto"/>
+                <w:rStyle w:val="Strong"/>
                 <w:rFonts w:ascii="Arial" w:hAnsi="Arial" w:cs="Arial"/>
               </w:rPr>
               <w:t>Qty 1-10 (EUR)</w:t>
@@ -226,7 +352,7 @@
             </w:pPr>
             <w:r>
               <w:rPr>
-                <w:rStyle w:val="Enfasigrassetto"/>
+                <w:rStyle w:val="Strong"/>
                 <w:rFonts w:ascii="Arial" w:hAnsi="Arial" w:cs="Arial"/>
               </w:rPr>
               <w:t>Qty 11-50 (EUR)</w:t>
@@ -247,7 +373,7 @@
             </w:pPr>
             <w:r>
               <w:rPr>
-                <w:rStyle w:val="Enfasigrassetto"/>
+                <w:rStyle w:val="Strong"/>
                 <w:rFonts w:ascii="Arial" w:hAnsi="Arial" w:cs="Arial"/>
               </w:rPr>
               <w:t>% Sconto</w:t>
@@ -268,7 +394,7 @@
             </w:pPr>
             <w:r>
               <w:rPr>
-                <w:rStyle w:val="Enfasigrassetto"/>
+                <w:rStyle w:val="Strong"/>
                 <w:rFonts w:ascii="Arial" w:hAnsi="Arial" w:cs="Arial"/>
               </w:rPr>
               <w:t>Status / Calcolo</w:t>
@@ -295,6 +421,7 @@
                 <w:b w:val="0"/>
                 <w:bCs w:val="0"/>
               </w:rPr>
+              <w:lastRenderedPageBreak/>
               <w:t>Base Price</w:t>
             </w:r>
             <w:r>
@@ -874,13 +1001,16 @@
     </w:p>
     <w:p>
       <w:pPr>
-        <w:pStyle w:val="Titolo2"/>
-      </w:pPr>
-      <w:r>
-        <w:t xml:space="preserve">NetSuite – sezione prodotto - </w:t>
-      </w:r>
-      <w:r>
-        <w:t>Lato DB</w:t>
+        <w:pStyle w:val="Heading2"/>
+      </w:pPr>
+      <w:r>
+        <w:t xml:space="preserve">NetSuite – </w:t>
+      </w:r>
+      <w:r>
+        <w:t>S</w:t>
+      </w:r>
+      <w:r>
+        <w:t>ezione prodotto - Lato DB</w:t>
       </w:r>
     </w:p>
     <w:p>
@@ -910,7 +1040,7 @@
     </w:p>
     <w:tbl>
       <w:tblPr>
-        <w:tblStyle w:val="Tabellagriglia4-colore1"/>
+        <w:tblStyle w:val="GridTable4-Accent1"/>
         <w:tblW w:w="0" w:type="auto"/>
         <w:tblLook w:val="06A0" w:firstRow="1" w:lastRow="0" w:firstColumn="1" w:lastColumn="0" w:noHBand="1" w:noVBand="1"/>
       </w:tblPr>
@@ -1264,7 +1394,7 @@
     </w:p>
     <w:tbl>
       <w:tblPr>
-        <w:tblStyle w:val="Tabellagriglia4-colore1"/>
+        <w:tblStyle w:val="GridTable4-Accent1"/>
         <w:tblW w:w="0" w:type="auto"/>
         <w:tblLook w:val="06A0" w:firstRow="1" w:lastRow="0" w:firstColumn="1" w:lastColumn="0" w:noHBand="1" w:noVBand="1"/>
       </w:tblPr>
@@ -1288,6 +1418,7 @@
               <w:spacing w:after="160" w:line="278" w:lineRule="auto"/>
             </w:pPr>
             <w:r>
+              <w:lastRenderedPageBreak/>
               <w:t>customer_id</w:t>
             </w:r>
           </w:p>
@@ -1492,7 +1623,7 @@
     </w:p>
     <w:tbl>
       <w:tblPr>
-        <w:tblStyle w:val="Tabellagriglia4-colore1"/>
+        <w:tblStyle w:val="GridTable4-Accent1"/>
         <w:tblW w:w="0" w:type="auto"/>
         <w:tblLook w:val="06A0" w:firstRow="1" w:lastRow="0" w:firstColumn="1" w:lastColumn="0" w:noHBand="1" w:noVBand="1"/>
       </w:tblPr>
@@ -2034,14 +2165,7 @@
           <w:b/>
           <w:bCs/>
         </w:rPr>
-        <w:t>U</w:t>
-      </w:r>
-      <w:r>
-        <w:rPr>
-          <w:b/>
-          <w:bCs/>
-        </w:rPr>
-        <w:t xml:space="preserve">n </w:t>
+        <w:t xml:space="preserve">Un </w:t>
       </w:r>
       <w:r>
         <w:rPr>
@@ -2062,7 +2186,7 @@
     </w:p>
     <w:p>
       <w:pPr>
-        <w:pStyle w:val="Titolo2"/>
+        <w:pStyle w:val="Heading2"/>
       </w:pPr>
       <w:r>
         <w:t>NetSuite – Sezione Listini – lato UX</w:t>
@@ -2090,13 +2214,10 @@
     </w:p>
     <w:p>
       <w:pPr>
-        <w:pStyle w:val="Titolo2"/>
-      </w:pPr>
-      <w:r>
-        <w:t xml:space="preserve">NetSuite – Sezione Listini – lato </w:t>
-      </w:r>
-      <w:r>
-        <w:t>DB</w:t>
+        <w:pStyle w:val="Heading2"/>
+      </w:pPr>
+      <w:r>
+        <w:t>NetSuite – Sezione Listini – lato DB</w:t>
       </w:r>
     </w:p>
     <w:p>
@@ -2109,9 +2230,10 @@
     </w:p>
     <w:p>
       <w:pPr>
-        <w:pStyle w:val="Titolo2"/>
-      </w:pPr>
-      <w:r>
+        <w:pStyle w:val="Heading2"/>
+      </w:pPr>
+      <w:r>
+        <w:lastRenderedPageBreak/>
         <w:t>C</w:t>
       </w:r>
       <w:r>
@@ -2208,7 +2330,7 @@
     </w:p>
     <w:p>
       <w:pPr>
-        <w:pStyle w:val="Titolo3"/>
+        <w:pStyle w:val="Heading3"/>
       </w:pPr>
       <w:r>
         <w:t>Cosa distingue un Price Level (listino) da un altro?</w:t>
@@ -2356,7 +2478,7 @@
     </w:p>
     <w:p>
       <w:pPr>
-        <w:pStyle w:val="Titolo1"/>
+        <w:pStyle w:val="Heading1"/>
       </w:pPr>
       <w:r>
         <w:t>SAP</w:t>
@@ -2406,6 +2528,7 @@
           <w:b/>
           <w:bCs/>
         </w:rPr>
+        <w:lastRenderedPageBreak/>
         <w:t>Esempio:</w:t>
       </w:r>
       <w:r>
@@ -2491,7 +2614,7 @@
     </w:p>
     <w:p>
       <w:pPr>
-        <w:pStyle w:val="Titolo2"/>
+        <w:pStyle w:val="Heading2"/>
       </w:pPr>
       <w:r>
         <w:t>Sap – sezione prodotto – lato UX</w:t>
@@ -2696,23 +2819,30 @@
     </w:p>
     <w:p>
       <w:pPr>
-        <w:pStyle w:val="Titolo1"/>
+        <w:pStyle w:val="Heading1"/>
         <w:tabs>
           <w:tab w:val="left" w:pos="2063"/>
         </w:tabs>
       </w:pPr>
       <w:r>
+        <w:lastRenderedPageBreak/>
         <w:t>Odoo</w:t>
       </w:r>
     </w:p>
     <w:p>
       <w:r>
-        <w:t>Odoo separa nettamente il Prezzo Base dalle Regole di Listino</w:t>
-      </w:r>
-    </w:p>
-    <w:p>
-      <w:pPr>
-        <w:pStyle w:val="Titolo2"/>
+        <w:t>Odoo separa nettamente i</w:t>
+      </w:r>
+      <w:r>
+        <w:t>l prezzo base/costo b</w:t>
+      </w:r>
+      <w:r>
+        <w:t>ase dalle Regole di Listino</w:t>
+      </w:r>
+    </w:p>
+    <w:p>
+      <w:pPr>
+        <w:pStyle w:val="Heading2"/>
       </w:pPr>
       <w:r>
         <w:t>Sezione prodotto – lato UX</w:t>
@@ -2779,6 +2909,22 @@
       <w:r>
         <w:t xml:space="preserve"> (Costo di acquisto base o calcolato).</w:t>
       </w:r>
+      <w:r>
+        <w:t xml:space="preserve"> </w:t>
+      </w:r>
+      <w:r>
+        <w:t xml:space="preserve">L'utente può scriverlo a mano o far fare a Odoo il calcolo del </w:t>
+      </w:r>
+      <w:r>
+        <w:rPr>
+          <w:i/>
+          <w:iCs/>
+        </w:rPr>
+        <w:t>Costo Medio (AVCO)</w:t>
+      </w:r>
+      <w:r>
+        <w:t xml:space="preserve"> in base alle fatture d'acquisto.</w:t>
+      </w:r>
     </w:p>
     <w:p>
       <w:pPr>
@@ -2897,13 +3043,10 @@
     </w:p>
     <w:p>
       <w:pPr>
-        <w:pStyle w:val="Titolo2"/>
-      </w:pPr>
-      <w:r>
-        <w:t xml:space="preserve">Sezione prodotto – lato </w:t>
-      </w:r>
-      <w:r>
-        <w:t>DB</w:t>
+        <w:pStyle w:val="Heading2"/>
+      </w:pPr>
+      <w:r>
+        <w:t>Sezione prodotto – lato DB</w:t>
       </w:r>
     </w:p>
     <w:p>
@@ -2974,7 +3117,6 @@
         </w:numPr>
       </w:pPr>
       <w:r>
-        <w:lastRenderedPageBreak/>
         <w:t xml:space="preserve">standard_price: 60.00 </w:t>
       </w:r>
       <w:r>
@@ -3045,6 +3187,7 @@
         </w:numPr>
       </w:pPr>
       <w:r>
+        <w:lastRenderedPageBreak/>
         <w:t>id: 201</w:t>
       </w:r>
     </w:p>
@@ -3135,13 +3278,18 @@
     </w:p>
     <w:p>
       <w:pPr>
-        <w:pStyle w:val="Titolo2"/>
-      </w:pPr>
-      <w:r>
-        <w:t xml:space="preserve">Sezione </w:t>
-      </w:r>
-      <w:r>
-        <w:t>Listini – Lato UX</w:t>
+        <w:pStyle w:val="Heading2"/>
+      </w:pPr>
+      <w:r>
+        <w:t>Sezione Listini – Lato UX</w:t>
+      </w:r>
+    </w:p>
+    <w:p>
+      <w:pPr>
+        <w:pStyle w:val="Heading3"/>
+      </w:pPr>
+      <w:r>
+        <w:t>Listini di vendita</w:t>
       </w:r>
     </w:p>
     <w:p>
@@ -3225,21 +3373,161 @@
     </w:p>
     <w:p>
       <w:pPr>
-        <w:pStyle w:val="Titolo1"/>
-      </w:pPr>
-      <w:r>
-        <w:t>Dynamics 365</w:t>
-      </w:r>
-    </w:p>
-    <w:p>
-      <w:r>
-        <w:t xml:space="preserve">Microsoft ha recentemente introdotto la nuova gestione </w:t>
-      </w:r>
+        <w:pStyle w:val="Heading3"/>
+      </w:pPr>
+      <w:r>
+        <w:t>Listini di acquisto</w:t>
+      </w:r>
+    </w:p>
+    <w:p>
       <w:r>
         <w:rPr>
           <w:b/>
           <w:bCs/>
         </w:rPr>
+        <w:t>Sezione Fornitori (Vendors):</w:t>
+      </w:r>
+      <w:r>
+        <w:t xml:space="preserve"> Nel tab </w:t>
+      </w:r>
+      <w:r>
+        <w:rPr>
+          <w:i/>
+          <w:iCs/>
+        </w:rPr>
+        <w:t>Purchase</w:t>
+      </w:r>
+      <w:r>
+        <w:t xml:space="preserve">, l'utente vede la tabella </w:t>
+      </w:r>
+      <w:r>
+        <w:rPr>
+          <w:b/>
+          <w:bCs/>
+        </w:rPr>
+        <w:t>Vendors</w:t>
+      </w:r>
+      <w:r>
+        <w:t>.</w:t>
+      </w:r>
+    </w:p>
+    <w:p>
+      <w:pPr>
+        <w:numPr>
+          <w:ilvl w:val="0"/>
+          <w:numId w:val="21"/>
+        </w:numPr>
+      </w:pPr>
+      <w:r>
+        <w:t>L'utente inserisce una lista di fornitori ordinata per priorità (drag &amp; drop con la prima riga che fa da fornitore principale).</w:t>
+      </w:r>
+    </w:p>
+    <w:p>
+      <w:pPr>
+        <w:numPr>
+          <w:ilvl w:val="0"/>
+          <w:numId w:val="21"/>
+        </w:numPr>
+      </w:pPr>
+      <w:r>
+        <w:t xml:space="preserve">La tabella mostra in affiancamento: </w:t>
+      </w:r>
+      <w:r>
+        <w:rPr>
+          <w:i/>
+          <w:iCs/>
+        </w:rPr>
+        <w:t>Fornitore</w:t>
+      </w:r>
+      <w:r>
+        <w:t xml:space="preserve">, </w:t>
+      </w:r>
+      <w:r>
+        <w:rPr>
+          <w:i/>
+          <w:iCs/>
+        </w:rPr>
+        <w:t>Quantità Minima</w:t>
+      </w:r>
+      <w:r>
+        <w:t xml:space="preserve">, </w:t>
+      </w:r>
+      <w:r>
+        <w:rPr>
+          <w:i/>
+          <w:iCs/>
+        </w:rPr>
+        <w:t>Prezzo d'Acquisto</w:t>
+      </w:r>
+      <w:r>
+        <w:t xml:space="preserve">, </w:t>
+      </w:r>
+      <w:r>
+        <w:rPr>
+          <w:i/>
+          <w:iCs/>
+        </w:rPr>
+        <w:t>Sconto %</w:t>
+      </w:r>
+      <w:r>
+        <w:t xml:space="preserve">, </w:t>
+      </w:r>
+      <w:r>
+        <w:rPr>
+          <w:i/>
+          <w:iCs/>
+        </w:rPr>
+        <w:t>Tempo di Consegna (in giorni)</w:t>
+      </w:r>
+      <w:r>
+        <w:t>.</w:t>
+      </w:r>
+    </w:p>
+    <w:p>
+      <w:pPr>
+        <w:numPr>
+          <w:ilvl w:val="0"/>
+          <w:numId w:val="21"/>
+        </w:numPr>
+      </w:pPr>
+      <w:r>
+        <w:rPr>
+          <w:b/>
+          <w:bCs/>
+        </w:rPr>
+        <w:t>Distinzione visiva:</w:t>
+      </w:r>
+      <w:r>
+        <w:t xml:space="preserve"> Il costo interno dell'articolo sta nel form principale ed è univoco. I costi dei fornitori sono righe nidificate nel tab </w:t>
+      </w:r>
+      <w:r>
+        <w:rPr>
+          <w:i/>
+          <w:iCs/>
+        </w:rPr>
+        <w:t>Purchase</w:t>
+      </w:r>
+      <w:r>
+        <w:t>.</w:t>
+      </w:r>
+    </w:p>
+    <w:p>
+      <w:pPr>
+        <w:pStyle w:val="Heading1"/>
+      </w:pPr>
+      <w:r>
+        <w:t>Dynamics 365</w:t>
+      </w:r>
+    </w:p>
+    <w:p>
+      <w:r>
+        <w:t xml:space="preserve">Microsoft ha recentemente introdotto la nuova gestione </w:t>
+      </w:r>
+      <w:r>
+        <w:rPr>
+          <w:b/>
+          <w:bCs/>
+        </w:rPr>
         <w:t>"Sales Price List"</w:t>
       </w:r>
       <w:r>
@@ -3248,13 +3536,10 @@
     </w:p>
     <w:p>
       <w:pPr>
-        <w:pStyle w:val="Titolo2"/>
-      </w:pPr>
-      <w:r>
-        <w:t xml:space="preserve">Sezione </w:t>
-      </w:r>
-      <w:r>
-        <w:t>Prodotto (“item card”) – Lato UX</w:t>
+        <w:pStyle w:val="Heading2"/>
+      </w:pPr>
+      <w:r>
+        <w:t>Sezione Prodotto (“item card”) – Lato UX</w:t>
       </w:r>
     </w:p>
     <w:p>
@@ -3320,6 +3605,7 @@
     </w:p>
     <w:p>
       <w:r>
+        <w:lastRenderedPageBreak/>
         <w:t xml:space="preserve">Per vedere gli altri prezzi, in cima c'è un menu di navigazione chiamato </w:t>
       </w:r>
       <w:r>
@@ -3372,7 +3658,6 @@
         </w:rPr>
       </w:pPr>
       <w:r>
-        <w:lastRenderedPageBreak/>
         <w:t xml:space="preserve">Assign-to Type: Indica a chi si applica (es. </w:t>
       </w:r>
       <w:r>
@@ -3474,13 +3759,10 @@
     </w:p>
     <w:p>
       <w:pPr>
-        <w:pStyle w:val="Titolo2"/>
-      </w:pPr>
-      <w:r>
-        <w:t xml:space="preserve">Sezione Prodotto (“item card”) – Lato </w:t>
-      </w:r>
-      <w:r>
-        <w:t>DB</w:t>
+        <w:pStyle w:val="Heading2"/>
+      </w:pPr>
+      <w:r>
+        <w:t>Sezione Prodotto (“item card”) – Lato DB</w:t>
       </w:r>
     </w:p>
     <w:p>
@@ -3702,27 +3984,16 @@
         </w:numPr>
       </w:pPr>
       <w:r>
+        <w:lastRenderedPageBreak/>
         <w:t>Ending Date: 2026-12-31</w:t>
       </w:r>
     </w:p>
     <w:p>
       <w:pPr>
-        <w:pStyle w:val="Titolo2"/>
-      </w:pPr>
-      <w:r>
-        <w:t xml:space="preserve">Dynamics 365 - </w:t>
-      </w:r>
-      <w:r>
-        <w:t xml:space="preserve">Sezione </w:t>
-      </w:r>
-      <w:r>
-        <w:t>Listini</w:t>
-      </w:r>
-      <w:r>
-        <w:t xml:space="preserve"> – Lato </w:t>
-      </w:r>
-      <w:r>
-        <w:t>UX</w:t>
+        <w:pStyle w:val="Heading2"/>
+      </w:pPr>
+      <w:r>
+        <w:t>Dynamics 365 - Sezione Listini – Lato UX</w:t>
       </w:r>
     </w:p>
     <w:p>
@@ -3738,7 +4009,6 @@
         </w:numPr>
       </w:pPr>
       <w:r>
-        <w:lastRenderedPageBreak/>
         <w:t xml:space="preserve">Business Central offre la funzione </w:t>
       </w:r>
       <w:r>
@@ -3764,7 +4034,7 @@
     </w:p>
     <w:p>
       <w:pPr>
-        <w:pStyle w:val="Titolo1"/>
+        <w:pStyle w:val="Heading1"/>
       </w:pPr>
       <w:r>
         <w:t>SINTESI</w:t>
@@ -3777,7 +4047,7 @@
     </w:p>
     <w:p>
       <w:pPr>
-        <w:pStyle w:val="Paragrafoelenco"/>
+        <w:pStyle w:val="ListParagraph"/>
         <w:numPr>
           <w:ilvl w:val="0"/>
           <w:numId w:val="18"/>
@@ -3796,7 +4066,7 @@
     </w:p>
     <w:p>
       <w:pPr>
-        <w:pStyle w:val="Paragrafoelenco"/>
+        <w:pStyle w:val="ListParagraph"/>
         <w:numPr>
           <w:ilvl w:val="0"/>
           <w:numId w:val="18"/>
@@ -3829,40 +4099,31 @@
     </w:p>
     <w:p>
       <w:pPr>
-        <w:pStyle w:val="Paragrafoelenco"/>
+        <w:pStyle w:val="ListParagraph"/>
         <w:numPr>
           <w:ilvl w:val="0"/>
           <w:numId w:val="18"/>
         </w:numPr>
       </w:pPr>
       <w:r>
-        <w:t xml:space="preserve">Sezione Prodotto – </w:t>
-      </w:r>
-      <w:r>
-        <w:t>Costo Acquisto: ??</w:t>
-      </w:r>
-    </w:p>
-    <w:p>
-      <w:pPr>
-        <w:pStyle w:val="Paragrafoelenco"/>
+        <w:t>Sezione Prodotto – Costo Acquisto: ??</w:t>
+      </w:r>
+    </w:p>
+    <w:p>
+      <w:pPr>
+        <w:pStyle w:val="ListParagraph"/>
         <w:numPr>
           <w:ilvl w:val="0"/>
           <w:numId w:val="18"/>
         </w:numPr>
       </w:pPr>
       <w:r>
-        <w:t xml:space="preserve">Sezione </w:t>
-      </w:r>
-      <w:r>
-        <w:t>Listino</w:t>
-      </w:r>
-      <w:r>
-        <w:t xml:space="preserve"> – Costo Acquisto: ??</w:t>
-      </w:r>
-    </w:p>
-    <w:p>
-      <w:pPr>
-        <w:pStyle w:val="Titolo2"/>
+        <w:t>Sezione Listino – Costo Acquisto: ??</w:t>
+      </w:r>
+    </w:p>
+    <w:p>
+      <w:pPr>
+        <w:pStyle w:val="Heading2"/>
       </w:pPr>
       <w:r>
         <w:t>Suggerimenti per allineamento a best in class</w:t>
@@ -3927,6 +4188,10 @@
     </w:p>
     <w:p>
       <w:r>
+        <w:rPr>
+          <w:noProof/>
+        </w:rPr>
+        <w:lastRenderedPageBreak/>
         <w:drawing>
           <wp:inline distT="0" distB="0" distL="0" distR="0" wp14:anchorId="47C48172" wp14:editId="5CDE6B5C">
             <wp:extent cx="6120130" cy="2585720"/>
@@ -3966,16 +4231,15 @@
     </w:p>
     <w:p>
       <w:pPr>
-        <w:pStyle w:val="Titolo2"/>
-      </w:pPr>
-      <w:r>
-        <w:lastRenderedPageBreak/>
+        <w:pStyle w:val="Heading2"/>
+      </w:pPr>
+      <w:r>
         <w:t>CONSIDERAZIONI</w:t>
       </w:r>
     </w:p>
     <w:p>
       <w:pPr>
-        <w:pStyle w:val="Titolo2"/>
+        <w:pStyle w:val="Heading2"/>
       </w:pPr>
       <w:r>
         <w:t>I grandi ERP hanno una sezione prodotto con prezzo base separato dal listino, lato DB?</w:t>
@@ -4009,7 +4273,7 @@
     </w:p>
     <w:p>
       <w:pPr>
-        <w:pStyle w:val="Titolo2"/>
+        <w:pStyle w:val="Heading2"/>
       </w:pPr>
       <w:r>
         <w:t>I prezzi base sono prezzi con un id_listino speciale</w:t>
@@ -4052,7 +4316,7 @@
       <w:commentRangeEnd w:id="0"/>
       <w:r>
         <w:rPr>
-          <w:rStyle w:val="Rimandocommento"/>
+          <w:rStyle w:val="CommentReference"/>
           <w:b/>
           <w:bCs/>
           <w:sz w:val="24"/>
@@ -4120,7 +4384,7 @@
     </w:p>
     <w:p>
       <w:pPr>
-        <w:pStyle w:val="Titolo2"/>
+        <w:pStyle w:val="Heading2"/>
       </w:pPr>
       <w:r>
         <w:t xml:space="preserve">Una vista </w:t>
@@ -4142,9 +4406,10 @@
     </w:p>
     <w:p>
       <w:pPr>
-        <w:pStyle w:val="Titolo2"/>
-      </w:pPr>
-      <w:r>
+        <w:pStyle w:val="Heading2"/>
+      </w:pPr>
+      <w:r>
+        <w:lastRenderedPageBreak/>
         <w:t>Nella sezione listini, mostrare anche il prezzo base?</w:t>
       </w:r>
     </w:p>
@@ -4186,7 +4451,7 @@
     </w:p>
     <w:p>
       <w:pPr>
-        <w:pStyle w:val="Titolo2"/>
+        <w:pStyle w:val="Heading2"/>
       </w:pPr>
       <w:r>
         <w:t>Domande</w:t>
@@ -4207,11 +4472,11 @@
   <w:comment w:id="0" w:author="Michel Papetti" w:date="2026-07-29T17:44:00Z" w:initials="MP">
     <w:p>
       <w:pPr>
-        <w:pStyle w:val="Testocommento"/>
-      </w:pPr>
-      <w:r>
-        <w:rPr>
-          <w:rStyle w:val="Rimandocommento"/>
+        <w:pStyle w:val="CommentText"/>
+      </w:pPr>
+      <w:r>
+        <w:rPr>
+          <w:rStyle w:val="CommentReference"/>
         </w:rPr>
         <w:annotationRef/>
       </w:r>
@@ -4542,6 +4807,155 @@
     </w:lvl>
   </w:abstractNum>
   <w:abstractNum w:abstractNumId="2" w15:restartNumberingAfterBreak="0">
+    <w:nsid w:val="14D86210"/>
+    <w:multiLevelType w:val="multilevel"/>
+    <w:tmpl w:val="80B651BE"/>
+    <w:lvl w:ilvl="0">
+      <w:start w:val="1"/>
+      <w:numFmt w:val="bullet"/>
+      <w:lvlText w:val=""/>
+      <w:lvlJc w:val="left"/>
+      <w:pPr>
+        <w:tabs>
+          <w:tab w:val="num" w:pos="720"/>
+        </w:tabs>
+        <w:ind w:left="720" w:hanging="360"/>
+      </w:pPr>
+      <w:rPr>
+        <w:rFonts w:ascii="Symbol" w:hAnsi="Symbol" w:hint="default"/>
+        <w:sz w:val="20"/>
+      </w:rPr>
+    </w:lvl>
+    <w:lvl w:ilvl="1" w:tentative="1">
+      <w:start w:val="1"/>
+      <w:numFmt w:val="bullet"/>
+      <w:lvlText w:val="o"/>
+      <w:lvlJc w:val="left"/>
+      <w:pPr>
+        <w:tabs>
+          <w:tab w:val="num" w:pos="1440"/>
+        </w:tabs>
+        <w:ind w:left="1440" w:hanging="360"/>
+      </w:pPr>
+      <w:rPr>
+        <w:rFonts w:ascii="Courier New" w:hAnsi="Courier New" w:hint="default"/>
+        <w:sz w:val="20"/>
+      </w:rPr>
+    </w:lvl>
+    <w:lvl w:ilvl="2" w:tentative="1">
+      <w:start w:val="1"/>
+      <w:numFmt w:val="bullet"/>
+      <w:lvlText w:val=""/>
+      <w:lvlJc w:val="left"/>
+      <w:pPr>
+        <w:tabs>
+          <w:tab w:val="num" w:pos="2160"/>
+        </w:tabs>
+        <w:ind w:left="2160" w:hanging="360"/>
+      </w:pPr>
+      <w:rPr>
+        <w:rFonts w:ascii="Wingdings" w:hAnsi="Wingdings" w:hint="default"/>
+        <w:sz w:val="20"/>
+      </w:rPr>
+    </w:lvl>
+    <w:lvl w:ilvl="3" w:tentative="1">
+      <w:start w:val="1"/>
+      <w:numFmt w:val="bullet"/>
+      <w:lvlText w:val=""/>
+      <w:lvlJc w:val="left"/>
+      <w:pPr>
+        <w:tabs>
+          <w:tab w:val="num" w:pos="2880"/>
+        </w:tabs>
+        <w:ind w:left="2880" w:hanging="360"/>
+      </w:pPr>
+      <w:rPr>
+        <w:rFonts w:ascii="Wingdings" w:hAnsi="Wingdings" w:hint="default"/>
+        <w:sz w:val="20"/>
+      </w:rPr>
+    </w:lvl>
+    <w:lvl w:ilvl="4" w:tentative="1">
+      <w:start w:val="1"/>
+      <w:numFmt w:val="bullet"/>
+      <w:lvlText w:val=""/>
+      <w:lvlJc w:val="left"/>
+      <w:pPr>
+        <w:tabs>
+          <w:tab w:val="num" w:pos="3600"/>
+        </w:tabs>
+        <w:ind w:left="3600" w:hanging="360"/>
+      </w:pPr>
+      <w:rPr>
+        <w:rFonts w:ascii="Wingdings" w:hAnsi="Wingdings" w:hint="default"/>
+        <w:sz w:val="20"/>
+      </w:rPr>
+    </w:lvl>
+    <w:lvl w:ilvl="5" w:tentative="1">
+      <w:start w:val="1"/>
+      <w:numFmt w:val="bullet"/>
+      <w:lvlText w:val=""/>
+      <w:lvlJc w:val="left"/>
+      <w:pPr>
+        <w:tabs>
+          <w:tab w:val="num" w:pos="4320"/>
+        </w:tabs>
+        <w:ind w:left="4320" w:hanging="360"/>
+      </w:pPr>
+      <w:rPr>
+        <w:rFonts w:ascii="Wingdings" w:hAnsi="Wingdings" w:hint="default"/>
+        <w:sz w:val="20"/>
+      </w:rPr>
+    </w:lvl>
+    <w:lvl w:ilvl="6" w:tentative="1">
+      <w:start w:val="1"/>
+      <w:numFmt w:val="bullet"/>
+      <w:lvlText w:val=""/>
+      <w:lvlJc w:val="left"/>
+      <w:pPr>
+        <w:tabs>
+          <w:tab w:val="num" w:pos="5040"/>
+        </w:tabs>
+        <w:ind w:left="5040" w:hanging="360"/>
+      </w:pPr>
+      <w:rPr>
+        <w:rFonts w:ascii="Wingdings" w:hAnsi="Wingdings" w:hint="default"/>
+        <w:sz w:val="20"/>
+      </w:rPr>
+    </w:lvl>
+    <w:lvl w:ilvl="7" w:tentative="1">
+      <w:start w:val="1"/>
+      <w:numFmt w:val="bullet"/>
+      <w:lvlText w:val=""/>
+      <w:lvlJc w:val="left"/>
+      <w:pPr>
+        <w:tabs>
+          <w:tab w:val="num" w:pos="5760"/>
+        </w:tabs>
+        <w:ind w:left="5760" w:hanging="360"/>
+      </w:pPr>
+      <w:rPr>
+        <w:rFonts w:ascii="Wingdings" w:hAnsi="Wingdings" w:hint="default"/>
+        <w:sz w:val="20"/>
+      </w:rPr>
+    </w:lvl>
+    <w:lvl w:ilvl="8" w:tentative="1">
+      <w:start w:val="1"/>
+      <w:numFmt w:val="bullet"/>
+      <w:lvlText w:val=""/>
+      <w:lvlJc w:val="left"/>
+      <w:pPr>
+        <w:tabs>
+          <w:tab w:val="num" w:pos="6480"/>
+        </w:tabs>
+        <w:ind w:left="6480" w:hanging="360"/>
+      </w:pPr>
+      <w:rPr>
+        <w:rFonts w:ascii="Wingdings" w:hAnsi="Wingdings" w:hint="default"/>
+        <w:sz w:val="20"/>
+      </w:rPr>
+    </w:lvl>
+  </w:abstractNum>
+  <w:abstractNum w:abstractNumId="3" w15:restartNumberingAfterBreak="0">
     <w:nsid w:val="2011701E"/>
     <w:multiLevelType w:val="multilevel"/>
     <w:tmpl w:val="DF5C6CAE"/>
@@ -4690,7 +5104,7 @@
       </w:rPr>
     </w:lvl>
   </w:abstractNum>
-  <w:abstractNum w:abstractNumId="3" w15:restartNumberingAfterBreak="0">
+  <w:abstractNum w:abstractNumId="4" w15:restartNumberingAfterBreak="0">
     <w:nsid w:val="2F521244"/>
     <w:multiLevelType w:val="hybridMultilevel"/>
     <w:tmpl w:val="59186AC0"/>
@@ -4802,7 +5216,7 @@
       </w:rPr>
     </w:lvl>
   </w:abstractNum>
-  <w:abstractNum w:abstractNumId="4" w15:restartNumberingAfterBreak="0">
+  <w:abstractNum w:abstractNumId="5" w15:restartNumberingAfterBreak="0">
     <w:nsid w:val="32F22A8D"/>
     <w:multiLevelType w:val="multilevel"/>
     <w:tmpl w:val="081C9008"/>
@@ -4951,7 +5365,7 @@
       </w:rPr>
     </w:lvl>
   </w:abstractNum>
-  <w:abstractNum w:abstractNumId="5" w15:restartNumberingAfterBreak="0">
+  <w:abstractNum w:abstractNumId="6" w15:restartNumberingAfterBreak="0">
     <w:nsid w:val="3B7D5D45"/>
     <w:multiLevelType w:val="hybridMultilevel"/>
     <w:tmpl w:val="D3C24C6C"/>
@@ -5064,7 +5478,7 @@
       </w:rPr>
     </w:lvl>
   </w:abstractNum>
-  <w:abstractNum w:abstractNumId="6" w15:restartNumberingAfterBreak="0">
+  <w:abstractNum w:abstractNumId="7" w15:restartNumberingAfterBreak="0">
     <w:nsid w:val="3D3E2F8F"/>
     <w:multiLevelType w:val="multilevel"/>
     <w:tmpl w:val="5EA0A7E2"/>
@@ -5213,7 +5627,7 @@
       </w:rPr>
     </w:lvl>
   </w:abstractNum>
-  <w:abstractNum w:abstractNumId="7" w15:restartNumberingAfterBreak="0">
+  <w:abstractNum w:abstractNumId="8" w15:restartNumberingAfterBreak="0">
     <w:nsid w:val="3E9D48CE"/>
     <w:multiLevelType w:val="multilevel"/>
     <w:tmpl w:val="B9546D86"/>
@@ -5326,7 +5740,7 @@
       </w:pPr>
     </w:lvl>
   </w:abstractNum>
-  <w:abstractNum w:abstractNumId="8" w15:restartNumberingAfterBreak="0">
+  <w:abstractNum w:abstractNumId="9" w15:restartNumberingAfterBreak="0">
     <w:nsid w:val="424C1DC0"/>
     <w:multiLevelType w:val="multilevel"/>
     <w:tmpl w:val="F8FEB08C"/>
@@ -5475,7 +5889,268 @@
       </w:rPr>
     </w:lvl>
   </w:abstractNum>
-  <w:abstractNum w:abstractNumId="9" w15:restartNumberingAfterBreak="0">
+  <w:abstractNum w:abstractNumId="10" w15:restartNumberingAfterBreak="0">
+    <w:nsid w:val="531757FC"/>
+    <w:multiLevelType w:val="multilevel"/>
+    <w:tmpl w:val="38823E20"/>
+    <w:lvl w:ilvl="0">
+      <w:start w:val="1"/>
+      <w:numFmt w:val="bullet"/>
+      <w:lvlText w:val=""/>
+      <w:lvlJc w:val="left"/>
+      <w:pPr>
+        <w:tabs>
+          <w:tab w:val="num" w:pos="720"/>
+        </w:tabs>
+        <w:ind w:left="720" w:hanging="360"/>
+      </w:pPr>
+      <w:rPr>
+        <w:rFonts w:ascii="Symbol" w:hAnsi="Symbol" w:hint="default"/>
+        <w:sz w:val="20"/>
+      </w:rPr>
+    </w:lvl>
+    <w:lvl w:ilvl="1" w:tentative="1">
+      <w:start w:val="1"/>
+      <w:numFmt w:val="bullet"/>
+      <w:lvlText w:val="o"/>
+      <w:lvlJc w:val="left"/>
+      <w:pPr>
+        <w:tabs>
+          <w:tab w:val="num" w:pos="1440"/>
+        </w:tabs>
+        <w:ind w:left="1440" w:hanging="360"/>
+      </w:pPr>
+      <w:rPr>
+        <w:rFonts w:ascii="Courier New" w:hAnsi="Courier New" w:hint="default"/>
+        <w:sz w:val="20"/>
+      </w:rPr>
+    </w:lvl>
+    <w:lvl w:ilvl="2" w:tentative="1">
+      <w:start w:val="1"/>
+      <w:numFmt w:val="bullet"/>
+      <w:lvlText w:val=""/>
+      <w:lvlJc w:val="left"/>
+      <w:pPr>
+        <w:tabs>
+          <w:tab w:val="num" w:pos="2160"/>
+        </w:tabs>
+        <w:ind w:left="2160" w:hanging="360"/>
+      </w:pPr>
+      <w:rPr>
+        <w:rFonts w:ascii="Wingdings" w:hAnsi="Wingdings" w:hint="default"/>
+        <w:sz w:val="20"/>
+      </w:rPr>
+    </w:lvl>
+    <w:lvl w:ilvl="3" w:tentative="1">
+      <w:start w:val="1"/>
+      <w:numFmt w:val="bullet"/>
+      <w:lvlText w:val=""/>
+      <w:lvlJc w:val="left"/>
+      <w:pPr>
+        <w:tabs>
+          <w:tab w:val="num" w:pos="2880"/>
+        </w:tabs>
+        <w:ind w:left="2880" w:hanging="360"/>
+      </w:pPr>
+      <w:rPr>
+        <w:rFonts w:ascii="Wingdings" w:hAnsi="Wingdings" w:hint="default"/>
+        <w:sz w:val="20"/>
+      </w:rPr>
+    </w:lvl>
+    <w:lvl w:ilvl="4" w:tentative="1">
+      <w:start w:val="1"/>
+      <w:numFmt w:val="bullet"/>
+      <w:lvlText w:val=""/>
+      <w:lvlJc w:val="left"/>
+      <w:pPr>
+        <w:tabs>
+          <w:tab w:val="num" w:pos="3600"/>
+        </w:tabs>
+        <w:ind w:left="3600" w:hanging="360"/>
+      </w:pPr>
+      <w:rPr>
+        <w:rFonts w:ascii="Wingdings" w:hAnsi="Wingdings" w:hint="default"/>
+        <w:sz w:val="20"/>
+      </w:rPr>
+    </w:lvl>
+    <w:lvl w:ilvl="5" w:tentative="1">
+      <w:start w:val="1"/>
+      <w:numFmt w:val="bullet"/>
+      <w:lvlText w:val=""/>
+      <w:lvlJc w:val="left"/>
+      <w:pPr>
+        <w:tabs>
+          <w:tab w:val="num" w:pos="4320"/>
+        </w:tabs>
+        <w:ind w:left="4320" w:hanging="360"/>
+      </w:pPr>
+      <w:rPr>
+        <w:rFonts w:ascii="Wingdings" w:hAnsi="Wingdings" w:hint="default"/>
+        <w:sz w:val="20"/>
+      </w:rPr>
+    </w:lvl>
+    <w:lvl w:ilvl="6" w:tentative="1">
+      <w:start w:val="1"/>
+      <w:numFmt w:val="bullet"/>
+      <w:lvlText w:val=""/>
+      <w:lvlJc w:val="left"/>
+      <w:pPr>
+        <w:tabs>
+          <w:tab w:val="num" w:pos="5040"/>
+        </w:tabs>
+        <w:ind w:left="5040" w:hanging="360"/>
+      </w:pPr>
+      <w:rPr>
+        <w:rFonts w:ascii="Wingdings" w:hAnsi="Wingdings" w:hint="default"/>
+        <w:sz w:val="20"/>
+      </w:rPr>
+    </w:lvl>
+    <w:lvl w:ilvl="7" w:tentative="1">
+      <w:start w:val="1"/>
+      <w:numFmt w:val="bullet"/>
+      <w:lvlText w:val=""/>
+      <w:lvlJc w:val="left"/>
+      <w:pPr>
+        <w:tabs>
+          <w:tab w:val="num" w:pos="5760"/>
+        </w:tabs>
+        <w:ind w:left="5760" w:hanging="360"/>
+      </w:pPr>
+      <w:rPr>
+        <w:rFonts w:ascii="Wingdings" w:hAnsi="Wingdings" w:hint="default"/>
+        <w:sz w:val="20"/>
+      </w:rPr>
+    </w:lvl>
+    <w:lvl w:ilvl="8" w:tentative="1">
+      <w:start w:val="1"/>
+      <w:numFmt w:val="bullet"/>
+      <w:lvlText w:val=""/>
+      <w:lvlJc w:val="left"/>
+      <w:pPr>
+        <w:tabs>
+          <w:tab w:val="num" w:pos="6480"/>
+        </w:tabs>
+        <w:ind w:left="6480" w:hanging="360"/>
+      </w:pPr>
+      <w:rPr>
+        <w:rFonts w:ascii="Wingdings" w:hAnsi="Wingdings" w:hint="default"/>
+        <w:sz w:val="20"/>
+      </w:rPr>
+    </w:lvl>
+  </w:abstractNum>
+  <w:abstractNum w:abstractNumId="11" w15:restartNumberingAfterBreak="0">
+    <w:nsid w:val="55AC5DFE"/>
+    <w:multiLevelType w:val="hybridMultilevel"/>
+    <w:tmpl w:val="36DAD27C"/>
+    <w:lvl w:ilvl="0" w:tplc="5D249DE0">
+      <w:numFmt w:val="bullet"/>
+      <w:lvlText w:val="-"/>
+      <w:lvlJc w:val="left"/>
+      <w:pPr>
+        <w:ind w:left="720" w:hanging="360"/>
+      </w:pPr>
+      <w:rPr>
+        <w:rFonts w:ascii="Aptos" w:eastAsiaTheme="minorHAnsi" w:hAnsi="Aptos" w:cstheme="minorBidi" w:hint="default"/>
+      </w:rPr>
+    </w:lvl>
+    <w:lvl w:ilvl="1" w:tplc="04100003">
+      <w:start w:val="1"/>
+      <w:numFmt w:val="bullet"/>
+      <w:lvlText w:val="o"/>
+      <w:lvlJc w:val="left"/>
+      <w:pPr>
+        <w:ind w:left="1440" w:hanging="360"/>
+      </w:pPr>
+      <w:rPr>
+        <w:rFonts w:ascii="Courier New" w:hAnsi="Courier New" w:cs="Courier New" w:hint="default"/>
+      </w:rPr>
+    </w:lvl>
+    <w:lvl w:ilvl="2" w:tplc="04100005" w:tentative="1">
+      <w:start w:val="1"/>
+      <w:numFmt w:val="bullet"/>
+      <w:lvlText w:val=""/>
+      <w:lvlJc w:val="left"/>
+      <w:pPr>
+        <w:ind w:left="2160" w:hanging="360"/>
+      </w:pPr>
+      <w:rPr>
+        <w:rFonts w:ascii="Wingdings" w:hAnsi="Wingdings" w:hint="default"/>
+      </w:rPr>
+    </w:lvl>
+    <w:lvl w:ilvl="3" w:tplc="04100001" w:tentative="1">
+      <w:start w:val="1"/>
+      <w:numFmt w:val="bullet"/>
+      <w:lvlText w:val=""/>
+      <w:lvlJc w:val="left"/>
+      <w:pPr>
+        <w:ind w:left="2880" w:hanging="360"/>
+      </w:pPr>
+      <w:rPr>
+        <w:rFonts w:ascii="Symbol" w:hAnsi="Symbol" w:hint="default"/>
+      </w:rPr>
+    </w:lvl>
+    <w:lvl w:ilvl="4" w:tplc="04100003" w:tentative="1">
+      <w:start w:val="1"/>
+      <w:numFmt w:val="bullet"/>
+      <w:lvlText w:val="o"/>
+      <w:lvlJc w:val="left"/>
+      <w:pPr>
+        <w:ind w:left="3600" w:hanging="360"/>
+      </w:pPr>
+      <w:rPr>
+        <w:rFonts w:ascii="Courier New" w:hAnsi="Courier New" w:cs="Courier New" w:hint="default"/>
+      </w:rPr>
+    </w:lvl>
+    <w:lvl w:ilvl="5" w:tplc="04100005" w:tentative="1">
+      <w:start w:val="1"/>
+      <w:numFmt w:val="bullet"/>
+      <w:lvlText w:val=""/>
+      <w:lvlJc w:val="left"/>
+      <w:pPr>
+        <w:ind w:left="4320" w:hanging="360"/>
+      </w:pPr>
+      <w:rPr>
+        <w:rFonts w:ascii="Wingdings" w:hAnsi="Wingdings" w:hint="default"/>
+      </w:rPr>
+    </w:lvl>
+    <w:lvl w:ilvl="6" w:tplc="04100001" w:tentative="1">
+      <w:start w:val="1"/>
+      <w:numFmt w:val="bullet"/>
+      <w:lvlText w:val=""/>
+      <w:lvlJc w:val="left"/>
+      <w:pPr>
+        <w:ind w:left="5040" w:hanging="360"/>
+      </w:pPr>
+      <w:rPr>
+        <w:rFonts w:ascii="Symbol" w:hAnsi="Symbol" w:hint="default"/>
+      </w:rPr>
+    </w:lvl>
+    <w:lvl w:ilvl="7" w:tplc="04100003" w:tentative="1">
+      <w:start w:val="1"/>
+      <w:numFmt w:val="bullet"/>
+      <w:lvlText w:val="o"/>
+      <w:lvlJc w:val="left"/>
+      <w:pPr>
+        <w:ind w:left="5760" w:hanging="360"/>
+      </w:pPr>
+      <w:rPr>
+        <w:rFonts w:ascii="Courier New" w:hAnsi="Courier New" w:cs="Courier New" w:hint="default"/>
+      </w:rPr>
+    </w:lvl>
+    <w:lvl w:ilvl="8" w:tplc="04100005" w:tentative="1">
+      <w:start w:val="1"/>
+      <w:numFmt w:val="bullet"/>
+      <w:lvlText w:val=""/>
+      <w:lvlJc w:val="left"/>
+      <w:pPr>
+        <w:ind w:left="6480" w:hanging="360"/>
+      </w:pPr>
+      <w:rPr>
+        <w:rFonts w:ascii="Wingdings" w:hAnsi="Wingdings" w:hint="default"/>
+      </w:rPr>
+    </w:lvl>
+  </w:abstractNum>
+  <w:abstractNum w:abstractNumId="12" w15:restartNumberingAfterBreak="0">
     <w:nsid w:val="5B8969A3"/>
     <w:multiLevelType w:val="multilevel"/>
     <w:tmpl w:val="9A88E3B8"/>
@@ -5624,7 +6299,7 @@
       </w:rPr>
     </w:lvl>
   </w:abstractNum>
-  <w:abstractNum w:abstractNumId="10" w15:restartNumberingAfterBreak="0">
+  <w:abstractNum w:abstractNumId="13" w15:restartNumberingAfterBreak="0">
     <w:nsid w:val="5D3C081A"/>
     <w:multiLevelType w:val="multilevel"/>
     <w:tmpl w:val="21482DF0"/>
@@ -5773,7 +6448,7 @@
       </w:rPr>
     </w:lvl>
   </w:abstractNum>
-  <w:abstractNum w:abstractNumId="11" w15:restartNumberingAfterBreak="0">
+  <w:abstractNum w:abstractNumId="14" w15:restartNumberingAfterBreak="0">
     <w:nsid w:val="5F811D83"/>
     <w:multiLevelType w:val="multilevel"/>
     <w:tmpl w:val="AF2EF6CA"/>
@@ -5890,7 +6565,7 @@
       </w:pPr>
     </w:lvl>
   </w:abstractNum>
-  <w:abstractNum w:abstractNumId="12" w15:restartNumberingAfterBreak="0">
+  <w:abstractNum w:abstractNumId="15" w15:restartNumberingAfterBreak="0">
     <w:nsid w:val="60D174E8"/>
     <w:multiLevelType w:val="multilevel"/>
     <w:tmpl w:val="596E5D82"/>
@@ -6039,7 +6714,7 @@
       </w:rPr>
     </w:lvl>
   </w:abstractNum>
-  <w:abstractNum w:abstractNumId="13" w15:restartNumberingAfterBreak="0">
+  <w:abstractNum w:abstractNumId="16" w15:restartNumberingAfterBreak="0">
     <w:nsid w:val="68990095"/>
     <w:multiLevelType w:val="multilevel"/>
     <w:tmpl w:val="081C9008"/>
@@ -6188,7 +6863,156 @@
       </w:rPr>
     </w:lvl>
   </w:abstractNum>
-  <w:abstractNum w:abstractNumId="14" w15:restartNumberingAfterBreak="0">
+  <w:abstractNum w:abstractNumId="17" w15:restartNumberingAfterBreak="0">
+    <w:nsid w:val="695A01FE"/>
+    <w:multiLevelType w:val="multilevel"/>
+    <w:tmpl w:val="3F341B5A"/>
+    <w:lvl w:ilvl="0">
+      <w:start w:val="1"/>
+      <w:numFmt w:val="bullet"/>
+      <w:lvlText w:val=""/>
+      <w:lvlJc w:val="left"/>
+      <w:pPr>
+        <w:tabs>
+          <w:tab w:val="num" w:pos="720"/>
+        </w:tabs>
+        <w:ind w:left="720" w:hanging="360"/>
+      </w:pPr>
+      <w:rPr>
+        <w:rFonts w:ascii="Symbol" w:hAnsi="Symbol" w:hint="default"/>
+        <w:sz w:val="20"/>
+      </w:rPr>
+    </w:lvl>
+    <w:lvl w:ilvl="1" w:tentative="1">
+      <w:start w:val="1"/>
+      <w:numFmt w:val="bullet"/>
+      <w:lvlText w:val="o"/>
+      <w:lvlJc w:val="left"/>
+      <w:pPr>
+        <w:tabs>
+          <w:tab w:val="num" w:pos="1440"/>
+        </w:tabs>
+        <w:ind w:left="1440" w:hanging="360"/>
+      </w:pPr>
+      <w:rPr>
+        <w:rFonts w:ascii="Courier New" w:hAnsi="Courier New" w:hint="default"/>
+        <w:sz w:val="20"/>
+      </w:rPr>
+    </w:lvl>
+    <w:lvl w:ilvl="2" w:tentative="1">
+      <w:start w:val="1"/>
+      <w:numFmt w:val="bullet"/>
+      <w:lvlText w:val=""/>
+      <w:lvlJc w:val="left"/>
+      <w:pPr>
+        <w:tabs>
+          <w:tab w:val="num" w:pos="2160"/>
+        </w:tabs>
+        <w:ind w:left="2160" w:hanging="360"/>
+      </w:pPr>
+      <w:rPr>
+        <w:rFonts w:ascii="Wingdings" w:hAnsi="Wingdings" w:hint="default"/>
+        <w:sz w:val="20"/>
+      </w:rPr>
+    </w:lvl>
+    <w:lvl w:ilvl="3" w:tentative="1">
+      <w:start w:val="1"/>
+      <w:numFmt w:val="bullet"/>
+      <w:lvlText w:val=""/>
+      <w:lvlJc w:val="left"/>
+      <w:pPr>
+        <w:tabs>
+          <w:tab w:val="num" w:pos="2880"/>
+        </w:tabs>
+        <w:ind w:left="2880" w:hanging="360"/>
+      </w:pPr>
+      <w:rPr>
+        <w:rFonts w:ascii="Wingdings" w:hAnsi="Wingdings" w:hint="default"/>
+        <w:sz w:val="20"/>
+      </w:rPr>
+    </w:lvl>
+    <w:lvl w:ilvl="4" w:tentative="1">
+      <w:start w:val="1"/>
+      <w:numFmt w:val="bullet"/>
+      <w:lvlText w:val=""/>
+      <w:lvlJc w:val="left"/>
+      <w:pPr>
+        <w:tabs>
+          <w:tab w:val="num" w:pos="3600"/>
+        </w:tabs>
+        <w:ind w:left="3600" w:hanging="360"/>
+      </w:pPr>
+      <w:rPr>
+        <w:rFonts w:ascii="Wingdings" w:hAnsi="Wingdings" w:hint="default"/>
+        <w:sz w:val="20"/>
+      </w:rPr>
+    </w:lvl>
+    <w:lvl w:ilvl="5" w:tentative="1">
+      <w:start w:val="1"/>
+      <w:numFmt w:val="bullet"/>
+      <w:lvlText w:val=""/>
+      <w:lvlJc w:val="left"/>
+      <w:pPr>
+        <w:tabs>
+          <w:tab w:val="num" w:pos="4320"/>
+        </w:tabs>
+        <w:ind w:left="4320" w:hanging="360"/>
+      </w:pPr>
+      <w:rPr>
+        <w:rFonts w:ascii="Wingdings" w:hAnsi="Wingdings" w:hint="default"/>
+        <w:sz w:val="20"/>
+      </w:rPr>
+    </w:lvl>
+    <w:lvl w:ilvl="6" w:tentative="1">
+      <w:start w:val="1"/>
+      <w:numFmt w:val="bullet"/>
+      <w:lvlText w:val=""/>
+      <w:lvlJc w:val="left"/>
+      <w:pPr>
+        <w:tabs>
+          <w:tab w:val="num" w:pos="5040"/>
+        </w:tabs>
+        <w:ind w:left="5040" w:hanging="360"/>
+      </w:pPr>
+      <w:rPr>
+        <w:rFonts w:ascii="Wingdings" w:hAnsi="Wingdings" w:hint="default"/>
+        <w:sz w:val="20"/>
+      </w:rPr>
+    </w:lvl>
+    <w:lvl w:ilvl="7" w:tentative="1">
+      <w:start w:val="1"/>
+      <w:numFmt w:val="bullet"/>
+      <w:lvlText w:val=""/>
+      <w:lvlJc w:val="left"/>
+      <w:pPr>
+        <w:tabs>
+          <w:tab w:val="num" w:pos="5760"/>
+        </w:tabs>
+        <w:ind w:left="5760" w:hanging="360"/>
+      </w:pPr>
+      <w:rPr>
+        <w:rFonts w:ascii="Wingdings" w:hAnsi="Wingdings" w:hint="default"/>
+        <w:sz w:val="20"/>
+      </w:rPr>
+    </w:lvl>
+    <w:lvl w:ilvl="8" w:tentative="1">
+      <w:start w:val="1"/>
+      <w:numFmt w:val="bullet"/>
+      <w:lvlText w:val=""/>
+      <w:lvlJc w:val="left"/>
+      <w:pPr>
+        <w:tabs>
+          <w:tab w:val="num" w:pos="6480"/>
+        </w:tabs>
+        <w:ind w:left="6480" w:hanging="360"/>
+      </w:pPr>
+      <w:rPr>
+        <w:rFonts w:ascii="Wingdings" w:hAnsi="Wingdings" w:hint="default"/>
+        <w:sz w:val="20"/>
+      </w:rPr>
+    </w:lvl>
+  </w:abstractNum>
+  <w:abstractNum w:abstractNumId="18" w15:restartNumberingAfterBreak="0">
     <w:nsid w:val="69B21CF1"/>
     <w:multiLevelType w:val="multilevel"/>
     <w:tmpl w:val="1924DA7A"/>
@@ -6337,7 +7161,7 @@
       </w:rPr>
     </w:lvl>
   </w:abstractNum>
-  <w:abstractNum w:abstractNumId="15" w15:restartNumberingAfterBreak="0">
+  <w:abstractNum w:abstractNumId="19" w15:restartNumberingAfterBreak="0">
     <w:nsid w:val="6C886AE0"/>
     <w:multiLevelType w:val="multilevel"/>
     <w:tmpl w:val="DC88E8B6"/>
@@ -6486,7 +7310,7 @@
       </w:rPr>
     </w:lvl>
   </w:abstractNum>
-  <w:abstractNum w:abstractNumId="16" w15:restartNumberingAfterBreak="0">
+  <w:abstractNum w:abstractNumId="20" w15:restartNumberingAfterBreak="0">
     <w:nsid w:val="727A74E0"/>
     <w:multiLevelType w:val="multilevel"/>
     <w:tmpl w:val="1AAA60C0"/>
@@ -6603,7 +7427,7 @@
       </w:pPr>
     </w:lvl>
   </w:abstractNum>
-  <w:abstractNum w:abstractNumId="17" w15:restartNumberingAfterBreak="0">
+  <w:abstractNum w:abstractNumId="21" w15:restartNumberingAfterBreak="0">
     <w:nsid w:val="72F85B6D"/>
     <w:multiLevelType w:val="multilevel"/>
     <w:tmpl w:val="46BAE0B8"/>
@@ -6720,7 +7544,7 @@
       </w:pPr>
     </w:lvl>
   </w:abstractNum>
-  <w:abstractNum w:abstractNumId="18" w15:restartNumberingAfterBreak="0">
+  <w:abstractNum w:abstractNumId="22" w15:restartNumberingAfterBreak="0">
     <w:nsid w:val="76631757"/>
     <w:multiLevelType w:val="multilevel"/>
     <w:tmpl w:val="1AAA60C0"/>
@@ -6837,7 +7661,7 @@
       </w:pPr>
     </w:lvl>
   </w:abstractNum>
-  <w:abstractNum w:abstractNumId="19" w15:restartNumberingAfterBreak="0">
+  <w:abstractNum w:abstractNumId="23" w15:restartNumberingAfterBreak="0">
     <w:nsid w:val="767D5AC3"/>
     <w:multiLevelType w:val="multilevel"/>
     <w:tmpl w:val="8C8C5FFE"/>
@@ -6987,64 +7811,76 @@
     </w:lvl>
   </w:abstractNum>
   <w:num w:numId="1" w16cid:durableId="1880587512">
-    <w:abstractNumId w:val="3"/>
+    <w:abstractNumId w:val="4"/>
   </w:num>
   <w:num w:numId="2" w16cid:durableId="2088964189">
-    <w:abstractNumId w:val="13"/>
+    <w:abstractNumId w:val="16"/>
   </w:num>
   <w:num w:numId="3" w16cid:durableId="201016866">
-    <w:abstractNumId w:val="4"/>
+    <w:abstractNumId w:val="5"/>
   </w:num>
   <w:num w:numId="4" w16cid:durableId="983435067">
-    <w:abstractNumId w:val="17"/>
+    <w:abstractNumId w:val="21"/>
   </w:num>
   <w:num w:numId="5" w16cid:durableId="495923074">
-    <w:abstractNumId w:val="11"/>
+    <w:abstractNumId w:val="14"/>
   </w:num>
   <w:num w:numId="6" w16cid:durableId="909464386">
     <w:abstractNumId w:val="1"/>
   </w:num>
   <w:num w:numId="7" w16cid:durableId="332879790">
-    <w:abstractNumId w:val="18"/>
+    <w:abstractNumId w:val="22"/>
   </w:num>
   <w:num w:numId="8" w16cid:durableId="257757845">
-    <w:abstractNumId w:val="16"/>
+    <w:abstractNumId w:val="20"/>
   </w:num>
   <w:num w:numId="9" w16cid:durableId="718015956">
-    <w:abstractNumId w:val="15"/>
+    <w:abstractNumId w:val="19"/>
   </w:num>
   <w:num w:numId="10" w16cid:durableId="1569148932">
-    <w:abstractNumId w:val="9"/>
+    <w:abstractNumId w:val="12"/>
   </w:num>
   <w:num w:numId="11" w16cid:durableId="275526376">
-    <w:abstractNumId w:val="19"/>
+    <w:abstractNumId w:val="23"/>
   </w:num>
   <w:num w:numId="12" w16cid:durableId="1696805028">
-    <w:abstractNumId w:val="2"/>
+    <w:abstractNumId w:val="3"/>
   </w:num>
   <w:num w:numId="13" w16cid:durableId="231936406">
-    <w:abstractNumId w:val="6"/>
+    <w:abstractNumId w:val="7"/>
   </w:num>
   <w:num w:numId="14" w16cid:durableId="154418669">
-    <w:abstractNumId w:val="14"/>
+    <w:abstractNumId w:val="18"/>
   </w:num>
   <w:num w:numId="15" w16cid:durableId="468479436">
     <w:abstractNumId w:val="0"/>
   </w:num>
   <w:num w:numId="16" w16cid:durableId="171259351">
-    <w:abstractNumId w:val="7"/>
+    <w:abstractNumId w:val="8"/>
   </w:num>
   <w:num w:numId="17" w16cid:durableId="856188124">
-    <w:abstractNumId w:val="8"/>
+    <w:abstractNumId w:val="9"/>
   </w:num>
   <w:num w:numId="18" w16cid:durableId="68432494">
-    <w:abstractNumId w:val="5"/>
+    <w:abstractNumId w:val="6"/>
   </w:num>
   <w:num w:numId="19" w16cid:durableId="1505436379">
+    <w:abstractNumId w:val="13"/>
+  </w:num>
+  <w:num w:numId="20" w16cid:durableId="1411853943">
+    <w:abstractNumId w:val="15"/>
+  </w:num>
+  <w:num w:numId="21" w16cid:durableId="612979665">
+    <w:abstractNumId w:val="2"/>
+  </w:num>
+  <w:num w:numId="22" w16cid:durableId="1192718642">
+    <w:abstractNumId w:val="17"/>
+  </w:num>
+  <w:num w:numId="23" w16cid:durableId="1794711655">
     <w:abstractNumId w:val="10"/>
   </w:num>
-  <w:num w:numId="20" w16cid:durableId="1411853943">
-    <w:abstractNumId w:val="12"/>
+  <w:num w:numId="24" w16cid:durableId="1238830158">
+    <w:abstractNumId w:val="11"/>
   </w:num>
 </w:numbering>
 </file>
@@ -7454,15 +8290,15 @@
     <w:lsdException w:name="Unresolved Mention" w:semiHidden="1" w:unhideWhenUsed="1"/>
     <w:lsdException w:name="Smart Link" w:semiHidden="1" w:unhideWhenUsed="1"/>
   </w:latentStyles>
-  <w:style w:type="paragraph" w:default="1" w:styleId="Normale">
+  <w:style w:type="paragraph" w:default="1" w:styleId="Normal">
     <w:name w:val="Normal"/>
     <w:qFormat/>
   </w:style>
-  <w:style w:type="paragraph" w:styleId="Titolo1">
+  <w:style w:type="paragraph" w:styleId="Heading1">
     <w:name w:val="heading 1"/>
-    <w:basedOn w:val="Normale"/>
-    <w:next w:val="Normale"/>
-    <w:link w:val="Titolo1Carattere"/>
+    <w:basedOn w:val="Normal"/>
+    <w:next w:val="Normal"/>
+    <w:link w:val="Heading1Char"/>
     <w:uiPriority w:val="9"/>
     <w:qFormat/>
     <w:rsid w:val="00855DB1"/>
@@ -7479,11 +8315,11 @@
       <w:szCs w:val="40"/>
     </w:rPr>
   </w:style>
-  <w:style w:type="paragraph" w:styleId="Titolo2">
+  <w:style w:type="paragraph" w:styleId="Heading2">
     <w:name w:val="heading 2"/>
-    <w:basedOn w:val="Normale"/>
-    <w:next w:val="Normale"/>
-    <w:link w:val="Titolo2Carattere"/>
+    <w:basedOn w:val="Normal"/>
+    <w:next w:val="Normal"/>
+    <w:link w:val="Heading2Char"/>
     <w:uiPriority w:val="9"/>
     <w:unhideWhenUsed/>
     <w:qFormat/>
@@ -7501,11 +8337,11 @@
       <w:szCs w:val="32"/>
     </w:rPr>
   </w:style>
-  <w:style w:type="paragraph" w:styleId="Titolo3">
+  <w:style w:type="paragraph" w:styleId="Heading3">
     <w:name w:val="heading 3"/>
-    <w:basedOn w:val="Normale"/>
-    <w:next w:val="Normale"/>
-    <w:link w:val="Titolo3Carattere"/>
+    <w:basedOn w:val="Normal"/>
+    <w:next w:val="Normal"/>
+    <w:link w:val="Heading3Char"/>
     <w:uiPriority w:val="9"/>
     <w:unhideWhenUsed/>
     <w:qFormat/>
@@ -7523,11 +8359,11 @@
       <w:szCs w:val="28"/>
     </w:rPr>
   </w:style>
-  <w:style w:type="paragraph" w:styleId="Titolo4">
+  <w:style w:type="paragraph" w:styleId="Heading4">
     <w:name w:val="heading 4"/>
-    <w:basedOn w:val="Normale"/>
-    <w:next w:val="Normale"/>
-    <w:link w:val="Titolo4Carattere"/>
+    <w:basedOn w:val="Normal"/>
+    <w:next w:val="Normal"/>
+    <w:link w:val="Heading4Char"/>
     <w:uiPriority w:val="9"/>
     <w:semiHidden/>
     <w:unhideWhenUsed/>
@@ -7546,11 +8382,11 @@
       <w:color w:val="0F4761" w:themeColor="accent1" w:themeShade="BF"/>
     </w:rPr>
   </w:style>
-  <w:style w:type="paragraph" w:styleId="Titolo5">
+  <w:style w:type="paragraph" w:styleId="Heading5">
     <w:name w:val="heading 5"/>
-    <w:basedOn w:val="Normale"/>
-    <w:next w:val="Normale"/>
-    <w:link w:val="Titolo5Carattere"/>
+    <w:basedOn w:val="Normal"/>
+    <w:next w:val="Normal"/>
+    <w:link w:val="Heading5Char"/>
     <w:uiPriority w:val="9"/>
     <w:semiHidden/>
     <w:unhideWhenUsed/>
@@ -7567,11 +8403,11 @@
       <w:color w:val="0F4761" w:themeColor="accent1" w:themeShade="BF"/>
     </w:rPr>
   </w:style>
-  <w:style w:type="paragraph" w:styleId="Titolo6">
+  <w:style w:type="paragraph" w:styleId="Heading6">
     <w:name w:val="heading 6"/>
-    <w:basedOn w:val="Normale"/>
-    <w:next w:val="Normale"/>
-    <w:link w:val="Titolo6Carattere"/>
+    <w:basedOn w:val="Normal"/>
+    <w:next w:val="Normal"/>
+    <w:link w:val="Heading6Char"/>
     <w:uiPriority w:val="9"/>
     <w:semiHidden/>
     <w:unhideWhenUsed/>
@@ -7590,11 +8426,11 @@
       <w:color w:val="595959" w:themeColor="text1" w:themeTint="A6"/>
     </w:rPr>
   </w:style>
-  <w:style w:type="paragraph" w:styleId="Titolo7">
+  <w:style w:type="paragraph" w:styleId="Heading7">
     <w:name w:val="heading 7"/>
-    <w:basedOn w:val="Normale"/>
-    <w:next w:val="Normale"/>
-    <w:link w:val="Titolo7Carattere"/>
+    <w:basedOn w:val="Normal"/>
+    <w:next w:val="Normal"/>
+    <w:link w:val="Heading7Char"/>
     <w:uiPriority w:val="9"/>
     <w:semiHidden/>
     <w:unhideWhenUsed/>
@@ -7611,11 +8447,11 @@
       <w:color w:val="595959" w:themeColor="text1" w:themeTint="A6"/>
     </w:rPr>
   </w:style>
-  <w:style w:type="paragraph" w:styleId="Titolo8">
+  <w:style w:type="paragraph" w:styleId="Heading8">
     <w:name w:val="heading 8"/>
-    <w:basedOn w:val="Normale"/>
-    <w:next w:val="Normale"/>
-    <w:link w:val="Titolo8Carattere"/>
+    <w:basedOn w:val="Normal"/>
+    <w:next w:val="Normal"/>
+    <w:link w:val="Heading8Char"/>
     <w:uiPriority w:val="9"/>
     <w:semiHidden/>
     <w:unhideWhenUsed/>
@@ -7634,11 +8470,11 @@
       <w:color w:val="272727" w:themeColor="text1" w:themeTint="D8"/>
     </w:rPr>
   </w:style>
-  <w:style w:type="paragraph" w:styleId="Titolo9">
+  <w:style w:type="paragraph" w:styleId="Heading9">
     <w:name w:val="heading 9"/>
-    <w:basedOn w:val="Normale"/>
-    <w:next w:val="Normale"/>
-    <w:link w:val="Titolo9Carattere"/>
+    <w:basedOn w:val="Normal"/>
+    <w:next w:val="Normal"/>
+    <w:link w:val="Heading9Char"/>
     <w:uiPriority w:val="9"/>
     <w:semiHidden/>
     <w:unhideWhenUsed/>
@@ -7655,12 +8491,12 @@
       <w:color w:val="272727" w:themeColor="text1" w:themeTint="D8"/>
     </w:rPr>
   </w:style>
-  <w:style w:type="character" w:default="1" w:styleId="Carpredefinitoparagrafo">
+  <w:style w:type="character" w:default="1" w:styleId="DefaultParagraphFont">
     <w:name w:val="Default Paragraph Font"/>
     <w:uiPriority w:val="1"/>
     <w:unhideWhenUsed/>
   </w:style>
-  <w:style w:type="table" w:default="1" w:styleId="Tabellanormale">
+  <w:style w:type="table" w:default="1" w:styleId="TableNormal">
     <w:name w:val="Normal Table"/>
     <w:uiPriority w:val="99"/>
     <w:semiHidden/>
@@ -7675,16 +8511,16 @@
       </w:tblCellMar>
     </w:tblPr>
   </w:style>
-  <w:style w:type="numbering" w:default="1" w:styleId="Nessunelenco">
+  <w:style w:type="numbering" w:default="1" w:styleId="NoList">
     <w:name w:val="No List"/>
     <w:uiPriority w:val="99"/>
     <w:semiHidden/>
     <w:unhideWhenUsed/>
   </w:style>
-  <w:style w:type="character" w:customStyle="1" w:styleId="Titolo1Carattere">
-    <w:name w:val="Titolo 1 Carattere"/>
-    <w:basedOn w:val="Carpredefinitoparagrafo"/>
-    <w:link w:val="Titolo1"/>
+  <w:style w:type="character" w:customStyle="1" w:styleId="Heading1Char">
+    <w:name w:val="Heading 1 Char"/>
+    <w:basedOn w:val="DefaultParagraphFont"/>
+    <w:link w:val="Heading1"/>
     <w:uiPriority w:val="9"/>
     <w:rsid w:val="00855DB1"/>
     <w:rPr>
@@ -7694,10 +8530,10 @@
       <w:szCs w:val="40"/>
     </w:rPr>
   </w:style>
-  <w:style w:type="character" w:customStyle="1" w:styleId="Titolo2Carattere">
-    <w:name w:val="Titolo 2 Carattere"/>
-    <w:basedOn w:val="Carpredefinitoparagrafo"/>
-    <w:link w:val="Titolo2"/>
+  <w:style w:type="character" w:customStyle="1" w:styleId="Heading2Char">
+    <w:name w:val="Heading 2 Char"/>
+    <w:basedOn w:val="DefaultParagraphFont"/>
+    <w:link w:val="Heading2"/>
     <w:uiPriority w:val="9"/>
     <w:rsid w:val="00855DB1"/>
     <w:rPr>
@@ -7707,10 +8543,10 @@
       <w:szCs w:val="32"/>
     </w:rPr>
   </w:style>
-  <w:style w:type="character" w:customStyle="1" w:styleId="Titolo3Carattere">
-    <w:name w:val="Titolo 3 Carattere"/>
-    <w:basedOn w:val="Carpredefinitoparagrafo"/>
-    <w:link w:val="Titolo3"/>
+  <w:style w:type="character" w:customStyle="1" w:styleId="Heading3Char">
+    <w:name w:val="Heading 3 Char"/>
+    <w:basedOn w:val="DefaultParagraphFont"/>
+    <w:link w:val="Heading3"/>
     <w:uiPriority w:val="9"/>
     <w:rsid w:val="00855DB1"/>
     <w:rPr>
@@ -7720,10 +8556,10 @@
       <w:szCs w:val="28"/>
     </w:rPr>
   </w:style>
-  <w:style w:type="character" w:customStyle="1" w:styleId="Titolo4Carattere">
-    <w:name w:val="Titolo 4 Carattere"/>
-    <w:basedOn w:val="Carpredefinitoparagrafo"/>
-    <w:link w:val="Titolo4"/>
+  <w:style w:type="character" w:customStyle="1" w:styleId="Heading4Char">
+    <w:name w:val="Heading 4 Char"/>
+    <w:basedOn w:val="DefaultParagraphFont"/>
+    <w:link w:val="Heading4"/>
     <w:uiPriority w:val="9"/>
     <w:semiHidden/>
     <w:rsid w:val="00855DB1"/>
@@ -7734,10 +8570,10 @@
       <w:color w:val="0F4761" w:themeColor="accent1" w:themeShade="BF"/>
     </w:rPr>
   </w:style>
-  <w:style w:type="character" w:customStyle="1" w:styleId="Titolo5Carattere">
-    <w:name w:val="Titolo 5 Carattere"/>
-    <w:basedOn w:val="Carpredefinitoparagrafo"/>
-    <w:link w:val="Titolo5"/>
+  <w:style w:type="character" w:customStyle="1" w:styleId="Heading5Char">
+    <w:name w:val="Heading 5 Char"/>
+    <w:basedOn w:val="DefaultParagraphFont"/>
+    <w:link w:val="Heading5"/>
     <w:uiPriority w:val="9"/>
     <w:semiHidden/>
     <w:rsid w:val="00855DB1"/>
@@ -7746,10 +8582,10 @@
       <w:color w:val="0F4761" w:themeColor="accent1" w:themeShade="BF"/>
     </w:rPr>
   </w:style>
-  <w:style w:type="character" w:customStyle="1" w:styleId="Titolo6Carattere">
-    <w:name w:val="Titolo 6 Carattere"/>
-    <w:basedOn w:val="Carpredefinitoparagrafo"/>
-    <w:link w:val="Titolo6"/>
+  <w:style w:type="character" w:customStyle="1" w:styleId="Heading6Char">
+    <w:name w:val="Heading 6 Char"/>
+    <w:basedOn w:val="DefaultParagraphFont"/>
+    <w:link w:val="Heading6"/>
     <w:uiPriority w:val="9"/>
     <w:semiHidden/>
     <w:rsid w:val="00855DB1"/>
@@ -7760,10 +8596,10 @@
       <w:color w:val="595959" w:themeColor="text1" w:themeTint="A6"/>
     </w:rPr>
   </w:style>
-  <w:style w:type="character" w:customStyle="1" w:styleId="Titolo7Carattere">
-    <w:name w:val="Titolo 7 Carattere"/>
-    <w:basedOn w:val="Carpredefinitoparagrafo"/>
-    <w:link w:val="Titolo7"/>
+  <w:style w:type="character" w:customStyle="1" w:styleId="Heading7Char">
+    <w:name w:val="Heading 7 Char"/>
+    <w:basedOn w:val="DefaultParagraphFont"/>
+    <w:link w:val="Heading7"/>
     <w:uiPriority w:val="9"/>
     <w:semiHidden/>
     <w:rsid w:val="00855DB1"/>
@@ -7772,10 +8608,10 @@
       <w:color w:val="595959" w:themeColor="text1" w:themeTint="A6"/>
     </w:rPr>
   </w:style>
-  <w:style w:type="character" w:customStyle="1" w:styleId="Titolo8Carattere">
-    <w:name w:val="Titolo 8 Carattere"/>
-    <w:basedOn w:val="Carpredefinitoparagrafo"/>
-    <w:link w:val="Titolo8"/>
+  <w:style w:type="character" w:customStyle="1" w:styleId="Heading8Char">
+    <w:name w:val="Heading 8 Char"/>
+    <w:basedOn w:val="DefaultParagraphFont"/>
+    <w:link w:val="Heading8"/>
     <w:uiPriority w:val="9"/>
     <w:semiHidden/>
     <w:rsid w:val="00855DB1"/>
@@ -7786,10 +8622,10 @@
       <w:color w:val="272727" w:themeColor="text1" w:themeTint="D8"/>
     </w:rPr>
   </w:style>
-  <w:style w:type="character" w:customStyle="1" w:styleId="Titolo9Carattere">
-    <w:name w:val="Titolo 9 Carattere"/>
-    <w:basedOn w:val="Carpredefinitoparagrafo"/>
-    <w:link w:val="Titolo9"/>
+  <w:style w:type="character" w:customStyle="1" w:styleId="Heading9Char">
+    <w:name w:val="Heading 9 Char"/>
+    <w:basedOn w:val="DefaultParagraphFont"/>
+    <w:link w:val="Heading9"/>
     <w:uiPriority w:val="9"/>
     <w:semiHidden/>
     <w:rsid w:val="00855DB1"/>
@@ -7798,11 +8634,11 @@
       <w:color w:val="272727" w:themeColor="text1" w:themeTint="D8"/>
     </w:rPr>
   </w:style>
-  <w:style w:type="paragraph" w:styleId="Titolo">
+  <w:style w:type="paragraph" w:styleId="Title">
     <w:name w:val="Title"/>
-    <w:basedOn w:val="Normale"/>
-    <w:next w:val="Normale"/>
-    <w:link w:val="TitoloCarattere"/>
+    <w:basedOn w:val="Normal"/>
+    <w:next w:val="Normal"/>
+    <w:link w:val="TitleChar"/>
     <w:uiPriority w:val="10"/>
     <w:qFormat/>
     <w:rsid w:val="00855DB1"/>
@@ -7818,10 +8654,10 @@
       <w:szCs w:val="56"/>
     </w:rPr>
   </w:style>
-  <w:style w:type="character" w:customStyle="1" w:styleId="TitoloCarattere">
-    <w:name w:val="Titolo Carattere"/>
-    <w:basedOn w:val="Carpredefinitoparagrafo"/>
-    <w:link w:val="Titolo"/>
+  <w:style w:type="character" w:customStyle="1" w:styleId="TitleChar">
+    <w:name w:val="Title Char"/>
+    <w:basedOn w:val="DefaultParagraphFont"/>
+    <w:link w:val="Title"/>
     <w:uiPriority w:val="10"/>
     <w:rsid w:val="00855DB1"/>
     <w:rPr>
@@ -7832,11 +8668,11 @@
       <w:szCs w:val="56"/>
     </w:rPr>
   </w:style>
-  <w:style w:type="paragraph" w:styleId="Sottotitolo">
+  <w:style w:type="paragraph" w:styleId="Subtitle">
     <w:name w:val="Subtitle"/>
-    <w:basedOn w:val="Normale"/>
-    <w:next w:val="Normale"/>
-    <w:link w:val="SottotitoloCarattere"/>
+    <w:basedOn w:val="Normal"/>
+    <w:next w:val="Normal"/>
+    <w:link w:val="SubtitleChar"/>
     <w:uiPriority w:val="11"/>
     <w:qFormat/>
     <w:rsid w:val="00855DB1"/>
@@ -7853,10 +8689,10 @@
       <w:szCs w:val="28"/>
     </w:rPr>
   </w:style>
-  <w:style w:type="character" w:customStyle="1" w:styleId="SottotitoloCarattere">
-    <w:name w:val="Sottotitolo Carattere"/>
-    <w:basedOn w:val="Carpredefinitoparagrafo"/>
-    <w:link w:val="Sottotitolo"/>
+  <w:style w:type="character" w:customStyle="1" w:styleId="SubtitleChar">
+    <w:name w:val="Subtitle Char"/>
+    <w:basedOn w:val="DefaultParagraphFont"/>
+    <w:link w:val="Subtitle"/>
     <w:uiPriority w:val="11"/>
     <w:rsid w:val="00855DB1"/>
     <w:rPr>
@@ -7867,11 +8703,11 @@
       <w:szCs w:val="28"/>
     </w:rPr>
   </w:style>
-  <w:style w:type="paragraph" w:styleId="Citazione">
+  <w:style w:type="paragraph" w:styleId="Quote">
     <w:name w:val="Quote"/>
-    <w:basedOn w:val="Normale"/>
-    <w:next w:val="Normale"/>
-    <w:link w:val="CitazioneCarattere"/>
+    <w:basedOn w:val="Normal"/>
+    <w:next w:val="Normal"/>
+    <w:link w:val="QuoteChar"/>
     <w:uiPriority w:val="29"/>
     <w:qFormat/>
     <w:rsid w:val="00855DB1"/>
@@ -7885,10 +8721,10 @@
       <w:color w:val="404040" w:themeColor="text1" w:themeTint="BF"/>
     </w:rPr>
   </w:style>
-  <w:style w:type="character" w:customStyle="1" w:styleId="CitazioneCarattere">
-    <w:name w:val="Citazione Carattere"/>
-    <w:basedOn w:val="Carpredefinitoparagrafo"/>
-    <w:link w:val="Citazione"/>
+  <w:style w:type="character" w:customStyle="1" w:styleId="QuoteChar">
+    <w:name w:val="Quote Char"/>
+    <w:basedOn w:val="DefaultParagraphFont"/>
+    <w:link w:val="Quote"/>
     <w:uiPriority w:val="29"/>
     <w:rsid w:val="00855DB1"/>
     <w:rPr>
@@ -7897,9 +8733,9 @@
       <w:color w:val="404040" w:themeColor="text1" w:themeTint="BF"/>
     </w:rPr>
   </w:style>
-  <w:style w:type="paragraph" w:styleId="Paragrafoelenco">
+  <w:style w:type="paragraph" w:styleId="ListParagraph">
     <w:name w:val="List Paragraph"/>
-    <w:basedOn w:val="Normale"/>
+    <w:basedOn w:val="Normal"/>
     <w:uiPriority w:val="34"/>
     <w:qFormat/>
     <w:rsid w:val="00855DB1"/>
@@ -7908,9 +8744,9 @@
       <w:contextualSpacing/>
     </w:pPr>
   </w:style>
-  <w:style w:type="character" w:styleId="Enfasiintensa">
+  <w:style w:type="character" w:styleId="IntenseEmphasis">
     <w:name w:val="Intense Emphasis"/>
-    <w:basedOn w:val="Carpredefinitoparagrafo"/>
+    <w:basedOn w:val="DefaultParagraphFont"/>
     <w:uiPriority w:val="21"/>
     <w:qFormat/>
     <w:rsid w:val="00855DB1"/>
@@ -7920,11 +8756,11 @@
       <w:color w:val="0F4761" w:themeColor="accent1" w:themeShade="BF"/>
     </w:rPr>
   </w:style>
-  <w:style w:type="paragraph" w:styleId="Citazioneintensa">
+  <w:style w:type="paragraph" w:styleId="IntenseQuote">
     <w:name w:val="Intense Quote"/>
-    <w:basedOn w:val="Normale"/>
-    <w:next w:val="Normale"/>
-    <w:link w:val="CitazioneintensaCarattere"/>
+    <w:basedOn w:val="Normal"/>
+    <w:next w:val="Normal"/>
+    <w:link w:val="IntenseQuoteChar"/>
     <w:uiPriority w:val="30"/>
     <w:qFormat/>
     <w:rsid w:val="00855DB1"/>
@@ -7943,10 +8779,10 @@
       <w:color w:val="0F4761" w:themeColor="accent1" w:themeShade="BF"/>
     </w:rPr>
   </w:style>
-  <w:style w:type="character" w:customStyle="1" w:styleId="CitazioneintensaCarattere">
-    <w:name w:val="Citazione intensa Carattere"/>
-    <w:basedOn w:val="Carpredefinitoparagrafo"/>
-    <w:link w:val="Citazioneintensa"/>
+  <w:style w:type="character" w:customStyle="1" w:styleId="IntenseQuoteChar">
+    <w:name w:val="Intense Quote Char"/>
+    <w:basedOn w:val="DefaultParagraphFont"/>
+    <w:link w:val="IntenseQuote"/>
     <w:uiPriority w:val="30"/>
     <w:rsid w:val="00855DB1"/>
     <w:rPr>
@@ -7955,9 +8791,9 @@
       <w:color w:val="0F4761" w:themeColor="accent1" w:themeShade="BF"/>
     </w:rPr>
   </w:style>
-  <w:style w:type="character" w:styleId="Riferimentointenso">
+  <w:style w:type="character" w:styleId="IntenseReference">
     <w:name w:val="Intense Reference"/>
-    <w:basedOn w:val="Carpredefinitoparagrafo"/>
+    <w:basedOn w:val="DefaultParagraphFont"/>
     <w:uiPriority w:val="32"/>
     <w:qFormat/>
     <w:rsid w:val="00855DB1"/>
@@ -7969,9 +8805,9 @@
       <w:spacing w:val="5"/>
     </w:rPr>
   </w:style>
-  <w:style w:type="paragraph" w:styleId="NormaleWeb">
+  <w:style w:type="paragraph" w:styleId="NormalWeb">
     <w:name w:val="Normal (Web)"/>
-    <w:basedOn w:val="Normale"/>
+    <w:basedOn w:val="Normal"/>
     <w:uiPriority w:val="99"/>
     <w:semiHidden/>
     <w:unhideWhenUsed/>
@@ -7985,9 +8821,9 @@
       <w14:ligatures w14:val="none"/>
     </w:rPr>
   </w:style>
-  <w:style w:type="character" w:styleId="Enfasigrassetto">
+  <w:style w:type="character" w:styleId="Strong">
     <w:name w:val="Strong"/>
-    <w:basedOn w:val="Carpredefinitoparagrafo"/>
+    <w:basedOn w:val="DefaultParagraphFont"/>
     <w:uiPriority w:val="22"/>
     <w:qFormat/>
     <w:rsid w:val="006B45C2"/>
@@ -7996,9 +8832,9 @@
       <w:bCs/>
     </w:rPr>
   </w:style>
-  <w:style w:type="table" w:styleId="Tabellagriglia1chiara">
+  <w:style w:type="table" w:styleId="GridTable1Light">
     <w:name w:val="Grid Table 1 Light"/>
-    <w:basedOn w:val="Tabellanormale"/>
+    <w:basedOn w:val="TableNormal"/>
     <w:uiPriority w:val="46"/>
     <w:rsid w:val="006B45C2"/>
     <w:pPr>
@@ -8053,9 +8889,9 @@
       </w:rPr>
     </w:tblStylePr>
   </w:style>
-  <w:style w:type="table" w:styleId="Tabellagriglia1chiara-colore1">
+  <w:style w:type="table" w:styleId="GridTable1Light-Accent1">
     <w:name w:val="Grid Table 1 Light Accent 1"/>
-    <w:basedOn w:val="Tabellanormale"/>
+    <w:basedOn w:val="TableNormal"/>
     <w:uiPriority w:val="46"/>
     <w:rsid w:val="006B45C2"/>
     <w:pPr>
@@ -8110,9 +8946,9 @@
       </w:rPr>
     </w:tblStylePr>
   </w:style>
-  <w:style w:type="table" w:styleId="Tabellagriglia1chiara-colore4">
+  <w:style w:type="table" w:styleId="GridTable1Light-Accent4">
     <w:name w:val="Grid Table 1 Light Accent 4"/>
-    <w:basedOn w:val="Tabellanormale"/>
+    <w:basedOn w:val="TableNormal"/>
     <w:uiPriority w:val="46"/>
     <w:rsid w:val="006B45C2"/>
     <w:pPr>
@@ -8167,9 +9003,9 @@
       </w:rPr>
     </w:tblStylePr>
   </w:style>
-  <w:style w:type="table" w:styleId="Tabellagriglia4-colore1">
+  <w:style w:type="table" w:styleId="GridTable4-Accent1">
     <w:name w:val="Grid Table 4 Accent 1"/>
-    <w:basedOn w:val="Tabellanormale"/>
+    <w:basedOn w:val="TableNormal"/>
     <w:uiPriority w:val="49"/>
     <w:rsid w:val="006B45C2"/>
     <w:pPr>
@@ -8243,9 +9079,9 @@
       </w:tcPr>
     </w:tblStylePr>
   </w:style>
-  <w:style w:type="table" w:styleId="Tabellaelenco3-colore1">
+  <w:style w:type="table" w:styleId="ListTable3-Accent1">
     <w:name w:val="List Table 3 Accent 1"/>
-    <w:basedOn w:val="Tabellanormale"/>
+    <w:basedOn w:val="TableNormal"/>
     <w:uiPriority w:val="48"/>
     <w:rsid w:val="00D12B66"/>
     <w:pPr>
@@ -8367,9 +9203,9 @@
       </w:tcPr>
     </w:tblStylePr>
   </w:style>
-  <w:style w:type="character" w:styleId="Rimandocommento">
+  <w:style w:type="character" w:styleId="CommentReference">
     <w:name w:val="annotation reference"/>
-    <w:basedOn w:val="Carpredefinitoparagrafo"/>
+    <w:basedOn w:val="DefaultParagraphFont"/>
     <w:uiPriority w:val="99"/>
     <w:semiHidden/>
     <w:unhideWhenUsed/>
@@ -8379,10 +9215,10 @@
       <w:szCs w:val="16"/>
     </w:rPr>
   </w:style>
-  <w:style w:type="paragraph" w:styleId="Testocommento">
+  <w:style w:type="paragraph" w:styleId="CommentText">
     <w:name w:val="annotation text"/>
-    <w:basedOn w:val="Normale"/>
-    <w:link w:val="TestocommentoCarattere"/>
+    <w:basedOn w:val="Normal"/>
+    <w:link w:val="CommentTextChar"/>
     <w:uiPriority w:val="99"/>
     <w:semiHidden/>
     <w:unhideWhenUsed/>
@@ -8395,10 +9231,10 @@
       <w:szCs w:val="20"/>
     </w:rPr>
   </w:style>
-  <w:style w:type="character" w:customStyle="1" w:styleId="TestocommentoCarattere">
-    <w:name w:val="Testo commento Carattere"/>
-    <w:basedOn w:val="Carpredefinitoparagrafo"/>
-    <w:link w:val="Testocommento"/>
+  <w:style w:type="character" w:customStyle="1" w:styleId="CommentTextChar">
+    <w:name w:val="Comment Text Char"/>
+    <w:basedOn w:val="DefaultParagraphFont"/>
+    <w:link w:val="CommentText"/>
     <w:uiPriority w:val="99"/>
     <w:semiHidden/>
     <w:rsid w:val="004A52E0"/>
@@ -8407,11 +9243,11 @@
       <w:szCs w:val="20"/>
     </w:rPr>
   </w:style>
-  <w:style w:type="paragraph" w:styleId="Soggettocommento">
+  <w:style w:type="paragraph" w:styleId="CommentSubject">
     <w:name w:val="annotation subject"/>
-    <w:basedOn w:val="Testocommento"/>
-    <w:next w:val="Testocommento"/>
-    <w:link w:val="SoggettocommentoCarattere"/>
+    <w:basedOn w:val="CommentText"/>
+    <w:next w:val="CommentText"/>
+    <w:link w:val="CommentSubjectChar"/>
     <w:uiPriority w:val="99"/>
     <w:semiHidden/>
     <w:unhideWhenUsed/>
@@ -8421,10 +9257,10 @@
       <w:bCs/>
     </w:rPr>
   </w:style>
-  <w:style w:type="character" w:customStyle="1" w:styleId="SoggettocommentoCarattere">
-    <w:name w:val="Soggetto commento Carattere"/>
-    <w:basedOn w:val="TestocommentoCarattere"/>
-    <w:link w:val="Soggettocommento"/>
+  <w:style w:type="character" w:customStyle="1" w:styleId="CommentSubjectChar">
+    <w:name w:val="Comment Subject Char"/>
+    <w:basedOn w:val="CommentTextChar"/>
+    <w:link w:val="CommentSubject"/>
     <w:uiPriority w:val="99"/>
     <w:semiHidden/>
     <w:rsid w:val="004A52E0"/>

</xml_diff>

<commit_message>
ricerce su best practice di gestione prezzi base
</commit_message>
<xml_diff>
--- a/docs/Unita di misura e prezzi/Ricerca prezzi e listini/Best practice Prezzi e Listini.docx
+++ b/docs/Unita di misura e prezzi/Ricerca prezzi e listini/Best practice Prezzi e Listini.docx
@@ -4,7 +4,7 @@
   <w:body>
     <w:p>
       <w:pPr>
-        <w:pStyle w:val="Title"/>
+        <w:pStyle w:val="Titolo"/>
       </w:pPr>
       <w:r>
         <w:t>Gestione prezzi e listini degli erp best in class</w:t>
@@ -12,7 +12,7 @@
     </w:p>
     <w:p>
       <w:pPr>
-        <w:pStyle w:val="Subtitle"/>
+        <w:pStyle w:val="Sottotitolo"/>
       </w:pPr>
       <w:r>
         <w:t>Sia nella sezione prodotto sia nelle sezioni listino</w:t>
@@ -20,7 +20,7 @@
     </w:p>
     <w:p>
       <w:pPr>
-        <w:pStyle w:val="Heading1"/>
+        <w:pStyle w:val="Titolo1"/>
       </w:pPr>
       <w:r>
         <w:t>NetSuite</w:t>
@@ -28,47 +28,368 @@
     </w:p>
     <w:p>
       <w:r>
-        <w:t>Netsuite ha prezzo base e costo base che sono campi della tabella prodotti.</w:t>
-      </w:r>
-    </w:p>
-    <w:p>
-      <w:r>
-        <w:t>Per i listini veri e propri ha tabelle apposta.</w:t>
-      </w:r>
-    </w:p>
-    <w:p>
-      <w:r>
-        <w:t>Sia prezzo di vendita base che prezzi di vendita a listino vengono mostrati lato ux con una matrice.</w:t>
-      </w:r>
-    </w:p>
-    <w:p>
-      <w:pPr>
-        <w:pStyle w:val="Heading2"/>
-      </w:pPr>
-      <w:r>
-        <w:t xml:space="preserve">NetSuite – </w:t>
-      </w:r>
-      <w:r>
-        <w:t>S</w:t>
-      </w:r>
-      <w:r>
-        <w:t>ezione prodotto – Lato UX</w:t>
-      </w:r>
-    </w:p>
-    <w:p>
-      <w:r>
-        <w:t>Nella scheda dell’articolo (il singolo SKU), le informazioni sono divise in due tab: “Sales/Pricing” e “Item vendor pricing”</w:t>
-      </w:r>
-    </w:p>
-    <w:p>
-      <w:r>
-        <w:t xml:space="preserve">Nel tab </w:t>
+        <w:t xml:space="preserve">Netsuite ha </w:t>
+      </w:r>
+      <w:r>
+        <w:t>gestione particolare, un po’ diversa dagli altri</w:t>
+      </w:r>
+    </w:p>
+    <w:p>
+      <w:pPr>
+        <w:pStyle w:val="Paragrafoelenco"/>
+        <w:numPr>
+          <w:ilvl w:val="0"/>
+          <w:numId w:val="30"/>
+        </w:numPr>
+        <w:rPr>
+          <w:b/>
+          <w:bCs/>
+        </w:rPr>
+      </w:pPr>
+      <w:r>
+        <w:rPr>
+          <w:b/>
+          <w:bCs/>
+        </w:rPr>
+        <w:t>I listini sono salvati su tabelle apposta</w:t>
+      </w:r>
+    </w:p>
+    <w:p>
+      <w:pPr>
+        <w:pStyle w:val="Paragrafoelenco"/>
+        <w:numPr>
+          <w:ilvl w:val="0"/>
+          <w:numId w:val="30"/>
+        </w:numPr>
+      </w:pPr>
+      <w:r>
+        <w:rPr>
+          <w:b/>
+          <w:bCs/>
+        </w:rPr>
+        <w:t>Il Prezzo Base di NetSuite</w:t>
+      </w:r>
+      <w:r>
+        <w:t xml:space="preserve"> è contenuto in un </w:t>
+      </w:r>
+      <w:r>
+        <w:rPr>
+          <w:b/>
+          <w:bCs/>
+        </w:rPr>
+        <w:t>listino speciale</w:t>
+      </w:r>
+      <w:r>
+        <w:t xml:space="preserve"> e</w:t>
+      </w:r>
+      <w:r>
+        <w:t xml:space="preserve"> quindi</w:t>
+      </w:r>
+      <w:r>
+        <w:t xml:space="preserve"> </w:t>
+      </w:r>
+      <w:r>
+        <w:rPr>
+          <w:b/>
+          <w:bCs/>
+        </w:rPr>
+        <w:t>non</w:t>
+      </w:r>
+      <w:r>
+        <w:t xml:space="preserve"> è una colonna semplice della tabella principale del prodotto. </w:t>
+      </w:r>
+    </w:p>
+    <w:p>
+      <w:pPr>
+        <w:pStyle w:val="Paragrafoelenco"/>
+        <w:numPr>
+          <w:ilvl w:val="0"/>
+          <w:numId w:val="30"/>
+        </w:numPr>
+      </w:pPr>
+      <w:r>
+        <w:t xml:space="preserve">I </w:t>
+      </w:r>
+      <w:r>
+        <w:rPr>
+          <w:b/>
+          <w:bCs/>
+        </w:rPr>
+        <w:t>costi di acquisto</w:t>
+      </w:r>
+      <w:r>
+        <w:t xml:space="preserve"> (quello che paghi al fornitore, salvato nel campo cost) si trovano direttamente nella tabella dell'articolo (inventoryitem). </w:t>
+      </w:r>
+    </w:p>
+    <w:p>
+      <w:pPr>
+        <w:pStyle w:val="Paragrafoelenco"/>
+        <w:numPr>
+          <w:ilvl w:val="0"/>
+          <w:numId w:val="30"/>
+        </w:numPr>
+      </w:pPr>
+      <w:r>
+        <w:t>Lato UX: s</w:t>
+      </w:r>
+      <w:r>
+        <w:t>ia prezzo di vendita base che prezzi di vendita a listino vengono mostrati con una matrice.</w:t>
+      </w:r>
+      <w:r>
+        <w:t xml:space="preserve"> Che ha 1 riga per ogni listino (compreso il base), 1 colonna per ogni scaglione, la prima colonna col nome listino</w:t>
+      </w:r>
+    </w:p>
+    <w:p>
+      <w:pPr>
+        <w:pStyle w:val="Titolo2"/>
+      </w:pPr>
+      <w:r>
+        <w:t>Prezzi Base come un listino speciale</w:t>
+      </w:r>
+    </w:p>
+    <w:p>
+      <w:pPr>
+        <w:pStyle w:val="Titolo3"/>
+      </w:pPr>
+      <w:r>
+        <w:t>Cosa rende "speciale" questo listino nel backend?</w:t>
+      </w:r>
+      <w:r>
+        <w:t xml:space="preserve"> Che id ha?</w:t>
+      </w:r>
+    </w:p>
+    <w:p>
+      <w:r>
+        <w:t xml:space="preserve">Nel database di NetSuite questo listino ha un identificativo fisso e immutabile: </w:t>
+      </w:r>
+      <w:r>
+        <w:rPr>
+          <w:b/>
+          <w:bCs/>
+        </w:rPr>
+        <w:t>ID = 1</w:t>
+      </w:r>
+      <w:r>
+        <w:t xml:space="preserve"> (nel codice viene indicato come </w:t>
+      </w:r>
+      <w:r>
+        <w:rPr>
+          <w:rStyle w:val="CodiceHTML"/>
+          <w:rFonts w:eastAsiaTheme="minorHAnsi"/>
+        </w:rPr>
+        <w:t>pricelevel = 1</w:t>
+      </w:r>
+      <w:r>
+        <w:t>).</w:t>
+      </w:r>
+    </w:p>
+    <w:p>
+      <w:pPr>
+        <w:pStyle w:val="Titolo2"/>
+      </w:pPr>
+      <w:r>
+        <w:t>Lo status di "Prezzo Base" è fisso o modificabile?</w:t>
+      </w:r>
+    </w:p>
+    <w:p>
+      <w:pPr>
+        <w:numPr>
+          <w:ilvl w:val="0"/>
+          <w:numId w:val="29"/>
+        </w:numPr>
+      </w:pPr>
+      <w:r>
+        <w:rPr>
+          <w:b/>
+          <w:bCs/>
+        </w:rPr>
+        <w:t>L'ID e la struttura sono FISSI</w:t>
+      </w:r>
+      <w:r>
+        <w:t xml:space="preserve">: L'ID 1 è bloccato dal sistema. Non puoi cancellare questo listino né cambiargli il numero identificativo nel database. </w:t>
+      </w:r>
+    </w:p>
+    <w:p>
+      <w:pPr>
+        <w:numPr>
+          <w:ilvl w:val="0"/>
+          <w:numId w:val="29"/>
+        </w:numPr>
+      </w:pPr>
+      <w:r>
+        <w:rPr>
+          <w:b/>
+          <w:bCs/>
+        </w:rPr>
+        <w:t>I prezzi al suo interno sono MODIFICABILI</w:t>
+      </w:r>
+      <w:r>
+        <w:t>: Puoi cambiare l'importo del prezzo base in qualsiasi momento.</w:t>
+      </w:r>
+    </w:p>
+    <w:p>
+      <w:pPr>
+        <w:numPr>
+          <w:ilvl w:val="0"/>
+          <w:numId w:val="29"/>
+        </w:numPr>
+      </w:pPr>
+      <w:r>
+        <w:rPr>
+          <w:b/>
+          <w:bCs/>
+        </w:rPr>
+        <w:t>Il nome visualizzato è MODIFICABILE</w:t>
+      </w:r>
+      <w:r>
+        <w:t xml:space="preserve">: Se non ti piace la scritta "Base Price", puoi cambiarla dall'interfaccia andando in </w:t>
       </w:r>
       <w:r>
         <w:rPr>
           <w:i/>
           <w:iCs/>
         </w:rPr>
+        <w:t>Setup &gt; Accounting &gt; Accounting Lists</w:t>
+      </w:r>
+      <w:r>
+        <w:t xml:space="preserve"> e rinominarla, ad esempio, in "Listino Ufficiale" o "Prezzo al Pubblico". Tuttavia, anche se gli cambi nome a schermo, sotto il cofano (nel database, nelle query e nelle integrazioni) per NetSuite rimarrà sempre e soltanto il listino con </w:t>
+      </w:r>
+      <w:r>
+        <w:rPr>
+          <w:b/>
+          <w:bCs/>
+        </w:rPr>
+        <w:t>ID = 1</w:t>
+      </w:r>
+      <w:r>
+        <w:t xml:space="preserve">. </w:t>
+      </w:r>
+    </w:p>
+    <w:p>
+      <w:pPr>
+        <w:numPr>
+          <w:ilvl w:val="0"/>
+          <w:numId w:val="29"/>
+        </w:numPr>
+        <w:rPr>
+          <w:b/>
+          <w:bCs/>
+        </w:rPr>
+      </w:pPr>
+      <w:r>
+        <w:rPr>
+          <w:b/>
+          <w:bCs/>
+        </w:rPr>
+        <w:t>N</w:t>
+      </w:r>
+      <w:r>
+        <w:rPr>
+          <w:b/>
+          <w:bCs/>
+        </w:rPr>
+        <w:t>on ha sconto</w:t>
+      </w:r>
+      <w:r>
+        <w:rPr>
+          <w:b/>
+          <w:bCs/>
+        </w:rPr>
+        <w:t xml:space="preserve">. </w:t>
+      </w:r>
+      <w:r>
+        <w:t>Non puoi impostare una percentuale di sconto su ID 1: Il campo discountpct per l'ID 1 è fisso a 0% e bloccato.</w:t>
+      </w:r>
+    </w:p>
+    <w:p>
+      <w:pPr>
+        <w:numPr>
+          <w:ilvl w:val="0"/>
+          <w:numId w:val="29"/>
+        </w:numPr>
+      </w:pPr>
+      <w:r>
+        <w:rPr>
+          <w:b/>
+          <w:bCs/>
+        </w:rPr>
+        <w:t>Non è eliminabile:</w:t>
+      </w:r>
+      <w:r>
+        <w:t xml:space="preserve"> Se provi a fare una query di DELETE o eliminazione via GUI sull'ID 1, NetSuite restituisce un errore di sistema (CANNOT_DELETE_SYSTEM_RECORD).</w:t>
+      </w:r>
+    </w:p>
+    <w:p>
+      <w:pPr>
+        <w:pStyle w:val="Titolo3"/>
+      </w:pPr>
+      <w:r>
+        <w:lastRenderedPageBreak/>
+        <w:t>Comportamento di Fallback (Se il prezzo manca)</w:t>
+      </w:r>
+    </w:p>
+    <w:p>
+      <w:r>
+        <w:t xml:space="preserve">Se per un determinato cliente o canale viene impostato un listino (es. </w:t>
+      </w:r>
+      <w:r>
+        <w:rPr>
+          <w:rStyle w:val="CodiceHTML"/>
+          <w:rFonts w:eastAsiaTheme="minorHAnsi"/>
+        </w:rPr>
+        <w:t>price_level_id = 5</w:t>
+      </w:r>
+      <w:r>
+        <w:t xml:space="preserve">) ma per quel determinato articolo non è stato inserito alcun valore per quel listino, l'Engine dei prezzi di NetSuite fa automaticamente un </w:t>
+      </w:r>
+      <w:r>
+        <w:rPr>
+          <w:b/>
+          <w:bCs/>
+        </w:rPr>
+        <w:t xml:space="preserve">fallback e applica il prezzo presente sulla riga </w:t>
+      </w:r>
+      <w:r>
+        <w:rPr>
+          <w:rStyle w:val="CodiceHTML"/>
+          <w:rFonts w:eastAsiaTheme="minorHAnsi"/>
+          <w:b/>
+          <w:bCs/>
+        </w:rPr>
+        <w:t>price_level_id = 1</w:t>
+      </w:r>
+      <w:r>
+        <w:t>.</w:t>
+      </w:r>
+    </w:p>
+    <w:p>
+      <w:pPr>
+        <w:pStyle w:val="Titolo2"/>
+      </w:pPr>
+      <w:r>
+        <w:t xml:space="preserve">NetSuite – </w:t>
+      </w:r>
+      <w:r>
+        <w:t>S</w:t>
+      </w:r>
+      <w:r>
+        <w:t>ezione prodotto – Lato UX</w:t>
+      </w:r>
+    </w:p>
+    <w:p>
+      <w:r>
+        <w:t>Nella scheda dell’articolo (il singolo SKU), le informazioni sono divise in due tab: “Sales/Pricing” e “Item vendor pricing”</w:t>
+      </w:r>
+    </w:p>
+    <w:p>
+      <w:r>
+        <w:t xml:space="preserve">Nel tab </w:t>
+      </w:r>
+      <w:r>
+        <w:rPr>
+          <w:i/>
+          <w:iCs/>
+        </w:rPr>
         <w:t>Purchasing</w:t>
       </w:r>
       <w:r>
@@ -77,7 +398,7 @@
     </w:p>
     <w:p>
       <w:pPr>
-        <w:pStyle w:val="ListParagraph"/>
+        <w:pStyle w:val="Paragrafoelenco"/>
         <w:numPr>
           <w:ilvl w:val="0"/>
           <w:numId w:val="24"/>
@@ -109,22 +430,19 @@
     </w:p>
     <w:p>
       <w:pPr>
-        <w:pStyle w:val="ListParagraph"/>
+        <w:pStyle w:val="Paragrafoelenco"/>
         <w:numPr>
           <w:ilvl w:val="0"/>
           <w:numId w:val="24"/>
         </w:numPr>
       </w:pPr>
       <w:r>
-        <w:t>C’è la M</w:t>
-      </w:r>
-      <w:r>
-        <w:t>atrice Fornitori</w:t>
-      </w:r>
-    </w:p>
-    <w:p>
-      <w:pPr>
-        <w:pStyle w:val="ListParagraph"/>
+        <w:t>C’è la Matrice Fornitori</w:t>
+      </w:r>
+    </w:p>
+    <w:p>
+      <w:pPr>
+        <w:pStyle w:val="Paragrafoelenco"/>
         <w:numPr>
           <w:ilvl w:val="1"/>
           <w:numId w:val="24"/>
@@ -136,7 +454,7 @@
     </w:p>
     <w:p>
       <w:pPr>
-        <w:pStyle w:val="ListParagraph"/>
+        <w:pStyle w:val="Paragrafoelenco"/>
         <w:numPr>
           <w:ilvl w:val="1"/>
           <w:numId w:val="24"/>
@@ -148,7 +466,7 @@
     </w:p>
     <w:p>
       <w:pPr>
-        <w:pStyle w:val="ListParagraph"/>
+        <w:pStyle w:val="Paragrafoelenco"/>
         <w:numPr>
           <w:ilvl w:val="1"/>
           <w:numId w:val="24"/>
@@ -160,7 +478,7 @@
     </w:p>
     <w:p>
       <w:pPr>
-        <w:pStyle w:val="ListParagraph"/>
+        <w:pStyle w:val="Paragrafoelenco"/>
         <w:numPr>
           <w:ilvl w:val="1"/>
           <w:numId w:val="24"/>
@@ -172,7 +490,7 @@
     </w:p>
     <w:p>
       <w:pPr>
-        <w:pStyle w:val="ListParagraph"/>
+        <w:pStyle w:val="Paragrafoelenco"/>
         <w:numPr>
           <w:ilvl w:val="0"/>
           <w:numId w:val="24"/>
@@ -233,7 +551,7 @@
     </w:p>
     <w:p>
       <w:pPr>
-        <w:pStyle w:val="ListParagraph"/>
+        <w:pStyle w:val="Paragrafoelenco"/>
         <w:numPr>
           <w:ilvl w:val="0"/>
           <w:numId w:val="2"/>
@@ -258,7 +576,7 @@
     </w:p>
     <w:p>
       <w:pPr>
-        <w:pStyle w:val="Heading3"/>
+        <w:pStyle w:val="Titolo3"/>
       </w:pPr>
       <w:r>
         <w:t>Come fa l'utente a capire la differenza visiva tra un listino e l'altro?</w:t>
@@ -266,7 +584,7 @@
     </w:p>
     <w:p>
       <w:pPr>
-        <w:pStyle w:val="NormalWeb"/>
+        <w:pStyle w:val="NormaleWeb"/>
         <w:spacing w:before="0" w:beforeAutospacing="0"/>
         <w:rPr>
           <w:rFonts w:ascii="Arial" w:hAnsi="Arial" w:cs="Arial"/>
@@ -281,7 +599,7 @@
     </w:p>
     <w:tbl>
       <w:tblPr>
-        <w:tblStyle w:val="GridTable4-Accent1"/>
+        <w:tblStyle w:val="Tabellagriglia4-colore1"/>
         <w:tblW w:w="9351" w:type="dxa"/>
         <w:tblLook w:val="06A0" w:firstRow="1" w:lastRow="0" w:firstColumn="1" w:lastColumn="0" w:noHBand="1" w:noVBand="1"/>
       </w:tblPr>
@@ -310,7 +628,7 @@
             </w:pPr>
             <w:r>
               <w:rPr>
-                <w:rStyle w:val="Strong"/>
+                <w:rStyle w:val="Enfasigrassetto"/>
                 <w:rFonts w:ascii="Arial" w:hAnsi="Arial" w:cs="Arial"/>
               </w:rPr>
               <w:t>Price Level (Listino)</w:t>
@@ -331,7 +649,7 @@
             </w:pPr>
             <w:r>
               <w:rPr>
-                <w:rStyle w:val="Strong"/>
+                <w:rStyle w:val="Enfasigrassetto"/>
                 <w:rFonts w:ascii="Arial" w:hAnsi="Arial" w:cs="Arial"/>
               </w:rPr>
               <w:t>Qty 1-10 (EUR)</w:t>
@@ -352,7 +670,7 @@
             </w:pPr>
             <w:r>
               <w:rPr>
-                <w:rStyle w:val="Strong"/>
+                <w:rStyle w:val="Enfasigrassetto"/>
                 <w:rFonts w:ascii="Arial" w:hAnsi="Arial" w:cs="Arial"/>
               </w:rPr>
               <w:t>Qty 11-50 (EUR)</w:t>
@@ -373,7 +691,7 @@
             </w:pPr>
             <w:r>
               <w:rPr>
-                <w:rStyle w:val="Strong"/>
+                <w:rStyle w:val="Enfasigrassetto"/>
                 <w:rFonts w:ascii="Arial" w:hAnsi="Arial" w:cs="Arial"/>
               </w:rPr>
               <w:t>% Sconto</w:t>
@@ -394,7 +712,7 @@
             </w:pPr>
             <w:r>
               <w:rPr>
-                <w:rStyle w:val="Strong"/>
+                <w:rStyle w:val="Enfasigrassetto"/>
                 <w:rFonts w:ascii="Arial" w:hAnsi="Arial" w:cs="Arial"/>
               </w:rPr>
               <w:t>Status / Calcolo</w:t>
@@ -421,7 +739,6 @@
                 <w:b w:val="0"/>
                 <w:bCs w:val="0"/>
               </w:rPr>
-              <w:lastRenderedPageBreak/>
               <w:t>Base Price</w:t>
             </w:r>
             <w:r>
@@ -788,6 +1105,7 @@
                 <w:b w:val="0"/>
                 <w:bCs w:val="0"/>
               </w:rPr>
+              <w:lastRenderedPageBreak/>
               <w:t>VIP Client</w:t>
             </w:r>
           </w:p>
@@ -1001,7 +1319,7 @@
     </w:p>
     <w:p>
       <w:pPr>
-        <w:pStyle w:val="Heading2"/>
+        <w:pStyle w:val="Titolo2"/>
       </w:pPr>
       <w:r>
         <w:t xml:space="preserve">NetSuite – </w:t>
@@ -1040,7 +1358,7 @@
     </w:p>
     <w:tbl>
       <w:tblPr>
-        <w:tblStyle w:val="GridTable4-Accent1"/>
+        <w:tblStyle w:val="Tabellagriglia4-colore1"/>
         <w:tblW w:w="0" w:type="auto"/>
         <w:tblLook w:val="06A0" w:firstRow="1" w:lastRow="0" w:firstColumn="1" w:lastColumn="0" w:noHBand="1" w:noVBand="1"/>
       </w:tblPr>
@@ -1394,7 +1712,7 @@
     </w:p>
     <w:tbl>
       <w:tblPr>
-        <w:tblStyle w:val="GridTable4-Accent1"/>
+        <w:tblStyle w:val="Tabellagriglia4-colore1"/>
         <w:tblW w:w="0" w:type="auto"/>
         <w:tblLook w:val="06A0" w:firstRow="1" w:lastRow="0" w:firstColumn="1" w:lastColumn="0" w:noHBand="1" w:noVBand="1"/>
       </w:tblPr>
@@ -1418,7 +1736,6 @@
               <w:spacing w:after="160" w:line="278" w:lineRule="auto"/>
             </w:pPr>
             <w:r>
-              <w:lastRenderedPageBreak/>
               <w:t>customer_id</w:t>
             </w:r>
           </w:p>
@@ -1602,6 +1919,7 @@
     </w:p>
     <w:p>
       <w:r>
+        <w:lastRenderedPageBreak/>
         <w:t>È la tabella ponte</w:t>
       </w:r>
       <w:r>
@@ -1623,7 +1941,7 @@
     </w:p>
     <w:tbl>
       <w:tblPr>
-        <w:tblStyle w:val="GridTable4-Accent1"/>
+        <w:tblStyle w:val="Tabellagriglia4-colore1"/>
         <w:tblW w:w="0" w:type="auto"/>
         <w:tblLook w:val="06A0" w:firstRow="1" w:lastRow="0" w:firstColumn="1" w:lastColumn="0" w:noHBand="1" w:noVBand="1"/>
       </w:tblPr>
@@ -2186,7 +2504,7 @@
     </w:p>
     <w:p>
       <w:pPr>
-        <w:pStyle w:val="Heading2"/>
+        <w:pStyle w:val="Titolo2"/>
       </w:pPr>
       <w:r>
         <w:t>NetSuite – Sezione Listini – lato UX</w:t>
@@ -2214,9 +2532,81 @@
     </w:p>
     <w:p>
       <w:pPr>
-        <w:pStyle w:val="Heading2"/>
-      </w:pPr>
-      <w:r>
+        <w:pStyle w:val="Titolo3"/>
+      </w:pPr>
+      <w:r>
+        <w:t>C'è un listino "Prezzi Base" nella sezione Listini?</w:t>
+      </w:r>
+    </w:p>
+    <w:p>
+      <w:r>
+        <w:rPr>
+          <w:b/>
+          <w:bCs/>
+        </w:rPr>
+        <w:t>Lato DB:</w:t>
+      </w:r>
+      <w:r>
+        <w:t xml:space="preserve"> Il prezzo base sta fisicamente nella tabella del prodotto (product_template.list_price).</w:t>
+      </w:r>
+    </w:p>
+    <w:p>
+      <w:r>
+        <w:rPr>
+          <w:b/>
+          <w:bCs/>
+        </w:rPr>
+        <w:t>Sezione Listini:</w:t>
+      </w:r>
+      <w:r>
+        <w:t xml:space="preserve"> Il "Listino Pubblico" (Public Pricelist) </w:t>
+      </w:r>
+      <w:r>
+        <w:rPr>
+          <w:b/>
+          <w:bCs/>
+        </w:rPr>
+        <w:t>non duplica i dati</w:t>
+      </w:r>
+      <w:r>
+        <w:t>, ma funziona come uno "specchio": legge direttamente il prezzo base di ciascun prodotto e lo mostra nella sezione listini. Se modifichi il prezzo da una parte, si aggiorna automaticamente anche dall'altra.</w:t>
+      </w:r>
+    </w:p>
+    <w:p/>
+    <w:p>
+      <w:r>
+        <w:t>Esiste un listino che raccoglie tutti i prezzi base. N</w:t>
+      </w:r>
+      <w:r>
+        <w:t>ella sezione di gestione dei listini (</w:t>
+      </w:r>
+      <w:r>
+        <w:rPr>
+          <w:i/>
+          <w:iCs/>
+        </w:rPr>
+        <w:t>Setup &gt; Accounting &gt; Price Levels</w:t>
+      </w:r>
+      <w:r>
+        <w:t xml:space="preserve">), trovi nell'elenco dei listini una voce di sistema predefinita chiamata </w:t>
+      </w:r>
+      <w:r>
+        <w:rPr>
+          <w:b/>
+          <w:bCs/>
+        </w:rPr>
+        <w:t>Base Price</w:t>
+      </w:r>
+      <w:r>
+        <w:t>.</w:t>
+      </w:r>
+    </w:p>
+    <w:p>
+      <w:pPr>
+        <w:pStyle w:val="Titolo2"/>
+      </w:pPr>
+      <w:r>
+        <w:lastRenderedPageBreak/>
         <w:t>NetSuite – Sezione Listini – lato DB</w:t>
       </w:r>
     </w:p>
@@ -2230,316 +2620,382 @@
     </w:p>
     <w:p>
       <w:pPr>
-        <w:pStyle w:val="Heading2"/>
-      </w:pPr>
-      <w:r>
+        <w:pStyle w:val="Titolo2"/>
+      </w:pPr>
+      <w:r>
+        <w:t>C</w:t>
+      </w:r>
+      <w:r>
+        <w:t>osa intende NetSuite con</w:t>
+      </w:r>
+      <w:r>
+        <w:t xml:space="preserve"> "Price Level"?</w:t>
+      </w:r>
+    </w:p>
+    <w:p>
+      <w:r>
+        <w:t xml:space="preserve">Un </w:t>
+      </w:r>
+      <w:r>
+        <w:rPr>
+          <w:b/>
+          <w:bCs/>
+        </w:rPr>
+        <w:t>Price Level</w:t>
+      </w:r>
+      <w:r>
+        <w:t xml:space="preserve"> è l'equivalente di un </w:t>
+      </w:r>
+      <w:r>
+        <w:rPr>
+          <w:b/>
+          <w:bCs/>
+        </w:rPr>
+        <w:t>Listino Prezzi aziendale</w:t>
+      </w:r>
+      <w:r>
+        <w:t>.</w:t>
+      </w:r>
+    </w:p>
+    <w:p>
+      <w:r>
+        <w:t>Esempi di Price Level che crei nel sistema:</w:t>
+      </w:r>
+    </w:p>
+    <w:p>
+      <w:pPr>
+        <w:numPr>
+          <w:ilvl w:val="0"/>
+          <w:numId w:val="3"/>
+        </w:numPr>
+      </w:pPr>
+      <w:r>
+        <w:t>Base Price (Listino Base / Default)</w:t>
+      </w:r>
+    </w:p>
+    <w:p>
+      <w:pPr>
+        <w:numPr>
+          <w:ilvl w:val="0"/>
+          <w:numId w:val="3"/>
+        </w:numPr>
+      </w:pPr>
+      <w:r>
+        <w:t>Wholesale (Listino Ingrosso)</w:t>
+      </w:r>
+    </w:p>
+    <w:p>
+      <w:pPr>
+        <w:numPr>
+          <w:ilvl w:val="0"/>
+          <w:numId w:val="3"/>
+        </w:numPr>
+      </w:pPr>
+      <w:r>
+        <w:t>Retail (Listino Dettaglio / Negozio)</w:t>
+      </w:r>
+    </w:p>
+    <w:p>
+      <w:pPr>
+        <w:numPr>
+          <w:ilvl w:val="0"/>
+          <w:numId w:val="3"/>
+        </w:numPr>
+      </w:pPr>
+      <w:r>
+        <w:t>Distributor (Listino Distributori)</w:t>
+      </w:r>
+    </w:p>
+    <w:p>
+      <w:pPr>
+        <w:numPr>
+          <w:ilvl w:val="0"/>
+          <w:numId w:val="3"/>
+        </w:numPr>
+      </w:pPr>
+      <w:r>
+        <w:t>VIP Client (Listino Clienti VIP)</w:t>
+      </w:r>
+    </w:p>
+    <w:p>
+      <w:pPr>
+        <w:pStyle w:val="Titolo3"/>
+      </w:pPr>
+      <w:r>
+        <w:t>Cosa distingue un Price Level (listino) da un altro?</w:t>
+      </w:r>
+    </w:p>
+    <w:p>
+      <w:r>
+        <w:t>La differenza tra un listino e l'altro in NetSuite può essere determinata da 3 fattori:</w:t>
+      </w:r>
+    </w:p>
+    <w:p>
+      <w:pPr>
+        <w:numPr>
+          <w:ilvl w:val="0"/>
+          <w:numId w:val="4"/>
+        </w:numPr>
+      </w:pPr>
+      <w:r>
+        <w:rPr>
+          <w:b/>
+          <w:bCs/>
+        </w:rPr>
+        <w:t>La regola di calcolo percentuale di default (Sconto/Ricarico):</w:t>
+      </w:r>
+    </w:p>
+    <w:p>
+      <w:pPr>
+        <w:numPr>
+          <w:ilvl w:val="1"/>
+          <w:numId w:val="4"/>
+        </w:numPr>
+      </w:pPr>
+      <w:r>
+        <w:t xml:space="preserve">Quando crei il Price Level Wholesale, puoi dire a NetSuite: </w:t>
+      </w:r>
+      <w:r>
+        <w:rPr>
+          <w:i/>
+          <w:iCs/>
+        </w:rPr>
+        <w:t>"Questo listino di default applica sempre uno sconto del -10% rispetto al Base Price"</w:t>
+      </w:r>
+      <w:r>
+        <w:t>.</w:t>
+      </w:r>
+    </w:p>
+    <w:p>
+      <w:pPr>
+        <w:numPr>
+          <w:ilvl w:val="0"/>
+          <w:numId w:val="4"/>
+        </w:numPr>
+      </w:pPr>
+      <w:r>
+        <w:rPr>
+          <w:b/>
+          <w:bCs/>
+        </w:rPr>
+        <w:t>La destinazione / associazione (Canale o Cliente):</w:t>
+      </w:r>
+    </w:p>
+    <w:p>
+      <w:pPr>
+        <w:numPr>
+          <w:ilvl w:val="1"/>
+          <w:numId w:val="4"/>
+        </w:numPr>
+      </w:pPr>
+      <w:r>
+        <w:rPr>
+          <w:b/>
+          <w:bCs/>
+        </w:rPr>
+        <w:t>Canale di vendita:</w:t>
+      </w:r>
+      <w:r>
+        <w:t xml:space="preserve"> Puoi associare un Price Level a un canale (es. gli ordini che arrivano dall'e-commerce prendono il listino Retail).</w:t>
+      </w:r>
+    </w:p>
+    <w:p>
+      <w:pPr>
+        <w:numPr>
+          <w:ilvl w:val="1"/>
+          <w:numId w:val="4"/>
+        </w:numPr>
+      </w:pPr>
+      <w:r>
+        <w:rPr>
+          <w:b/>
+          <w:bCs/>
+        </w:rPr>
+        <w:t>Cliente specifico:</w:t>
+      </w:r>
+      <w:r>
+        <w:t xml:space="preserve"> Nella scheda dell'anagrafica del Cliente (Customer Record), c'è un campo chiamato Price Level. Se su Mario Rossi imposti Wholesale, ogni volta che crei una fattura per Mario Rossi, NetSuite applicherà automaticamente i prezzi del listino Wholesale.</w:t>
+      </w:r>
+    </w:p>
+    <w:p>
+      <w:pPr>
+        <w:numPr>
+          <w:ilvl w:val="0"/>
+          <w:numId w:val="4"/>
+        </w:numPr>
+      </w:pPr>
+      <w:r>
+        <w:rPr>
+          <w:b/>
+          <w:bCs/>
+        </w:rPr>
+        <w:t>La valuta:</w:t>
+      </w:r>
+    </w:p>
+    <w:p>
+      <w:pPr>
+        <w:numPr>
+          <w:ilvl w:val="1"/>
+          <w:numId w:val="4"/>
+        </w:numPr>
+      </w:pPr>
+      <w:r>
+        <w:t>Ogni Price Level può gestire più valute (EUR, USD, GBP).</w:t>
+      </w:r>
+    </w:p>
+    <w:p>
+      <w:r>
+        <w:rPr>
+          <w:i/>
+          <w:iCs/>
+        </w:rPr>
+        <w:t>E gli scaglioni di quantità (Quantity Pricing / Tiered Pricing)?</w:t>
+      </w:r>
+      <w:r>
+        <w:t xml:space="preserve"> In NetSuite gli scaglioni di quantità </w:t>
+      </w:r>
+      <w:r>
+        <w:rPr>
+          <w:b/>
+          <w:bCs/>
+        </w:rPr>
+        <w:t>NON sono listini diversi</w:t>
+      </w:r>
+      <w:r>
+        <w:t>, ma sono colonne/sub-righe dentro lo stesso Price Level. (Esempio: dentro il listino Wholesale, da 1 a 10 pezzi costa 10€, da 11 a 50 pezzi costa 8€).</w:t>
+      </w:r>
+    </w:p>
+    <w:p>
+      <w:pPr>
+        <w:pStyle w:val="Titolo1"/>
+      </w:pPr>
+      <w:r>
+        <w:t>SAP</w:t>
+      </w:r>
+    </w:p>
+    <w:p>
+      <w:r>
+        <w:t xml:space="preserve">Sap è diverso dagli altri ERP: non usa tabelle listino ma usa un concetto chiamato “Condizioni di prezzo”. </w:t>
+      </w:r>
+    </w:p>
+    <w:p>
+      <w:pPr>
+        <w:rPr>
+          <w:b/>
+          <w:bCs/>
+        </w:rPr>
+      </w:pPr>
+      <w:r>
+        <w:rPr>
+          <w:b/>
+          <w:bCs/>
+        </w:rPr>
         <w:lastRenderedPageBreak/>
         <w:t>C</w:t>
       </w:r>
       <w:r>
-        <w:t>osa intende NetSuite con</w:t>
-      </w:r>
-      <w:r>
-        <w:t xml:space="preserve"> "Price Level"?</w:t>
-      </w:r>
-    </w:p>
-    <w:p>
-      <w:r>
-        <w:t xml:space="preserve">Un </w:t>
-      </w:r>
-      <w:r>
         <w:rPr>
           <w:b/>
           <w:bCs/>
         </w:rPr>
-        <w:t>Price Level</w:t>
-      </w:r>
-      <w:r>
-        <w:t xml:space="preserve"> è l'equivalente di un </w:t>
-      </w:r>
+        <w:t>os'è una Condition Table in parole povere?</w:t>
+      </w:r>
+    </w:p>
+    <w:p>
+      <w:r>
+        <w:t>Invece di avere una tabella fissa con colonne preconfezionate, SAP ti permette di creare "tabelle su misura" per definire i prezzi.</w:t>
+      </w:r>
+    </w:p>
+    <w:p>
+      <w:pPr>
+        <w:numPr>
+          <w:ilvl w:val="0"/>
+          <w:numId w:val="15"/>
+        </w:numPr>
+      </w:pPr>
       <w:r>
         <w:rPr>
           <w:b/>
           <w:bCs/>
         </w:rPr>
-        <w:t>Listino Prezzi aziendale</w:t>
+        <w:t>Esempio:</w:t>
+      </w:r>
+      <w:r>
+        <w:t xml:space="preserve"> Puoi creare una tabella (chiamata ad esempio A004) che dice: </w:t>
+      </w:r>
+      <w:r>
+        <w:rPr>
+          <w:i/>
+          <w:iCs/>
+        </w:rPr>
+        <w:t>"La chiave di questa tabella è la combinazione [Cliente + Materiale]"</w:t>
       </w:r>
       <w:r>
         <w:t>.</w:t>
       </w:r>
     </w:p>
     <w:p>
-      <w:r>
-        <w:t>Esempi di Price Level che crei nel sistema:</w:t>
-      </w:r>
-    </w:p>
-    <w:p>
       <w:pPr>
         <w:numPr>
           <w:ilvl w:val="0"/>
-          <w:numId w:val="3"/>
-        </w:numPr>
-      </w:pPr>
-      <w:r>
-        <w:t>Base Price (Listino Base / Default)</w:t>
+          <w:numId w:val="15"/>
+        </w:numPr>
+      </w:pPr>
+      <w:r>
+        <w:t xml:space="preserve">Puoi creare un'altra tabella (A005) con chiave: </w:t>
+      </w:r>
+      <w:r>
+        <w:rPr>
+          <w:i/>
+          <w:iCs/>
+        </w:rPr>
+        <w:t>"Combinazione [Canale Distributivo + Materiale]"</w:t>
+      </w:r>
+      <w:r>
+        <w:t>.</w:t>
       </w:r>
     </w:p>
     <w:p>
       <w:pPr>
         <w:numPr>
           <w:ilvl w:val="0"/>
-          <w:numId w:val="3"/>
-        </w:numPr>
-      </w:pPr>
-      <w:r>
-        <w:t>Wholesale (Listino Ingrosso)</w:t>
-      </w:r>
-    </w:p>
-    <w:p>
-      <w:pPr>
-        <w:numPr>
-          <w:ilvl w:val="0"/>
-          <w:numId w:val="3"/>
-        </w:numPr>
-      </w:pPr>
-      <w:r>
-        <w:t>Retail (Listino Dettaglio / Negozio)</w:t>
-      </w:r>
-    </w:p>
-    <w:p>
-      <w:pPr>
-        <w:numPr>
-          <w:ilvl w:val="0"/>
-          <w:numId w:val="3"/>
-        </w:numPr>
-      </w:pPr>
-      <w:r>
-        <w:t>Distributor (Listino Distributori)</w:t>
-      </w:r>
-    </w:p>
-    <w:p>
-      <w:pPr>
-        <w:numPr>
-          <w:ilvl w:val="0"/>
-          <w:numId w:val="3"/>
-        </w:numPr>
-      </w:pPr>
-      <w:r>
-        <w:t>VIP Client (Listino Clienti VIP)</w:t>
-      </w:r>
-    </w:p>
-    <w:p>
-      <w:pPr>
-        <w:pStyle w:val="Heading3"/>
-      </w:pPr>
-      <w:r>
-        <w:t>Cosa distingue un Price Level (listino) da un altro?</w:t>
-      </w:r>
-    </w:p>
-    <w:p>
-      <w:r>
-        <w:t>La differenza tra un listino e l'altro in NetSuite può essere determinata da 3 fattori:</w:t>
-      </w:r>
-    </w:p>
-    <w:p>
-      <w:pPr>
-        <w:numPr>
-          <w:ilvl w:val="0"/>
-          <w:numId w:val="4"/>
-        </w:numPr>
-      </w:pPr>
+          <w:numId w:val="15"/>
+        </w:numPr>
+      </w:pPr>
+      <w:r>
+        <w:t xml:space="preserve">O una tabella semplice (A006): </w:t>
+      </w:r>
+      <w:r>
+        <w:rPr>
+          <w:i/>
+          <w:iCs/>
+        </w:rPr>
+        <w:t>"Solo [Materiale]"</w:t>
+      </w:r>
+      <w:r>
+        <w:t xml:space="preserve"> (che rappresenta il </w:t>
+      </w:r>
       <w:r>
         <w:rPr>
           <w:b/>
           <w:bCs/>
         </w:rPr>
-        <w:t>La regola di calcolo percentuale di default (Sconto/Ricarico):</w:t>
-      </w:r>
-    </w:p>
-    <w:p>
-      <w:pPr>
-        <w:numPr>
-          <w:ilvl w:val="1"/>
-          <w:numId w:val="4"/>
-        </w:numPr>
-      </w:pPr>
-      <w:r>
-        <w:t xml:space="preserve">Quando crei il Price Level Wholesale, puoi dire a NetSuite: </w:t>
-      </w:r>
-      <w:r>
-        <w:rPr>
-          <w:i/>
-          <w:iCs/>
-        </w:rPr>
-        <w:t>"Questo listino di default applica sempre uno sconto del -10% rispetto al Base Price"</w:t>
-      </w:r>
-      <w:r>
-        <w:t>.</w:t>
-      </w:r>
-    </w:p>
-    <w:p>
-      <w:pPr>
-        <w:numPr>
-          <w:ilvl w:val="0"/>
-          <w:numId w:val="4"/>
-        </w:numPr>
-      </w:pPr>
+        <w:t>Prezzo Base</w:t>
+      </w:r>
+      <w:r>
+        <w:t>).</w:t>
+      </w:r>
+    </w:p>
+    <w:p>
+      <w:r>
+        <w:t xml:space="preserve">Tutte queste tabelle salvano poi i loro valori monetari nella tabella regina dei prezzi: la tabella </w:t>
+      </w:r>
       <w:r>
         <w:rPr>
           <w:b/>
           <w:bCs/>
         </w:rPr>
-        <w:t>La destinazione / associazione (Canale o Cliente):</w:t>
-      </w:r>
-    </w:p>
-    <w:p>
-      <w:pPr>
-        <w:numPr>
-          <w:ilvl w:val="1"/>
-          <w:numId w:val="4"/>
-        </w:numPr>
-      </w:pPr>
-      <w:r>
-        <w:rPr>
-          <w:b/>
-          <w:bCs/>
-        </w:rPr>
-        <w:t>Canale di vendita:</w:t>
-      </w:r>
-      <w:r>
-        <w:t xml:space="preserve"> Puoi associare un Price Level a un canale (es. gli ordini che arrivano dall'e-commerce prendono il listino Retail).</w:t>
-      </w:r>
-    </w:p>
-    <w:p>
-      <w:pPr>
-        <w:numPr>
-          <w:ilvl w:val="1"/>
-          <w:numId w:val="4"/>
-        </w:numPr>
-      </w:pPr>
-      <w:r>
-        <w:rPr>
-          <w:b/>
-          <w:bCs/>
-        </w:rPr>
-        <w:t>Cliente specifico:</w:t>
-      </w:r>
-      <w:r>
-        <w:t xml:space="preserve"> Nella scheda dell'anagrafica del Cliente (Customer Record), c'è un campo chiamato Price Level. Se su Mario Rossi imposti Wholesale, ogni volta che crei una fattura per Mario Rossi, NetSuite applicherà automaticamente i prezzi del listino Wholesale.</w:t>
-      </w:r>
-    </w:p>
-    <w:p>
-      <w:pPr>
-        <w:numPr>
-          <w:ilvl w:val="0"/>
-          <w:numId w:val="4"/>
-        </w:numPr>
-      </w:pPr>
-      <w:r>
-        <w:rPr>
-          <w:b/>
-          <w:bCs/>
-        </w:rPr>
-        <w:t>La valuta:</w:t>
-      </w:r>
-    </w:p>
-    <w:p>
-      <w:pPr>
-        <w:numPr>
-          <w:ilvl w:val="1"/>
-          <w:numId w:val="4"/>
-        </w:numPr>
-      </w:pPr>
-      <w:r>
-        <w:t>Ogni Price Level può gestire più valute (EUR, USD, GBP).</w:t>
-      </w:r>
-    </w:p>
-    <w:p>
-      <w:r>
-        <w:rPr>
-          <w:i/>
-          <w:iCs/>
-        </w:rPr>
-        <w:t>E gli scaglioni di quantità (Quantity Pricing / Tiered Pricing)?</w:t>
-      </w:r>
-      <w:r>
-        <w:t xml:space="preserve"> In NetSuite gli scaglioni di quantità </w:t>
-      </w:r>
-      <w:r>
-        <w:rPr>
-          <w:b/>
-          <w:bCs/>
-        </w:rPr>
-        <w:t>NON sono listini diversi</w:t>
-      </w:r>
-      <w:r>
-        <w:t>, ma sono colonne/sub-righe dentro lo stesso Price Level. (Esempio: dentro il listino Wholesale, da 1 a 10 pezzi costa 10€, da 11 a 50 pezzi costa 8€).</w:t>
-      </w:r>
-    </w:p>
-    <w:p>
-      <w:pPr>
-        <w:pStyle w:val="Heading1"/>
-      </w:pPr>
-      <w:r>
-        <w:t>SAP</w:t>
-      </w:r>
-    </w:p>
-    <w:p>
-      <w:r>
-        <w:t xml:space="preserve">Sap è diverso dagli altri ERP: non usa tabelle listino ma usa un concetto chiamato “Condizioni di prezzo”. </w:t>
-      </w:r>
-    </w:p>
-    <w:p>
-      <w:pPr>
-        <w:rPr>
-          <w:b/>
-          <w:bCs/>
-        </w:rPr>
-      </w:pPr>
-      <w:r>
-        <w:rPr>
-          <w:b/>
-          <w:bCs/>
-        </w:rPr>
-        <w:t>C</w:t>
-      </w:r>
-      <w:r>
-        <w:rPr>
-          <w:b/>
-          <w:bCs/>
-        </w:rPr>
-        <w:t>os'è una Condition Table in parole povere?</w:t>
-      </w:r>
-    </w:p>
-    <w:p>
-      <w:r>
-        <w:t>Invece di avere una tabella fissa con colonne preconfezionate, SAP ti permette di creare "tabelle su misura" per definire i prezzi.</w:t>
-      </w:r>
-    </w:p>
-    <w:p>
-      <w:pPr>
-        <w:numPr>
-          <w:ilvl w:val="0"/>
-          <w:numId w:val="15"/>
-        </w:numPr>
-      </w:pPr>
-      <w:r>
-        <w:rPr>
-          <w:b/>
-          <w:bCs/>
-        </w:rPr>
-        <w:lastRenderedPageBreak/>
-        <w:t>Esempio:</w:t>
-      </w:r>
-      <w:r>
-        <w:t xml:space="preserve"> Puoi creare una tabella (chiamata ad esempio A004) che dice: </w:t>
-      </w:r>
-      <w:r>
-        <w:rPr>
-          <w:i/>
-          <w:iCs/>
-        </w:rPr>
-        <w:t>"La chiave di questa tabella è la combinazione [Cliente + Materiale]"</w:t>
+        <w:t>KONP</w:t>
       </w:r>
       <w:r>
         <w:t>.</w:t>
@@ -2547,74 +3003,7 @@
     </w:p>
     <w:p>
       <w:pPr>
-        <w:numPr>
-          <w:ilvl w:val="0"/>
-          <w:numId w:val="15"/>
-        </w:numPr>
-      </w:pPr>
-      <w:r>
-        <w:t xml:space="preserve">Puoi creare un'altra tabella (A005) con chiave: </w:t>
-      </w:r>
-      <w:r>
-        <w:rPr>
-          <w:i/>
-          <w:iCs/>
-        </w:rPr>
-        <w:t>"Combinazione [Canale Distributivo + Materiale]"</w:t>
-      </w:r>
-      <w:r>
-        <w:t>.</w:t>
-      </w:r>
-    </w:p>
-    <w:p>
-      <w:pPr>
-        <w:numPr>
-          <w:ilvl w:val="0"/>
-          <w:numId w:val="15"/>
-        </w:numPr>
-      </w:pPr>
-      <w:r>
-        <w:t xml:space="preserve">O una tabella semplice (A006): </w:t>
-      </w:r>
-      <w:r>
-        <w:rPr>
-          <w:i/>
-          <w:iCs/>
-        </w:rPr>
-        <w:t>"Solo [Materiale]"</w:t>
-      </w:r>
-      <w:r>
-        <w:t xml:space="preserve"> (che rappresenta il </w:t>
-      </w:r>
-      <w:r>
-        <w:rPr>
-          <w:b/>
-          <w:bCs/>
-        </w:rPr>
-        <w:t>Prezzo Base</w:t>
-      </w:r>
-      <w:r>
-        <w:t>).</w:t>
-      </w:r>
-    </w:p>
-    <w:p>
-      <w:r>
-        <w:t xml:space="preserve">Tutte queste tabelle salvano poi i loro valori monetari nella tabella regina dei prezzi: la tabella </w:t>
-      </w:r>
-      <w:r>
-        <w:rPr>
-          <w:b/>
-          <w:bCs/>
-        </w:rPr>
-        <w:t>KONP</w:t>
-      </w:r>
-      <w:r>
-        <w:t>.</w:t>
-      </w:r>
-    </w:p>
-    <w:p>
-      <w:pPr>
-        <w:pStyle w:val="Heading2"/>
+        <w:pStyle w:val="Titolo2"/>
       </w:pPr>
       <w:r>
         <w:t>Sap – sezione prodotto – lato UX</w:t>
@@ -2819,7 +3208,7 @@
     </w:p>
     <w:p>
       <w:pPr>
-        <w:pStyle w:val="Heading1"/>
+        <w:pStyle w:val="Titolo1"/>
         <w:tabs>
           <w:tab w:val="left" w:pos="2063"/>
         </w:tabs>
@@ -2842,7 +3231,7 @@
     </w:p>
     <w:p>
       <w:pPr>
-        <w:pStyle w:val="Heading2"/>
+        <w:pStyle w:val="Titolo2"/>
       </w:pPr>
       <w:r>
         <w:t>Sezione prodotto – lato UX</w:t>
@@ -3043,7 +3432,7 @@
     </w:p>
     <w:p>
       <w:pPr>
-        <w:pStyle w:val="Heading2"/>
+        <w:pStyle w:val="Titolo2"/>
       </w:pPr>
       <w:r>
         <w:t>Sezione prodotto – lato DB</w:t>
@@ -3278,7 +3667,7 @@
     </w:p>
     <w:p>
       <w:pPr>
-        <w:pStyle w:val="Heading2"/>
+        <w:pStyle w:val="Titolo2"/>
       </w:pPr>
       <w:r>
         <w:t>Sezione Listini – Lato UX</w:t>
@@ -3286,7 +3675,7 @@
     </w:p>
     <w:p>
       <w:pPr>
-        <w:pStyle w:val="Heading3"/>
+        <w:pStyle w:val="Titolo3"/>
       </w:pPr>
       <w:r>
         <w:t>Listini di vendita</w:t>
@@ -3373,38 +3762,115 @@
     </w:p>
     <w:p>
       <w:pPr>
-        <w:pStyle w:val="Heading3"/>
-      </w:pPr>
-      <w:r>
-        <w:t>Listini di acquisto</w:t>
-      </w:r>
-    </w:p>
-    <w:p>
+        <w:pStyle w:val="Titolo3"/>
+      </w:pPr>
+      <w:r>
+        <w:t>C'è un listino "Prezzi Base" nella sezione Listini?</w:t>
+      </w:r>
+    </w:p>
+    <w:p>
+      <w:r>
+        <w:t xml:space="preserve">Di default Odoo crea un listino chiamato </w:t>
+      </w:r>
       <w:r>
         <w:rPr>
           <w:b/>
           <w:bCs/>
         </w:rPr>
-        <w:t>Sezione Fornitori (Vendors):</w:t>
-      </w:r>
-      <w:r>
-        <w:t xml:space="preserve"> Nel tab </w:t>
+        <w:t>Public Pricelist (Listino Pubblico)</w:t>
+      </w:r>
+      <w:r>
+        <w:t>.</w:t>
+      </w:r>
+    </w:p>
+    <w:p>
+      <w:pPr>
+        <w:numPr>
+          <w:ilvl w:val="0"/>
+          <w:numId w:val="25"/>
+        </w:numPr>
+      </w:pPr>
+      <w:r>
+        <w:t xml:space="preserve">Questo listino è impostato con una regola nativa: </w:t>
       </w:r>
       <w:r>
         <w:rPr>
           <w:i/>
           <w:iCs/>
         </w:rPr>
-        <w:t>Purchase</w:t>
-      </w:r>
-      <w:r>
-        <w:t xml:space="preserve">, l'utente vede la tabella </w:t>
-      </w:r>
+        <w:t>"Prendi il campo Sales Price (Prezzo Base) dalla scheda del prodotto e applica 0% di sconto"</w:t>
+      </w:r>
+      <w:r>
+        <w:t>.</w:t>
+      </w:r>
+    </w:p>
+    <w:p>
+      <w:pPr>
+        <w:numPr>
+          <w:ilvl w:val="0"/>
+          <w:numId w:val="25"/>
+        </w:numPr>
+      </w:pPr>
+      <w:r>
+        <w:t xml:space="preserve">Se entri nella sezione </w:t>
+      </w:r>
+      <w:r>
+        <w:rPr>
+          <w:i/>
+          <w:iCs/>
+        </w:rPr>
+        <w:t>Vendite &gt; Listini Prezzi</w:t>
+      </w:r>
+      <w:r>
+        <w:t xml:space="preserve"> e apri il Public Pricelist, vedi l'elenco di tutti i prodotti con il loro prezzo base.</w:t>
+      </w:r>
+    </w:p>
+    <w:p>
       <w:r>
         <w:rPr>
           <w:b/>
           <w:bCs/>
         </w:rPr>
+        <w:t>È modificabile da lì?</w:t>
+      </w:r>
+      <w:r>
+        <w:t xml:space="preserve"> Se modifichi il prezzo in questa vista, Odoo va ad aggiornare direttamente il campo list_price sulla scheda del prodotto (perché sono sincronizzati).</w:t>
+      </w:r>
+    </w:p>
+    <w:p>
+      <w:pPr>
+        <w:pStyle w:val="Titolo3"/>
+      </w:pPr>
+      <w:r>
+        <w:t>Listini di acquisto</w:t>
+      </w:r>
+    </w:p>
+    <w:p>
+      <w:r>
+        <w:rPr>
+          <w:b/>
+          <w:bCs/>
+        </w:rPr>
+        <w:t>Sezione Fornitori (Vendors):</w:t>
+      </w:r>
+      <w:r>
+        <w:t xml:space="preserve"> Nel tab </w:t>
+      </w:r>
+      <w:r>
+        <w:rPr>
+          <w:i/>
+          <w:iCs/>
+        </w:rPr>
+        <w:t>Purchase</w:t>
+      </w:r>
+      <w:r>
+        <w:t xml:space="preserve">, l'utente vede la tabella </w:t>
+      </w:r>
+      <w:r>
+        <w:rPr>
+          <w:b/>
+          <w:bCs/>
+        </w:rPr>
         <w:t>Vendors</w:t>
       </w:r>
       <w:r>
@@ -3513,9 +3979,10 @@
     </w:p>
     <w:p>
       <w:pPr>
-        <w:pStyle w:val="Heading1"/>
-      </w:pPr>
-      <w:r>
+        <w:pStyle w:val="Titolo1"/>
+      </w:pPr>
+      <w:r>
+        <w:lastRenderedPageBreak/>
         <w:t>Dynamics 365</w:t>
       </w:r>
     </w:p>
@@ -3536,7 +4003,7 @@
     </w:p>
     <w:p>
       <w:pPr>
-        <w:pStyle w:val="Heading2"/>
+        <w:pStyle w:val="Titolo2"/>
       </w:pPr>
       <w:r>
         <w:t>Sezione Prodotto (“item card”) – Lato UX</w:t>
@@ -3605,7 +4072,6 @@
     </w:p>
     <w:p>
       <w:r>
-        <w:lastRenderedPageBreak/>
         <w:t xml:space="preserve">Per vedere gli altri prezzi, in cima c'è un menu di navigazione chiamato </w:t>
       </w:r>
       <w:r>
@@ -3759,7 +4225,7 @@
     </w:p>
     <w:p>
       <w:pPr>
-        <w:pStyle w:val="Heading2"/>
+        <w:pStyle w:val="Titolo2"/>
       </w:pPr>
       <w:r>
         <w:t>Sezione Prodotto (“item card”) – Lato DB</w:t>
@@ -3882,6 +4348,7 @@
         </w:numPr>
       </w:pPr>
       <w:r>
+        <w:lastRenderedPageBreak/>
         <w:t>Source No.: "ESTERO"</w:t>
       </w:r>
     </w:p>
@@ -3984,13 +4451,12 @@
         </w:numPr>
       </w:pPr>
       <w:r>
-        <w:lastRenderedPageBreak/>
         <w:t>Ending Date: 2026-12-31</w:t>
       </w:r>
     </w:p>
     <w:p>
       <w:pPr>
-        <w:pStyle w:val="Heading2"/>
+        <w:pStyle w:val="Titolo2"/>
       </w:pPr>
       <w:r>
         <w:t>Dynamics 365 - Sezione Listini – Lato UX</w:t>
@@ -4034,9 +4500,144 @@
     </w:p>
     <w:p>
       <w:pPr>
-        <w:pStyle w:val="Heading1"/>
-      </w:pPr>
-      <w:r>
+        <w:pStyle w:val="Titolo3"/>
+      </w:pPr>
+      <w:r>
+        <w:t>C'è un listino "Prezzi Base" nella sezione Listini?</w:t>
+      </w:r>
+    </w:p>
+    <w:p>
+      <w:r>
+        <w:t>No, o meglio: non direttamente.</w:t>
+      </w:r>
+    </w:p>
+    <w:p>
+      <w:r>
+        <w:rPr>
+          <w:b/>
+          <w:bCs/>
+        </w:rPr>
+        <w:t>Lato DB:</w:t>
+      </w:r>
+      <w:r>
+        <w:t xml:space="preserve"> </w:t>
+      </w:r>
+      <w:r>
+        <w:t>C</w:t>
+      </w:r>
+      <w:r>
+        <w:t xml:space="preserve">ome </w:t>
+      </w:r>
+      <w:r>
+        <w:t xml:space="preserve">in </w:t>
+      </w:r>
+      <w:r>
+        <w:t>Odoo: il prezzo base risiede direttamente sulla scheda dell'articolo</w:t>
+      </w:r>
+      <w:r>
+        <w:t>/prodotto</w:t>
+      </w:r>
+      <w:r>
+        <w:t xml:space="preserve"> (campo Item."Unit Price").</w:t>
+      </w:r>
+    </w:p>
+    <w:p>
+      <w:r>
+        <w:rPr>
+          <w:b/>
+          <w:bCs/>
+        </w:rPr>
+        <w:t>A cosa serve</w:t>
+      </w:r>
+      <w:r>
+        <w:rPr>
+          <w:b/>
+          <w:bCs/>
+        </w:rPr>
+        <w:t>?</w:t>
+      </w:r>
+      <w:r>
+        <w:t xml:space="preserve"> Se vendi un prodotto a un cliente senza alcun listino associato, Business Central </w:t>
+      </w:r>
+      <w:r>
+        <w:rPr>
+          <w:b/>
+          <w:bCs/>
+        </w:rPr>
+        <w:t>usa direttamente il Unit Price della scheda articolo</w:t>
+      </w:r>
+      <w:r>
+        <w:t xml:space="preserve"> come fallback finale.</w:t>
+      </w:r>
+    </w:p>
+    <w:p>
+      <w:r>
+        <w:rPr>
+          <w:b/>
+          <w:bCs/>
+        </w:rPr>
+        <w:t>Si posson</w:t>
+      </w:r>
+      <w:r>
+        <w:rPr>
+          <w:b/>
+          <w:bCs/>
+        </w:rPr>
+        <w:t>o vedere nella sezione listini?</w:t>
+      </w:r>
+      <w:r>
+        <w:t xml:space="preserve"> </w:t>
+      </w:r>
+      <w:r>
+        <w:t xml:space="preserve">Non direttamente. </w:t>
+      </w:r>
+      <w:r>
+        <w:t>Per veder</w:t>
+      </w:r>
+      <w:r>
+        <w:t>e l’insieme dei prezzi base</w:t>
+      </w:r>
+      <w:r>
+        <w:t xml:space="preserve"> nella sezione "Listini Prezzi",</w:t>
+      </w:r>
+      <w:r>
+        <w:t xml:space="preserve"> bisogna usare un trucco: creare </w:t>
+      </w:r>
+      <w:r>
+        <w:t xml:space="preserve">un listino ufficiale chiamato </w:t>
+      </w:r>
+      <w:r>
+        <w:rPr>
+          <w:i/>
+          <w:iCs/>
+        </w:rPr>
+        <w:t>Listino Base</w:t>
+      </w:r>
+      <w:r>
+        <w:t xml:space="preserve"> con applicazione </w:t>
+      </w:r>
+      <w:r>
+        <w:rPr>
+          <w:i/>
+          <w:iCs/>
+        </w:rPr>
+        <w:t>"Tutti i Clienti"</w:t>
+      </w:r>
+      <w:r>
+        <w:t>. Business Central offre una funzione automatica (Suggest Lines) che popola questo listino copiando a specchio i prezzi presi dalle schede articolo.</w:t>
+      </w:r>
+    </w:p>
+    <w:p>
+      <w:r>
+        <w:br w:type="page"/>
+      </w:r>
+    </w:p>
+    <w:p>
+      <w:pPr>
+        <w:pStyle w:val="Titolo1"/>
+      </w:pPr>
+      <w:r>
+        <w:lastRenderedPageBreak/>
         <w:t>SINTESI</w:t>
       </w:r>
     </w:p>
@@ -4044,10 +4645,128 @@
       <w:r>
         <w:t>Per i prezzi e i listini direi di ignorare quello che fa SAP (eccessivamente complicato) e concentrarsi su Netsuite, Odoo e Dynamics</w:t>
       </w:r>
-    </w:p>
-    <w:p>
-      <w:pPr>
-        <w:pStyle w:val="ListParagraph"/>
+      <w:r>
+        <w:t>.</w:t>
+      </w:r>
+    </w:p>
+    <w:p>
+      <w:r>
+        <w:t>Ecco il riepilogo</w:t>
+      </w:r>
+    </w:p>
+    <w:p>
+      <w:pPr>
+        <w:pStyle w:val="Paragrafoelenco"/>
+        <w:numPr>
+          <w:ilvl w:val="0"/>
+          <w:numId w:val="24"/>
+        </w:numPr>
+      </w:pPr>
+      <w:r>
+        <w:t>In NetSuite i prezzi base sono un listino speciale</w:t>
+      </w:r>
+      <w:r>
+        <w:t xml:space="preserve"> id hard coded=1</w:t>
+      </w:r>
+    </w:p>
+    <w:p>
+      <w:pPr>
+        <w:pStyle w:val="Paragrafoelenco"/>
+        <w:numPr>
+          <w:ilvl w:val="0"/>
+          <w:numId w:val="24"/>
+        </w:numPr>
+      </w:pPr>
+      <w:r>
+        <w:t>In Odoo e Dynamics, p</w:t>
+      </w:r>
+      <w:r>
+        <w:t>rezzo base e costo base appartengono al singolo prodotto, e sono quindi campi della tabella prodotto</w:t>
+      </w:r>
+    </w:p>
+    <w:p>
+      <w:pPr>
+        <w:pStyle w:val="Paragrafoelenco"/>
+        <w:numPr>
+          <w:ilvl w:val="1"/>
+          <w:numId w:val="24"/>
+        </w:numPr>
+      </w:pPr>
+      <w:r>
+        <w:t>Il costo base può essere inserito manualmente o calcolato come media dei costi passati</w:t>
+      </w:r>
+    </w:p>
+    <w:p>
+      <w:pPr>
+        <w:pStyle w:val="Paragrafoelenco"/>
+        <w:numPr>
+          <w:ilvl w:val="0"/>
+          <w:numId w:val="24"/>
+        </w:numPr>
+      </w:pPr>
+      <w:r>
+        <w:t>I listini di acquisto e di vendita invece si appoggiano a tabelle apposta.</w:t>
+      </w:r>
+    </w:p>
+    <w:p>
+      <w:pPr>
+        <w:pStyle w:val="Paragrafoelenco"/>
+        <w:numPr>
+          <w:ilvl w:val="1"/>
+          <w:numId w:val="24"/>
+        </w:numPr>
+      </w:pPr>
+      <w:r>
+        <w:t>In quasi tutti ci sono sia listini con prezzi inseriti manualmente che listini che calcolano in automatico una riduzione o una maggiorazione % sul prezzo base</w:t>
+      </w:r>
+    </w:p>
+    <w:p>
+      <w:pPr>
+        <w:pStyle w:val="Paragrafoelenco"/>
+        <w:numPr>
+          <w:ilvl w:val="0"/>
+          <w:numId w:val="24"/>
+        </w:numPr>
+      </w:pPr>
+      <w:r>
+        <w:t>Alcuni hanno effettivamente una vista prodotto-centrica dei prezzi accessibile dalla scheda prodotto</w:t>
+      </w:r>
+    </w:p>
+    <w:p>
+      <w:pPr>
+        <w:pStyle w:val="Paragrafoelenco"/>
+        <w:numPr>
+          <w:ilvl w:val="0"/>
+          <w:numId w:val="24"/>
+        </w:numPr>
+      </w:pPr>
+      <w:r>
+        <w:t>Nei lisini si pu</w:t>
+      </w:r>
+    </w:p>
+    <w:p>
+      <w:pPr>
+        <w:pStyle w:val="Paragrafoelenco"/>
+        <w:numPr>
+          <w:ilvl w:val="0"/>
+          <w:numId w:val="24"/>
+        </w:numPr>
+      </w:pPr>
+      <w:r>
+        <w:t>In generale, la possibilità di avere anche una vista prodotto-centrica è considerata una scelta di UX sensata</w:t>
+      </w:r>
+    </w:p>
+    <w:p>
+      <w:pPr>
+        <w:ind w:left="360"/>
+      </w:pPr>
+      <w:r>
+        <w:t xml:space="preserve">Quindi </w:t>
+      </w:r>
+    </w:p>
+    <w:p>
+      <w:pPr>
+        <w:pStyle w:val="Paragrafoelenco"/>
         <w:numPr>
           <w:ilvl w:val="0"/>
           <w:numId w:val="18"/>
@@ -4066,7 +4785,7 @@
     </w:p>
     <w:p>
       <w:pPr>
-        <w:pStyle w:val="ListParagraph"/>
+        <w:pStyle w:val="Paragrafoelenco"/>
         <w:numPr>
           <w:ilvl w:val="0"/>
           <w:numId w:val="18"/>
@@ -4099,7 +4818,7 @@
     </w:p>
     <w:p>
       <w:pPr>
-        <w:pStyle w:val="ListParagraph"/>
+        <w:pStyle w:val="Paragrafoelenco"/>
         <w:numPr>
           <w:ilvl w:val="0"/>
           <w:numId w:val="18"/>
@@ -4111,7 +4830,7 @@
     </w:p>
     <w:p>
       <w:pPr>
-        <w:pStyle w:val="ListParagraph"/>
+        <w:pStyle w:val="Paragrafoelenco"/>
         <w:numPr>
           <w:ilvl w:val="0"/>
           <w:numId w:val="18"/>
@@ -4123,340 +4842,407 @@
     </w:p>
     <w:p>
       <w:pPr>
-        <w:pStyle w:val="Heading2"/>
+        <w:pStyle w:val="Titolo2"/>
       </w:pPr>
       <w:r>
         <w:t>Suggerimenti per allineamento a best in class</w:t>
       </w:r>
     </w:p>
     <w:p>
-      <w:r>
-        <w:t>Una soluzione potrebbe essere il</w:t>
-      </w:r>
-      <w:r>
-        <w:t xml:space="preserve"> pattern Odoo/Dynamics adattato al </w:t>
-      </w:r>
-      <w:r>
-        <w:t>n</w:t>
-      </w:r>
-      <w:r>
-        <w:t>ostro caso:</w:t>
-      </w:r>
-    </w:p>
-    <w:p>
-      <w:pPr>
+      <w:pPr>
+        <w:pStyle w:val="Titolo3"/>
+      </w:pPr>
+      <w:r>
+        <w:t>Prezzi vendita</w:t>
+      </w:r>
+    </w:p>
+    <w:p>
+      <w:pPr>
+        <w:pStyle w:val="Paragrafoelenco"/>
         <w:numPr>
           <w:ilvl w:val="0"/>
-          <w:numId w:val="19"/>
-        </w:numPr>
-      </w:pPr>
-      <w:r>
-        <w:t>prezzo_vendita_base diventa una colonna diretta su PRODOTTO (non più una riga nella tabella dei prezzi con id_listino = NULL).</w:t>
-      </w:r>
-    </w:p>
-    <w:p>
-      <w:pPr>
+          <w:numId w:val="18"/>
+        </w:numPr>
+      </w:pPr>
+      <w:r>
+        <w:t xml:space="preserve">Per la gestione DB dei prezzi </w:t>
+      </w:r>
+      <w:r>
+        <w:t xml:space="preserve">base </w:t>
+      </w:r>
+      <w:r>
+        <w:t>di vendita direi di fare ESATTAMENTE come NetSuite. Id hardcoded 1, con tutte le proprietà del listino speciale prezzi base di netsuite (non posso “eleggere” un altro id come listino base, l’id è sempre 1, il listino non eliminabile)</w:t>
+      </w:r>
+    </w:p>
+    <w:p>
+      <w:pPr>
+        <w:pStyle w:val="Paragrafoelenco"/>
         <w:numPr>
           <w:ilvl w:val="0"/>
-          <w:numId w:val="19"/>
-        </w:numPr>
-      </w:pPr>
-      <w:r>
-        <w:t xml:space="preserve">PREZZO_LISTINO_VENDITA resta una tabella a parte, ma ora id_listino è </w:t>
-      </w:r>
-      <w:r>
+          <w:numId w:val="18"/>
+        </w:numPr>
+      </w:pPr>
+      <w:r>
+        <w:t>Per la gestione dei listini normali, lato DB non cambia assolutamente niente</w:t>
+      </w:r>
+    </w:p>
+    <w:p>
+      <w:pPr>
+        <w:pStyle w:val="Paragrafoelenco"/>
+        <w:numPr>
+          <w:ilvl w:val="0"/>
+          <w:numId w:val="18"/>
+        </w:numPr>
+      </w:pPr>
+      <w:r>
+        <w:t>Capire bene la tab Prezzi vendita in scheda prodotto</w:t>
+      </w:r>
+    </w:p>
+    <w:p>
+      <w:pPr>
+        <w:pStyle w:val="Paragrafoelenco"/>
+        <w:numPr>
+          <w:ilvl w:val="1"/>
+          <w:numId w:val="18"/>
+        </w:numPr>
+      </w:pPr>
+      <w:r>
+        <w:t>Dove finiscono i prezzi?</w:t>
+      </w:r>
+    </w:p>
+    <w:p>
+      <w:pPr>
+        <w:pStyle w:val="Paragrafoelenco"/>
+        <w:numPr>
+          <w:ilvl w:val="1"/>
+          <w:numId w:val="18"/>
+        </w:numPr>
+      </w:pPr>
+      <w:r>
+        <w:t>Posso creare listini da lì? Gli posso dare un nome?</w:t>
+      </w:r>
+    </w:p>
+    <w:p>
+      <w:pPr>
+        <w:pStyle w:val="Titolo3"/>
+      </w:pPr>
+      <w:r>
+        <w:t>Costi di acquisto</w:t>
+      </w:r>
+    </w:p>
+    <w:p>
+      <w:pPr>
+        <w:pStyle w:val="Paragrafoelenco"/>
+        <w:numPr>
+          <w:ilvl w:val="0"/>
+          <w:numId w:val="18"/>
+        </w:numPr>
+      </w:pPr>
+      <w:r>
+        <w:t>Per i costi base, cosa fare? Anche qui un listino id=1? – DA DECIDERE</w:t>
+      </w:r>
+    </w:p>
+    <w:p>
+      <w:pPr>
+        <w:pStyle w:val="Paragrafoelenco"/>
+        <w:numPr>
+          <w:ilvl w:val="0"/>
+          <w:numId w:val="18"/>
+        </w:numPr>
+      </w:pPr>
+      <w:r>
+        <w:t>Capire bene la tab Prezzi vendita in scheda prodotto</w:t>
+      </w:r>
+    </w:p>
+    <w:p>
+      <w:pPr>
+        <w:pStyle w:val="Paragrafoelenco"/>
+        <w:numPr>
+          <w:ilvl w:val="1"/>
+          <w:numId w:val="18"/>
+        </w:numPr>
+      </w:pPr>
+      <w:r>
+        <w:t>Dove finiscono i prezzi?</w:t>
+      </w:r>
+    </w:p>
+    <w:p>
+      <w:pPr>
+        <w:pStyle w:val="Paragrafoelenco"/>
+        <w:numPr>
+          <w:ilvl w:val="1"/>
+          <w:numId w:val="18"/>
+        </w:numPr>
+      </w:pPr>
+      <w:r>
+        <w:lastRenderedPageBreak/>
+        <w:t>Posso creare listini da lì? Gli posso dare un nome?</w:t>
+      </w:r>
+    </w:p>
+    <w:p/>
+    <w:p>
+      <w:pPr>
+        <w:pStyle w:val="Titolo2"/>
+      </w:pPr>
+      <w:r>
+        <w:t>C</w:t>
+      </w:r>
+      <w:r>
+        <w:t>ONSIDERAZIONI</w:t>
+      </w:r>
+    </w:p>
+    <w:p>
+      <w:pPr>
+        <w:pStyle w:val="Titolo2"/>
+      </w:pPr>
+      <w:r>
+        <w:t>I grandi ERP hanno una sezione prodotto con prezzo base separato dal listino, lato DB?</w:t>
+      </w:r>
+    </w:p>
+    <w:p>
+      <w:r>
+        <w:t>Sì</w:t>
+      </w:r>
+      <w:r>
+        <w:t xml:space="preserve">. </w:t>
+      </w:r>
+      <w:r>
+        <w:t xml:space="preserve">Odoo, </w:t>
+      </w:r>
+      <w:r>
+        <w:t xml:space="preserve">NetSuite, </w:t>
+      </w:r>
+      <w:r>
+        <w:t>Dynamics</w:t>
+      </w:r>
+      <w:r>
+        <w:t xml:space="preserve"> separano esplicitamente i prezzi base e costi base (campi della tabella prodotto) dai listini (che hanno tabelle dedicate). Sap usa</w:t>
+      </w:r>
+      <w:r>
+        <w:t xml:space="preserve"> tipo/condition type dedicato (SAP)</w:t>
+      </w:r>
+      <w:r>
+        <w:t>.</w:t>
+      </w:r>
+    </w:p>
+    <w:p>
+      <w:pPr>
+        <w:pStyle w:val="Titolo2"/>
+      </w:pPr>
+      <w:r>
+        <w:t>I prezzi base sono prezzi con un id_listino speciale</w:t>
+      </w:r>
+    </w:p>
+    <w:p>
+      <w:pPr>
         <w:rPr>
           <w:b/>
           <w:bCs/>
         </w:rPr>
-        <w:t>sempre valorizzato</w:t>
-      </w:r>
-      <w:r>
-        <w:t xml:space="preserve"> — niente più caso speciale da gestire nel codice.</w:t>
-      </w:r>
-    </w:p>
-    <w:p>
-      <w:pPr>
+      </w:pPr>
+      <w:r>
+        <w:t>Solo per Oracle NetSuite, che però è un best in class. Quindi va bene come soluzione anche per noi. Unico problema: fissiamo id hardcoded 1 (o zero).</w:t>
+      </w:r>
+    </w:p>
+    <w:p>
+      <w:pPr>
+        <w:pStyle w:val="Titolo2"/>
+      </w:pPr>
+      <w:r>
+        <w:t xml:space="preserve">Una vista </w:t>
+      </w:r>
+      <w:r>
+        <w:t>prodotto-centrica di tutti i prezzi</w:t>
+      </w:r>
+      <w:r>
+        <w:t xml:space="preserve">, nella sezione Prodotti, </w:t>
+      </w:r>
+      <w:r>
+        <w:t>ha senso?</w:t>
+      </w:r>
+    </w:p>
+    <w:p>
+      <w:r>
+        <w:t>Sì, ed è un pattern consolidato. NetSuite lo fa nativamente: sulla scheda articolo esiste una "Pricing Matrix/Sublist" che mostra in un'unica griglia tutte le combinazioni di price level, valuta e fascia di quantità per quel prodotto — viene spesso chiamata pricing matrix perché per un articolo possono esserci più prezzi determinati da uno o più price level e uno o più livelli di quantità, e questa vista offre grande flessibilità nel configurare e usare i vari prezzi per gli articoli venduti. È esattamente la vista "al volo" che avete in mente: prezzo base + tutti i listini per lo stesso SKU, uno accanto all'altro.</w:t>
+      </w:r>
+    </w:p>
+    <w:p>
+      <w:pPr>
+        <w:pStyle w:val="Titolo2"/>
+      </w:pPr>
+      <w:r>
+        <w:t>Nella sezione listini, mostrare anche il prezzo base?</w:t>
+      </w:r>
+    </w:p>
+    <w:p>
+      <w:r>
+        <w:t>In teoria sì. Nella pratica alcuni ERP lo fanno ma non come me lo aspetto</w:t>
+      </w:r>
+      <w:r>
+        <w:t>, cioè come valore mostrato da solo.</w:t>
+      </w:r>
+      <w:r>
+        <w:t xml:space="preserve"> </w:t>
+      </w:r>
+      <w:r>
+        <w:t xml:space="preserve">Viene invece sempre </w:t>
+      </w:r>
+      <w:r>
+        <w:t>usato come riferimento/confronto (es. per calcolare lo sconto implicito).</w:t>
+      </w:r>
+    </w:p>
+    <w:p>
+      <w:r>
+        <w:t xml:space="preserve">Ad esempio </w:t>
+      </w:r>
+      <w:r>
+        <w:t>Odoo mostra il margine/percentuale di sconto o aumento rispetto prezzo base</w:t>
+      </w:r>
+      <w:r>
+        <w:t>.</w:t>
+      </w:r>
+    </w:p>
+    <w:p>
+      <w:r>
+        <w:t>Per i veri listini un’idea potrebbe essere</w:t>
+      </w:r>
+      <w:r>
+        <w:t xml:space="preserve"> mostrare una colonna "prezzo base" (sola lettura) accanto al prezzo di listino, con eventualmente lo scostamento %.</w:t>
+      </w:r>
+    </w:p>
+    <w:p>
+      <w:pPr>
+        <w:pStyle w:val="Titolo2"/>
+      </w:pPr>
+      <w:r>
+        <w:t>SCOPO DELLE VISTE PREZZI NELLA SEZIONE PRODOTTO</w:t>
+      </w:r>
+    </w:p>
+    <w:p>
+      <w:r>
+        <w:t>Abbiamo stabilito che è giusto dare</w:t>
+      </w:r>
+      <w:r>
+        <w:t xml:space="preserve"> all'utente la possibilità di inserire dei prezzi anche nelle schede prodotto</w:t>
+      </w:r>
+      <w:r>
+        <w:t>. Questo</w:t>
+      </w:r>
+      <w:r>
+        <w:t xml:space="preserve"> per diversi motivi</w:t>
+      </w:r>
+      <w:r>
+        <w:t>:</w:t>
+      </w:r>
+    </w:p>
+    <w:p>
+      <w:pPr>
+        <w:pStyle w:val="Paragrafoelenco"/>
         <w:numPr>
           <w:ilvl w:val="0"/>
-          <w:numId w:val="19"/>
-        </w:numPr>
-      </w:pPr>
-      <w:r>
-        <w:t>Stessa logica lato acquisti: costo base per fornitore in COSTO_ACQUISTO (che già gestisce il multi-fornitore), e i listini fornitore in LISTINO_ACQUISTO collegati alla stessa tabella tramite un FK opzionale, oppure — se preferite tenere tutto un unico modello acquisti come già fate — lasciate COSTO_ACQUISTO.id_listino_acquisto nullable solo lì, visto che lì il caso d'uso "prezzo base per fornitore senza listino formale" è realmente il default operativo, non un'eccezione.</w:t>
-      </w:r>
-    </w:p>
-    <w:p>
-      <w:r>
-        <w:rPr>
-          <w:noProof/>
-        </w:rPr>
+          <w:numId w:val="18"/>
+        </w:numPr>
+      </w:pPr>
+      <w:r>
+        <w:t>Comodità dell'utente. Quando crea un prodotto da zero può impostare velocemente i prezzi direttamente dalla scheda</w:t>
+      </w:r>
+    </w:p>
+    <w:p>
+      <w:pPr>
+        <w:pStyle w:val="Paragrafoelenco"/>
+        <w:numPr>
+          <w:ilvl w:val="0"/>
+          <w:numId w:val="18"/>
+        </w:numPr>
+      </w:pPr>
+      <w:r>
         <w:lastRenderedPageBreak/>
-        <w:drawing>
-          <wp:inline distT="0" distB="0" distL="0" distR="0" wp14:anchorId="47C48172" wp14:editId="5CDE6B5C">
-            <wp:extent cx="6120130" cy="2585720"/>
-            <wp:effectExtent l="0" t="0" r="0" b="5080"/>
-            <wp:docPr id="1076165295" name="Immagine 1"/>
-            <wp:cNvGraphicFramePr>
-              <a:graphicFrameLocks xmlns:a="http://schemas.openxmlformats.org/drawingml/2006/main" noChangeAspect="1"/>
-            </wp:cNvGraphicFramePr>
-            <a:graphic xmlns:a="http://schemas.openxmlformats.org/drawingml/2006/main">
-              <a:graphicData uri="http://schemas.openxmlformats.org/drawingml/2006/picture">
-                <pic:pic xmlns:pic="http://schemas.openxmlformats.org/drawingml/2006/picture">
-                  <pic:nvPicPr>
-                    <pic:cNvPr id="1076165295" name=""/>
-                    <pic:cNvPicPr/>
-                  </pic:nvPicPr>
-                  <pic:blipFill>
-                    <a:blip r:embed="rId6"/>
-                    <a:stretch>
-                      <a:fillRect/>
-                    </a:stretch>
-                  </pic:blipFill>
-                  <pic:spPr>
-                    <a:xfrm>
-                      <a:off x="0" y="0"/>
-                      <a:ext cx="6120130" cy="2585720"/>
-                    </a:xfrm>
-                    <a:prstGeom prst="rect">
-                      <a:avLst/>
-                    </a:prstGeom>
-                  </pic:spPr>
-                </pic:pic>
-              </a:graphicData>
-            </a:graphic>
-          </wp:inline>
-        </w:drawing>
-      </w:r>
-    </w:p>
-    <w:p>
-      <w:pPr>
-        <w:pStyle w:val="Heading2"/>
-      </w:pPr>
-      <w:r>
-        <w:t>CONSIDERAZIONI</w:t>
-      </w:r>
-    </w:p>
-    <w:p>
-      <w:pPr>
-        <w:pStyle w:val="Heading2"/>
-      </w:pPr>
-      <w:r>
-        <w:t>I grandi ERP hanno una sezione prodotto con prezzo base separato dal listino, lato DB?</w:t>
-      </w:r>
-    </w:p>
-    <w:p>
-      <w:r>
-        <w:t>Sì</w:t>
-      </w:r>
-      <w:r>
-        <w:t xml:space="preserve">. </w:t>
-      </w:r>
-      <w:r>
-        <w:t xml:space="preserve">Odoo, </w:t>
-      </w:r>
-      <w:r>
-        <w:t xml:space="preserve">NetSuite, </w:t>
-      </w:r>
-      <w:r>
-        <w:t>Dynamics</w:t>
-      </w:r>
-      <w:r>
-        <w:t xml:space="preserve"> separano esplicitamente i prezzi base e costi base (campi della tabella prodotto) dai listini (che hanno tabelle dedicate). Sap usa</w:t>
-      </w:r>
-      <w:r>
-        <w:t xml:space="preserve"> tipo/condition type dedicato (SAP)</w:t>
-      </w:r>
-      <w:r>
-        <w:t>.</w:t>
-      </w:r>
-    </w:p>
-    <w:p>
-      <w:pPr>
-        <w:pStyle w:val="Heading2"/>
-      </w:pPr>
-      <w:r>
-        <w:t>I prezzi base sono prezzi con un id_listino speciale</w:t>
-      </w:r>
-    </w:p>
-    <w:p>
-      <w:r>
-        <w:t>No. Sono campi della tabella prodotto</w:t>
-      </w:r>
-    </w:p>
-    <w:p>
-      <w:pPr>
-        <w:rPr>
-          <w:b/>
-          <w:bCs/>
-        </w:rPr>
-      </w:pPr>
-      <w:commentRangeStart w:id="0"/>
-      <w:r>
-        <w:rPr>
-          <w:b/>
-          <w:bCs/>
-        </w:rPr>
-        <w:t>In nessun caso i prezzi base sono prezzi di listino con ID</w:t>
-      </w:r>
-      <w:r>
-        <w:rPr>
-          <w:b/>
-          <w:bCs/>
-        </w:rPr>
-        <w:t>_listino</w:t>
-      </w:r>
-      <w:r>
-        <w:rPr>
-          <w:b/>
-          <w:bCs/>
-        </w:rPr>
-        <w:t xml:space="preserve"> nullo.</w:t>
-      </w:r>
-      <w:commentRangeEnd w:id="0"/>
-      <w:r>
-        <w:rPr>
-          <w:rStyle w:val="CommentReference"/>
-          <w:b/>
-          <w:bCs/>
-          <w:sz w:val="24"/>
-          <w:szCs w:val="24"/>
-        </w:rPr>
-        <w:commentReference w:id="0"/>
-      </w:r>
-    </w:p>
-    <w:p>
-      <w:pPr>
-        <w:rPr>
-          <w:b/>
-          <w:bCs/>
-        </w:rPr>
-      </w:pPr>
-      <w:r>
-        <w:rPr>
-          <w:b/>
-          <w:bCs/>
-        </w:rPr>
-        <w:t xml:space="preserve">Il punto in comune tra </w:t>
-      </w:r>
-      <w:r>
-        <w:rPr>
-          <w:b/>
-          <w:bCs/>
-        </w:rPr>
-        <w:t>i vari ERP:</w:t>
-      </w:r>
-      <w:r>
-        <w:rPr>
-          <w:b/>
-          <w:bCs/>
-        </w:rPr>
-        <w:t xml:space="preserve"> il prezzo base è sempre un concetto di prima classe, distinto e sempre presente, non "il caso limite in cui manca il listino". Il </w:t>
-      </w:r>
-      <w:r>
-        <w:rPr>
-          <w:b/>
-          <w:bCs/>
-        </w:rPr>
-        <w:t>n</w:t>
-      </w:r>
-      <w:r>
-        <w:rPr>
-          <w:b/>
-          <w:bCs/>
-        </w:rPr>
-        <w:t xml:space="preserve">ostro </w:t>
-      </w:r>
-      <w:r>
-        <w:rPr>
-          <w:b/>
-          <w:bCs/>
-        </w:rPr>
-        <w:t xml:space="preserve">id_listino </w:t>
-      </w:r>
-      <w:r>
-        <w:rPr>
-          <w:b/>
-          <w:bCs/>
-        </w:rPr>
-        <w:t>null oggi funziona, ma nasconde semanticamente questa distinzione dentro un valore di assenza, il che rende più fragili le query (bisogna sempre ricordarsi il WHERE id_listino IS NULL) e più scomodo aggiungere in futuro attributi che si applicano solo al prezzo base (es. data di validità, motivazione revisione) senza sporcare la tabella dei listini.</w:t>
-      </w:r>
-    </w:p>
-    <w:p>
-      <w:pPr>
-        <w:pStyle w:val="Heading2"/>
-      </w:pPr>
-      <w:r>
-        <w:t xml:space="preserve">Una vista </w:t>
-      </w:r>
-      <w:r>
-        <w:t>prodotto-centrica di tutti i prezzi</w:t>
-      </w:r>
-      <w:r>
-        <w:t xml:space="preserve">, nella sezione Prodotti, </w:t>
-      </w:r>
-      <w:r>
-        <w:t>ha senso?</w:t>
-      </w:r>
-    </w:p>
-    <w:p>
-      <w:r>
-        <w:t>Sì, ed è un pattern consolidato. NetSuite lo fa nativamente: sulla scheda articolo esiste una "Pricing Matrix/Sublist" che mostra in un'unica griglia tutte le combinazioni di price level, valuta e fascia di quantità per quel prodotto — viene spesso chiamata pricing matrix perché per un articolo possono esserci più prezzi determinati da uno o più price level e uno o più livelli di quantità, e questa vista offre grande flessibilità nel configurare e usare i vari prezzi per gli articoli venduti. È esattamente la vista "al volo" che avete in mente: prezzo base + tutti i listini per lo stesso SKU, uno accanto all'altro.</w:t>
-      </w:r>
-    </w:p>
-    <w:p>
-      <w:pPr>
-        <w:pStyle w:val="Heading2"/>
-      </w:pPr>
-      <w:r>
-        <w:lastRenderedPageBreak/>
-        <w:t>Nella sezione listini, mostrare anche il prezzo base?</w:t>
-      </w:r>
-    </w:p>
-    <w:p>
-      <w:r>
-        <w:t>In teoria sì. Nella pratica alcuni ERP lo fanno ma non come me lo aspetto</w:t>
-      </w:r>
-      <w:r>
-        <w:t>, cioè come valore mostrato da solo.</w:t>
-      </w:r>
-      <w:r>
-        <w:t xml:space="preserve"> </w:t>
-      </w:r>
-      <w:r>
-        <w:t xml:space="preserve">Viene invece sempre </w:t>
-      </w:r>
-      <w:r>
-        <w:t>usato come riferimento/confronto (es. per calcolare lo sconto implicito).</w:t>
-      </w:r>
-    </w:p>
-    <w:p>
-      <w:r>
-        <w:t xml:space="preserve">Ad esempio </w:t>
-      </w:r>
-      <w:r>
-        <w:t>Odoo mostra il margine/percentuale di sconto o aumento rispetto prezzo base</w:t>
-      </w:r>
-      <w:r>
-        <w:t>.</w:t>
-      </w:r>
-    </w:p>
-    <w:p>
-      <w:r>
-        <w:t>Per i veri listini un’idea potrebbe essere</w:t>
-      </w:r>
-      <w:r>
-        <w:t xml:space="preserve"> mostrare una colonna "prezzo base" (sola lettura) accanto al prezzo di listino, con eventualmente lo scostamento %.</w:t>
-      </w:r>
-    </w:p>
-    <w:p>
-      <w:pPr>
-        <w:pStyle w:val="Heading2"/>
+        <w:t xml:space="preserve">La scheda prodotto è un modo molto comodo per vedere in un colpo solo TUTTI i prezzi di acquisto (o tutti i prezzi di vendita) di uno specifico prodotto. </w:t>
+      </w:r>
+      <w:r>
+        <w:t>È</w:t>
+      </w:r>
+      <w:r>
+        <w:t xml:space="preserve"> insomma una vista prodotto-centrica di prezzi vendita o costi di </w:t>
+      </w:r>
+      <w:r>
+        <w:t>acquisto</w:t>
+      </w:r>
+    </w:p>
+    <w:p>
+      <w:r>
+        <w:t>Quindi, nel concreto, su Quack ERP abbiamo due tab</w:t>
+      </w:r>
+    </w:p>
+    <w:p>
+      <w:pPr>
+        <w:pStyle w:val="Paragrafoelenco"/>
+        <w:numPr>
+          <w:ilvl w:val="0"/>
+          <w:numId w:val="18"/>
+        </w:numPr>
+      </w:pPr>
+      <w:r>
+        <w:t>una tab "Prezzi di Vendita &amp; Listini" in cui l'utente può inserire prezzi di vendita e i prezzi (minimi e massimi) di rivendita suggeriti.</w:t>
+      </w:r>
+    </w:p>
+    <w:p>
+      <w:pPr>
+        <w:pStyle w:val="Paragrafoelenco"/>
+        <w:numPr>
+          <w:ilvl w:val="1"/>
+          <w:numId w:val="18"/>
+        </w:numPr>
+      </w:pPr>
+      <w:r>
+        <w:t>La schermata RRP è un cassetto, la schermata dei prezzi di vendita è ispirata a NetSuite, con una griglia.</w:t>
+      </w:r>
+    </w:p>
+    <w:p>
+      <w:pPr>
+        <w:pStyle w:val="Paragrafoelenco"/>
+        <w:numPr>
+          <w:ilvl w:val="0"/>
+          <w:numId w:val="18"/>
+        </w:numPr>
+      </w:pPr>
+      <w:r>
+        <w:t>u</w:t>
+      </w:r>
+      <w:r>
+        <w:t>na tab "Costi d'Acquisto &amp; Fornitori" in cui l'utente può inserire i costi di acquisto per singolo fornitore. La schermata è ispirata a Odoo e Dynamics 365</w:t>
+      </w:r>
+    </w:p>
+    <w:p>
+      <w:pPr>
+        <w:pStyle w:val="Titolo2"/>
       </w:pPr>
       <w:r>
         <w:t>Domande</w:t>
       </w:r>
     </w:p>
+    <w:p>
+      <w:pPr>
+        <w:pStyle w:val="Paragrafoelenco"/>
+        <w:numPr>
+          <w:ilvl w:val="0"/>
+          <w:numId w:val="18"/>
+        </w:numPr>
+      </w:pPr>
+      <w:r>
+        <w:t>ha senso che le due tab abbiamo UX diverse ispirate a ERP diversi (griglia per costi acquisto, Odoo per prezzi di vendita)?</w:t>
+      </w:r>
+    </w:p>
+    <w:p>
+      <w:pPr>
+        <w:pStyle w:val="Paragrafoelenco"/>
+        <w:numPr>
+          <w:ilvl w:val="0"/>
+          <w:numId w:val="18"/>
+        </w:numPr>
+      </w:pPr>
+    </w:p>
+    <w:p/>
     <w:sectPr>
       <w:pgSz w:w="11906" w:h="16838"/>
       <w:pgMar w:top="1417" w:right="1134" w:bottom="1134" w:left="1134" w:header="708" w:footer="708" w:gutter="0"/>
@@ -4467,48 +5253,233 @@
 </w:document>
 </file>
 
-<file path=word/comments.xml><?xml version="1.0" encoding="utf-8"?>
-<w:comments xmlns:wpc="http://schemas.microsoft.com/office/word/2010/wordprocessingCanvas" xmlns:cx="http://schemas.microsoft.com/office/drawing/2014/chartex" xmlns:cx1="http://schemas.microsoft.com/office/drawing/2015/9/8/chartex" xmlns:cx2="http://schemas.microsoft.com/office/drawing/2015/10/21/chartex" xmlns:cx3="http://schemas.microsoft.com/office/drawing/2016/5/9/chartex" xmlns:cx4="http://schemas.microsoft.com/office/drawing/2016/5/10/chartex" xmlns:cx5="http://schemas.microsoft.com/office/drawing/2016/5/11/chartex" xmlns:cx6="http://schemas.microsoft.com/office/drawing/2016/5/12/chartex" xmlns:cx7="http://schemas.microsoft.com/office/drawing/2016/5/13/chartex" xmlns:cx8="http://schemas.microsoft.com/office/drawing/2016/5/14/chartex" xmlns:mc="http://schemas.openxmlformats.org/markup-compatibility/2006" xmlns:aink="http://schemas.microsoft.com/office/drawing/2016/ink" xmlns:am3d="http://schemas.microsoft.com/office/drawing/2017/model3d" xmlns:o="urn:schemas-microsoft-com:office:office" xmlns:oel="http://schemas.microsoft.com/office/2019/extlst" xmlns:r="http://schemas.openxmlformats.org/officeDocument/2006/relationships" xmlns:m="http://schemas.openxmlformats.org/officeDocument/2006/math" xmlns:v="urn:schemas-microsoft-com:vml" xmlns:wp14="http://schemas.microsoft.com/office/word/2010/wordprocessingDrawing" xmlns:wp="http://schemas.openxmlformats.org/drawingml/2006/wordprocessingDrawing" xmlns:w10="urn:schemas-microsoft-com:office:word" xmlns:w="http://schemas.openxmlformats.org/wordprocessingml/2006/main" xmlns:w14="http://schemas.microsoft.com/office/word/2010/wordml" xmlns:w15="http://schemas.microsoft.com/office/word/2012/wordml" xmlns:w16cei="http://schemas.microsoft.com/office/word/2026/wordml/cei" xmlns:w16cex="http://schemas.microsoft.com/office/word/2018/wordml/cex" xmlns:w16cid="http://schemas.microsoft.com/office/word/2016/wordml/cid" xmlns:w16="http://schemas.microsoft.com/office/word/2018/wordml" xmlns:w16du="http://schemas.microsoft.com/office/word/2023/wordml/word16du" xmlns:w16sdtdh="http://schemas.microsoft.com/office/word/2020/wordml/sdtdatahash" xmlns:w16sdtfl="http://schemas.microsoft.com/office/word/2024/wordml/sdtformatlock" xmlns:w16se="http://schemas.microsoft.com/office/word/2015/wordml/symex" xmlns:wpg="http://schemas.microsoft.com/office/word/2010/wordprocessingGroup" xmlns:wpi="http://schemas.microsoft.com/office/word/2010/wordprocessingInk" xmlns:wne="http://schemas.microsoft.com/office/word/2006/wordml" xmlns:wps="http://schemas.microsoft.com/office/word/2010/wordprocessingShape" mc:Ignorable="w14 w15 w16se w16cid w16 w16cex w16sdtdh w16sdtfl w16du wp14">
-  <w:comment w:id="0" w:author="Michel Papetti" w:date="2026-07-29T17:44:00Z" w:initials="MP">
-    <w:p>
-      <w:pPr>
-        <w:pStyle w:val="CommentText"/>
-      </w:pPr>
-      <w:r>
-        <w:rPr>
-          <w:rStyle w:val="CommentReference"/>
-        </w:rPr>
-        <w:annotationRef/>
-      </w:r>
-      <w:r>
-        <w:t>Vedi se questo potrebbe essere un problema o no</w:t>
-      </w:r>
-    </w:p>
-  </w:comment>
-</w:comments>
-</file>
-
-<file path=word/commentsExtended.xml><?xml version="1.0" encoding="utf-8"?>
-<w15:commentsEx xmlns:wpc="http://schemas.microsoft.com/office/word/2010/wordprocessingCanvas" xmlns:cx="http://schemas.microsoft.com/office/drawing/2014/chartex" xmlns:cx1="http://schemas.microsoft.com/office/drawing/2015/9/8/chartex" xmlns:cx2="http://schemas.microsoft.com/office/drawing/2015/10/21/chartex" xmlns:cx3="http://schemas.microsoft.com/office/drawing/2016/5/9/chartex" xmlns:cx4="http://schemas.microsoft.com/office/drawing/2016/5/10/chartex" xmlns:cx5="http://schemas.microsoft.com/office/drawing/2016/5/11/chartex" xmlns:cx6="http://schemas.microsoft.com/office/drawing/2016/5/12/chartex" xmlns:cx7="http://schemas.microsoft.com/office/drawing/2016/5/13/chartex" xmlns:cx8="http://schemas.microsoft.com/office/drawing/2016/5/14/chartex" xmlns:mc="http://schemas.openxmlformats.org/markup-compatibility/2006" xmlns:aink="http://schemas.microsoft.com/office/drawing/2016/ink" xmlns:am3d="http://schemas.microsoft.com/office/drawing/2017/model3d" xmlns:o="urn:schemas-microsoft-com:office:office" xmlns:oel="http://schemas.microsoft.com/office/2019/extlst" xmlns:r="http://schemas.openxmlformats.org/officeDocument/2006/relationships" xmlns:m="http://schemas.openxmlformats.org/officeDocument/2006/math" xmlns:v="urn:schemas-microsoft-com:vml" xmlns:wp14="http://schemas.microsoft.com/office/word/2010/wordprocessingDrawing" xmlns:wp="http://schemas.openxmlformats.org/drawingml/2006/wordprocessingDrawing" xmlns:w10="urn:schemas-microsoft-com:office:word" xmlns:w="http://schemas.openxmlformats.org/wordprocessingml/2006/main" xmlns:w14="http://schemas.microsoft.com/office/word/2010/wordml" xmlns:w15="http://schemas.microsoft.com/office/word/2012/wordml" xmlns:w16cei="http://schemas.microsoft.com/office/word/2026/wordml/cei" xmlns:w16cex="http://schemas.microsoft.com/office/word/2018/wordml/cex" xmlns:w16cid="http://schemas.microsoft.com/office/word/2016/wordml/cid" xmlns:w16="http://schemas.microsoft.com/office/word/2018/wordml" xmlns:w16du="http://schemas.microsoft.com/office/word/2023/wordml/word16du" xmlns:w16sdtdh="http://schemas.microsoft.com/office/word/2020/wordml/sdtdatahash" xmlns:w16sdtfl="http://schemas.microsoft.com/office/word/2024/wordml/sdtformatlock" xmlns:w16se="http://schemas.microsoft.com/office/word/2015/wordml/symex" xmlns:wpg="http://schemas.microsoft.com/office/word/2010/wordprocessingGroup" xmlns:wpi="http://schemas.microsoft.com/office/word/2010/wordprocessingInk" xmlns:wne="http://schemas.microsoft.com/office/word/2006/wordml" xmlns:wps="http://schemas.microsoft.com/office/word/2010/wordprocessingShape" mc:Ignorable="w14 w15 w16se w16cid w16 w16cex w16sdtdh w16sdtfl w16du wp14">
-  <w15:commentEx w15:paraId="65026BC1" w15:done="0"/>
-</w15:commentsEx>
-</file>
-
-<file path=word/commentsExtensible.xml><?xml version="1.0" encoding="utf-8"?>
-<w16cex:commentsExtensible xmlns:wpc="http://schemas.microsoft.com/office/word/2010/wordprocessingCanvas" xmlns:cx="http://schemas.microsoft.com/office/drawing/2014/chartex" xmlns:cx1="http://schemas.microsoft.com/office/drawing/2015/9/8/chartex" xmlns:cx2="http://schemas.microsoft.com/office/drawing/2015/10/21/chartex" xmlns:cx3="http://schemas.microsoft.com/office/drawing/2016/5/9/chartex" xmlns:cx4="http://schemas.microsoft.com/office/drawing/2016/5/10/chartex" xmlns:cx5="http://schemas.microsoft.com/office/drawing/2016/5/11/chartex" xmlns:cx6="http://schemas.microsoft.com/office/drawing/2016/5/12/chartex" xmlns:cx7="http://schemas.microsoft.com/office/drawing/2016/5/13/chartex" xmlns:cx8="http://schemas.microsoft.com/office/drawing/2016/5/14/chartex" xmlns:cr="http://schemas.microsoft.com/office/comments/2020/reactions" xmlns:mc="http://schemas.openxmlformats.org/markup-compatibility/2006" xmlns:aink="http://schemas.microsoft.com/office/drawing/2016/ink" xmlns:am3d="http://schemas.microsoft.com/office/drawing/2017/model3d" xmlns:o="urn:schemas-microsoft-com:office:office" xmlns:oel="http://schemas.microsoft.com/office/2019/extlst" xmlns:r="http://schemas.openxmlformats.org/officeDocument/2006/relationships" xmlns:m="http://schemas.openxmlformats.org/officeDocument/2006/math" xmlns:v="urn:schemas-microsoft-com:vml" xmlns:wp14="http://schemas.microsoft.com/office/word/2010/wordprocessingDrawing" xmlns:wp="http://schemas.openxmlformats.org/drawingml/2006/wordprocessingDrawing" xmlns:w10="urn:schemas-microsoft-com:office:word" xmlns:w="http://schemas.openxmlformats.org/wordprocessingml/2006/main" xmlns:w14="http://schemas.microsoft.com/office/word/2010/wordml" xmlns:w15="http://schemas.microsoft.com/office/word/2012/wordml" xmlns:w16cei="http://schemas.microsoft.com/office/word/2026/wordml/cei" xmlns:w16cex="http://schemas.microsoft.com/office/word/2018/wordml/cex" xmlns:w16cid="http://schemas.microsoft.com/office/word/2016/wordml/cid" xmlns:w16="http://schemas.microsoft.com/office/word/2018/wordml" xmlns:w16du="http://schemas.microsoft.com/office/word/2023/wordml/word16du" xmlns:w16sdtdh="http://schemas.microsoft.com/office/word/2020/wordml/sdtdatahash" xmlns:w16sdtfl="http://schemas.microsoft.com/office/word/2024/wordml/sdtformatlock" xmlns:w16se="http://schemas.microsoft.com/office/word/2015/wordml/symex" xmlns:wpg="http://schemas.microsoft.com/office/word/2010/wordprocessingGroup" xmlns:wpi="http://schemas.microsoft.com/office/word/2010/wordprocessingInk" xmlns:wne="http://schemas.microsoft.com/office/word/2006/wordml" xmlns:wps="http://schemas.microsoft.com/office/word/2010/wordprocessingShape" mc:Ignorable="w14 w15 w16se w16cid w16 w16cex w16sdtdh w16sdtfl cr w16du wp14">
-  <w16cex:commentExtensible w16cex:durableId="3A799865" w16cex:dateUtc="2026-07-29T15:44:00Z"/>
-</w16cex:commentsExtensible>
-</file>
-
-<file path=word/commentsIds.xml><?xml version="1.0" encoding="utf-8"?>
-<w16cid:commentsIds xmlns:wpc="http://schemas.microsoft.com/office/word/2010/wordprocessingCanvas" xmlns:cx="http://schemas.microsoft.com/office/drawing/2014/chartex" xmlns:cx1="http://schemas.microsoft.com/office/drawing/2015/9/8/chartex" xmlns:cx2="http://schemas.microsoft.com/office/drawing/2015/10/21/chartex" xmlns:cx3="http://schemas.microsoft.com/office/drawing/2016/5/9/chartex" xmlns:cx4="http://schemas.microsoft.com/office/drawing/2016/5/10/chartex" xmlns:cx5="http://schemas.microsoft.com/office/drawing/2016/5/11/chartex" xmlns:cx6="http://schemas.microsoft.com/office/drawing/2016/5/12/chartex" xmlns:cx7="http://schemas.microsoft.com/office/drawing/2016/5/13/chartex" xmlns:cx8="http://schemas.microsoft.com/office/drawing/2016/5/14/chartex" xmlns:mc="http://schemas.openxmlformats.org/markup-compatibility/2006" xmlns:aink="http://schemas.microsoft.com/office/drawing/2016/ink" xmlns:am3d="http://schemas.microsoft.com/office/drawing/2017/model3d" xmlns:o="urn:schemas-microsoft-com:office:office" xmlns:oel="http://schemas.microsoft.com/office/2019/extlst" xmlns:r="http://schemas.openxmlformats.org/officeDocument/2006/relationships" xmlns:m="http://schemas.openxmlformats.org/officeDocument/2006/math" xmlns:v="urn:schemas-microsoft-com:vml" xmlns:wp14="http://schemas.microsoft.com/office/word/2010/wordprocessingDrawing" xmlns:wp="http://schemas.openxmlformats.org/drawingml/2006/wordprocessingDrawing" xmlns:w10="urn:schemas-microsoft-com:office:word" xmlns:w="http://schemas.openxmlformats.org/wordprocessingml/2006/main" xmlns:w14="http://schemas.microsoft.com/office/word/2010/wordml" xmlns:w15="http://schemas.microsoft.com/office/word/2012/wordml" xmlns:w16cei="http://schemas.microsoft.com/office/word/2026/wordml/cei" xmlns:w16cex="http://schemas.microsoft.com/office/word/2018/wordml/cex" xmlns:w16cid="http://schemas.microsoft.com/office/word/2016/wordml/cid" xmlns:w16="http://schemas.microsoft.com/office/word/2018/wordml" xmlns:w16du="http://schemas.microsoft.com/office/word/2023/wordml/word16du" xmlns:w16sdtdh="http://schemas.microsoft.com/office/word/2020/wordml/sdtdatahash" xmlns:w16sdtfl="http://schemas.microsoft.com/office/word/2024/wordml/sdtformatlock" xmlns:w16se="http://schemas.microsoft.com/office/word/2015/wordml/symex" xmlns:wpg="http://schemas.microsoft.com/office/word/2010/wordprocessingGroup" xmlns:wpi="http://schemas.microsoft.com/office/word/2010/wordprocessingInk" xmlns:wne="http://schemas.microsoft.com/office/word/2006/wordml" xmlns:wps="http://schemas.microsoft.com/office/word/2010/wordprocessingShape" mc:Ignorable="w14 w15 w16se w16cid w16 w16cex w16sdtdh w16sdtfl w16du wp14">
-  <w16cid:commentId w16cid:paraId="65026BC1" w16cid:durableId="3A799865"/>
-</w16cid:commentsIds>
-</file>
-
 <file path=word/numbering.xml><?xml version="1.0" encoding="utf-8"?>
 <w:numbering xmlns:wpc="http://schemas.microsoft.com/office/word/2010/wordprocessingCanvas" xmlns:cx="http://schemas.microsoft.com/office/drawing/2014/chartex" xmlns:cx1="http://schemas.microsoft.com/office/drawing/2015/9/8/chartex" xmlns:cx2="http://schemas.microsoft.com/office/drawing/2015/10/21/chartex" xmlns:cx3="http://schemas.microsoft.com/office/drawing/2016/5/9/chartex" xmlns:cx4="http://schemas.microsoft.com/office/drawing/2016/5/10/chartex" xmlns:cx5="http://schemas.microsoft.com/office/drawing/2016/5/11/chartex" xmlns:cx6="http://schemas.microsoft.com/office/drawing/2016/5/12/chartex" xmlns:cx7="http://schemas.microsoft.com/office/drawing/2016/5/13/chartex" xmlns:cx8="http://schemas.microsoft.com/office/drawing/2016/5/14/chartex" xmlns:mc="http://schemas.openxmlformats.org/markup-compatibility/2006" xmlns:aink="http://schemas.microsoft.com/office/drawing/2016/ink" xmlns:am3d="http://schemas.microsoft.com/office/drawing/2017/model3d" xmlns:o="urn:schemas-microsoft-com:office:office" xmlns:oel="http://schemas.microsoft.com/office/2019/extlst" xmlns:r="http://schemas.openxmlformats.org/officeDocument/2006/relationships" xmlns:m="http://schemas.openxmlformats.org/officeDocument/2006/math" xmlns:v="urn:schemas-microsoft-com:vml" xmlns:wp14="http://schemas.microsoft.com/office/word/2010/wordprocessingDrawing" xmlns:wp="http://schemas.openxmlformats.org/drawingml/2006/wordprocessingDrawing" xmlns:w10="urn:schemas-microsoft-com:office:word" xmlns:w="http://schemas.openxmlformats.org/wordprocessingml/2006/main" xmlns:w14="http://schemas.microsoft.com/office/word/2010/wordml" xmlns:w15="http://schemas.microsoft.com/office/word/2012/wordml" xmlns:w16cei="http://schemas.microsoft.com/office/word/2026/wordml/cei" xmlns:w16cex="http://schemas.microsoft.com/office/word/2018/wordml/cex" xmlns:w16cid="http://schemas.microsoft.com/office/word/2016/wordml/cid" xmlns:w16="http://schemas.microsoft.com/office/word/2018/wordml" xmlns:w16du="http://schemas.microsoft.com/office/word/2023/wordml/word16du" xmlns:w16sdtdh="http://schemas.microsoft.com/office/word/2020/wordml/sdtdatahash" xmlns:w16sdtfl="http://schemas.microsoft.com/office/word/2024/wordml/sdtformatlock" xmlns:w16se="http://schemas.microsoft.com/office/word/2015/wordml/symex" xmlns:wpg="http://schemas.microsoft.com/office/word/2010/wordprocessingGroup" xmlns:wpi="http://schemas.microsoft.com/office/word/2010/wordprocessingInk" xmlns:wne="http://schemas.microsoft.com/office/word/2006/wordml" xmlns:wps="http://schemas.microsoft.com/office/word/2010/wordprocessingShape" mc:Ignorable="w14 w15 w16se w16cid w16 w16cex w16sdtdh w16sdtfl w16du wp14">
   <w:abstractNum w:abstractNumId="0" w15:restartNumberingAfterBreak="0">
+    <w:nsid w:val="03574F42"/>
+    <w:multiLevelType w:val="hybridMultilevel"/>
+    <w:tmpl w:val="48348B2E"/>
+    <w:lvl w:ilvl="0" w:tplc="CDA6DBC6">
+      <w:numFmt w:val="bullet"/>
+      <w:lvlText w:val="-"/>
+      <w:lvlJc w:val="left"/>
+      <w:pPr>
+        <w:ind w:left="720" w:hanging="360"/>
+      </w:pPr>
+      <w:rPr>
+        <w:rFonts w:ascii="Aptos" w:eastAsiaTheme="minorHAnsi" w:hAnsi="Aptos" w:cstheme="minorBidi" w:hint="default"/>
+      </w:rPr>
+    </w:lvl>
+    <w:lvl w:ilvl="1" w:tplc="04100003" w:tentative="1">
+      <w:start w:val="1"/>
+      <w:numFmt w:val="bullet"/>
+      <w:lvlText w:val="o"/>
+      <w:lvlJc w:val="left"/>
+      <w:pPr>
+        <w:ind w:left="1440" w:hanging="360"/>
+      </w:pPr>
+      <w:rPr>
+        <w:rFonts w:ascii="Courier New" w:hAnsi="Courier New" w:cs="Courier New" w:hint="default"/>
+      </w:rPr>
+    </w:lvl>
+    <w:lvl w:ilvl="2" w:tplc="04100005" w:tentative="1">
+      <w:start w:val="1"/>
+      <w:numFmt w:val="bullet"/>
+      <w:lvlText w:val=""/>
+      <w:lvlJc w:val="left"/>
+      <w:pPr>
+        <w:ind w:left="2160" w:hanging="360"/>
+      </w:pPr>
+      <w:rPr>
+        <w:rFonts w:ascii="Wingdings" w:hAnsi="Wingdings" w:hint="default"/>
+      </w:rPr>
+    </w:lvl>
+    <w:lvl w:ilvl="3" w:tplc="04100001" w:tentative="1">
+      <w:start w:val="1"/>
+      <w:numFmt w:val="bullet"/>
+      <w:lvlText w:val=""/>
+      <w:lvlJc w:val="left"/>
+      <w:pPr>
+        <w:ind w:left="2880" w:hanging="360"/>
+      </w:pPr>
+      <w:rPr>
+        <w:rFonts w:ascii="Symbol" w:hAnsi="Symbol" w:hint="default"/>
+      </w:rPr>
+    </w:lvl>
+    <w:lvl w:ilvl="4" w:tplc="04100003" w:tentative="1">
+      <w:start w:val="1"/>
+      <w:numFmt w:val="bullet"/>
+      <w:lvlText w:val="o"/>
+      <w:lvlJc w:val="left"/>
+      <w:pPr>
+        <w:ind w:left="3600" w:hanging="360"/>
+      </w:pPr>
+      <w:rPr>
+        <w:rFonts w:ascii="Courier New" w:hAnsi="Courier New" w:cs="Courier New" w:hint="default"/>
+      </w:rPr>
+    </w:lvl>
+    <w:lvl w:ilvl="5" w:tplc="04100005" w:tentative="1">
+      <w:start w:val="1"/>
+      <w:numFmt w:val="bullet"/>
+      <w:lvlText w:val=""/>
+      <w:lvlJc w:val="left"/>
+      <w:pPr>
+        <w:ind w:left="4320" w:hanging="360"/>
+      </w:pPr>
+      <w:rPr>
+        <w:rFonts w:ascii="Wingdings" w:hAnsi="Wingdings" w:hint="default"/>
+      </w:rPr>
+    </w:lvl>
+    <w:lvl w:ilvl="6" w:tplc="04100001" w:tentative="1">
+      <w:start w:val="1"/>
+      <w:numFmt w:val="bullet"/>
+      <w:lvlText w:val=""/>
+      <w:lvlJc w:val="left"/>
+      <w:pPr>
+        <w:ind w:left="5040" w:hanging="360"/>
+      </w:pPr>
+      <w:rPr>
+        <w:rFonts w:ascii="Symbol" w:hAnsi="Symbol" w:hint="default"/>
+      </w:rPr>
+    </w:lvl>
+    <w:lvl w:ilvl="7" w:tplc="04100003" w:tentative="1">
+      <w:start w:val="1"/>
+      <w:numFmt w:val="bullet"/>
+      <w:lvlText w:val="o"/>
+      <w:lvlJc w:val="left"/>
+      <w:pPr>
+        <w:ind w:left="5760" w:hanging="360"/>
+      </w:pPr>
+      <w:rPr>
+        <w:rFonts w:ascii="Courier New" w:hAnsi="Courier New" w:cs="Courier New" w:hint="default"/>
+      </w:rPr>
+    </w:lvl>
+    <w:lvl w:ilvl="8" w:tplc="04100005" w:tentative="1">
+      <w:start w:val="1"/>
+      <w:numFmt w:val="bullet"/>
+      <w:lvlText w:val=""/>
+      <w:lvlJc w:val="left"/>
+      <w:pPr>
+        <w:ind w:left="6480" w:hanging="360"/>
+      </w:pPr>
+      <w:rPr>
+        <w:rFonts w:ascii="Wingdings" w:hAnsi="Wingdings" w:hint="default"/>
+      </w:rPr>
+    </w:lvl>
+  </w:abstractNum>
+  <w:abstractNum w:abstractNumId="1" w15:restartNumberingAfterBreak="0">
+    <w:nsid w:val="096E6B2B"/>
+    <w:multiLevelType w:val="hybridMultilevel"/>
+    <w:tmpl w:val="DB562468"/>
+    <w:lvl w:ilvl="0" w:tplc="CDA6DBC6">
+      <w:numFmt w:val="bullet"/>
+      <w:lvlText w:val="-"/>
+      <w:lvlJc w:val="left"/>
+      <w:pPr>
+        <w:ind w:left="720" w:hanging="360"/>
+      </w:pPr>
+      <w:rPr>
+        <w:rFonts w:ascii="Aptos" w:eastAsiaTheme="minorHAnsi" w:hAnsi="Aptos" w:cstheme="minorBidi" w:hint="default"/>
+      </w:rPr>
+    </w:lvl>
+    <w:lvl w:ilvl="1" w:tplc="04100003" w:tentative="1">
+      <w:start w:val="1"/>
+      <w:numFmt w:val="bullet"/>
+      <w:lvlText w:val="o"/>
+      <w:lvlJc w:val="left"/>
+      <w:pPr>
+        <w:ind w:left="1440" w:hanging="360"/>
+      </w:pPr>
+      <w:rPr>
+        <w:rFonts w:ascii="Courier New" w:hAnsi="Courier New" w:cs="Courier New" w:hint="default"/>
+      </w:rPr>
+    </w:lvl>
+    <w:lvl w:ilvl="2" w:tplc="04100005" w:tentative="1">
+      <w:start w:val="1"/>
+      <w:numFmt w:val="bullet"/>
+      <w:lvlText w:val=""/>
+      <w:lvlJc w:val="left"/>
+      <w:pPr>
+        <w:ind w:left="2160" w:hanging="360"/>
+      </w:pPr>
+      <w:rPr>
+        <w:rFonts w:ascii="Wingdings" w:hAnsi="Wingdings" w:hint="default"/>
+      </w:rPr>
+    </w:lvl>
+    <w:lvl w:ilvl="3" w:tplc="04100001" w:tentative="1">
+      <w:start w:val="1"/>
+      <w:numFmt w:val="bullet"/>
+      <w:lvlText w:val=""/>
+      <w:lvlJc w:val="left"/>
+      <w:pPr>
+        <w:ind w:left="2880" w:hanging="360"/>
+      </w:pPr>
+      <w:rPr>
+        <w:rFonts w:ascii="Symbol" w:hAnsi="Symbol" w:hint="default"/>
+      </w:rPr>
+    </w:lvl>
+    <w:lvl w:ilvl="4" w:tplc="04100003" w:tentative="1">
+      <w:start w:val="1"/>
+      <w:numFmt w:val="bullet"/>
+      <w:lvlText w:val="o"/>
+      <w:lvlJc w:val="left"/>
+      <w:pPr>
+        <w:ind w:left="3600" w:hanging="360"/>
+      </w:pPr>
+      <w:rPr>
+        <w:rFonts w:ascii="Courier New" w:hAnsi="Courier New" w:cs="Courier New" w:hint="default"/>
+      </w:rPr>
+    </w:lvl>
+    <w:lvl w:ilvl="5" w:tplc="04100005" w:tentative="1">
+      <w:start w:val="1"/>
+      <w:numFmt w:val="bullet"/>
+      <w:lvlText w:val=""/>
+      <w:lvlJc w:val="left"/>
+      <w:pPr>
+        <w:ind w:left="4320" w:hanging="360"/>
+      </w:pPr>
+      <w:rPr>
+        <w:rFonts w:ascii="Wingdings" w:hAnsi="Wingdings" w:hint="default"/>
+      </w:rPr>
+    </w:lvl>
+    <w:lvl w:ilvl="6" w:tplc="04100001" w:tentative="1">
+      <w:start w:val="1"/>
+      <w:numFmt w:val="bullet"/>
+      <w:lvlText w:val=""/>
+      <w:lvlJc w:val="left"/>
+      <w:pPr>
+        <w:ind w:left="5040" w:hanging="360"/>
+      </w:pPr>
+      <w:rPr>
+        <w:rFonts w:ascii="Symbol" w:hAnsi="Symbol" w:hint="default"/>
+      </w:rPr>
+    </w:lvl>
+    <w:lvl w:ilvl="7" w:tplc="04100003" w:tentative="1">
+      <w:start w:val="1"/>
+      <w:numFmt w:val="bullet"/>
+      <w:lvlText w:val="o"/>
+      <w:lvlJc w:val="left"/>
+      <w:pPr>
+        <w:ind w:left="5760" w:hanging="360"/>
+      </w:pPr>
+      <w:rPr>
+        <w:rFonts w:ascii="Courier New" w:hAnsi="Courier New" w:cs="Courier New" w:hint="default"/>
+      </w:rPr>
+    </w:lvl>
+    <w:lvl w:ilvl="8" w:tplc="04100005" w:tentative="1">
+      <w:start w:val="1"/>
+      <w:numFmt w:val="bullet"/>
+      <w:lvlText w:val=""/>
+      <w:lvlJc w:val="left"/>
+      <w:pPr>
+        <w:ind w:left="6480" w:hanging="360"/>
+      </w:pPr>
+      <w:rPr>
+        <w:rFonts w:ascii="Wingdings" w:hAnsi="Wingdings" w:hint="default"/>
+      </w:rPr>
+    </w:lvl>
+  </w:abstractNum>
+  <w:abstractNum w:abstractNumId="2" w15:restartNumberingAfterBreak="0">
     <w:nsid w:val="0C431285"/>
     <w:multiLevelType w:val="multilevel"/>
     <w:tmpl w:val="7E225A0E"/>
@@ -4657,7 +5628,7 @@
       </w:rPr>
     </w:lvl>
   </w:abstractNum>
-  <w:abstractNum w:abstractNumId="1" w15:restartNumberingAfterBreak="0">
+  <w:abstractNum w:abstractNumId="3" w15:restartNumberingAfterBreak="0">
     <w:nsid w:val="0F9D1C6D"/>
     <w:multiLevelType w:val="multilevel"/>
     <w:tmpl w:val="081C9008"/>
@@ -4806,7 +5777,7 @@
       </w:rPr>
     </w:lvl>
   </w:abstractNum>
-  <w:abstractNum w:abstractNumId="2" w15:restartNumberingAfterBreak="0">
+  <w:abstractNum w:abstractNumId="4" w15:restartNumberingAfterBreak="0">
     <w:nsid w:val="14D86210"/>
     <w:multiLevelType w:val="multilevel"/>
     <w:tmpl w:val="80B651BE"/>
@@ -4955,7 +5926,7 @@
       </w:rPr>
     </w:lvl>
   </w:abstractNum>
-  <w:abstractNum w:abstractNumId="3" w15:restartNumberingAfterBreak="0">
+  <w:abstractNum w:abstractNumId="5" w15:restartNumberingAfterBreak="0">
     <w:nsid w:val="2011701E"/>
     <w:multiLevelType w:val="multilevel"/>
     <w:tmpl w:val="DF5C6CAE"/>
@@ -5104,7 +6075,7 @@
       </w:rPr>
     </w:lvl>
   </w:abstractNum>
-  <w:abstractNum w:abstractNumId="4" w15:restartNumberingAfterBreak="0">
+  <w:abstractNum w:abstractNumId="6" w15:restartNumberingAfterBreak="0">
     <w:nsid w:val="2F521244"/>
     <w:multiLevelType w:val="hybridMultilevel"/>
     <w:tmpl w:val="59186AC0"/>
@@ -5216,7 +6187,7 @@
       </w:rPr>
     </w:lvl>
   </w:abstractNum>
-  <w:abstractNum w:abstractNumId="5" w15:restartNumberingAfterBreak="0">
+  <w:abstractNum w:abstractNumId="7" w15:restartNumberingAfterBreak="0">
     <w:nsid w:val="32F22A8D"/>
     <w:multiLevelType w:val="multilevel"/>
     <w:tmpl w:val="081C9008"/>
@@ -5365,7 +6336,7 @@
       </w:rPr>
     </w:lvl>
   </w:abstractNum>
-  <w:abstractNum w:abstractNumId="6" w15:restartNumberingAfterBreak="0">
+  <w:abstractNum w:abstractNumId="8" w15:restartNumberingAfterBreak="0">
     <w:nsid w:val="3B7D5D45"/>
     <w:multiLevelType w:val="hybridMultilevel"/>
     <w:tmpl w:val="D3C24C6C"/>
@@ -5381,7 +6352,7 @@
         <w:rFonts w:ascii="Aptos" w:eastAsiaTheme="minorHAnsi" w:hAnsi="Aptos" w:cstheme="minorBidi" w:hint="default"/>
       </w:rPr>
     </w:lvl>
-    <w:lvl w:ilvl="1" w:tplc="04100003" w:tentative="1">
+    <w:lvl w:ilvl="1" w:tplc="04100003">
       <w:start w:val="1"/>
       <w:numFmt w:val="bullet"/>
       <w:lvlText w:val="o"/>
@@ -5478,7 +6449,7 @@
       </w:rPr>
     </w:lvl>
   </w:abstractNum>
-  <w:abstractNum w:abstractNumId="7" w15:restartNumberingAfterBreak="0">
+  <w:abstractNum w:abstractNumId="9" w15:restartNumberingAfterBreak="0">
     <w:nsid w:val="3D3E2F8F"/>
     <w:multiLevelType w:val="multilevel"/>
     <w:tmpl w:val="5EA0A7E2"/>
@@ -5627,7 +6598,7 @@
       </w:rPr>
     </w:lvl>
   </w:abstractNum>
-  <w:abstractNum w:abstractNumId="8" w15:restartNumberingAfterBreak="0">
+  <w:abstractNum w:abstractNumId="10" w15:restartNumberingAfterBreak="0">
     <w:nsid w:val="3E9D48CE"/>
     <w:multiLevelType w:val="multilevel"/>
     <w:tmpl w:val="B9546D86"/>
@@ -5740,7 +6711,156 @@
       </w:pPr>
     </w:lvl>
   </w:abstractNum>
-  <w:abstractNum w:abstractNumId="9" w15:restartNumberingAfterBreak="0">
+  <w:abstractNum w:abstractNumId="11" w15:restartNumberingAfterBreak="0">
+    <w:nsid w:val="419F427E"/>
+    <w:multiLevelType w:val="multilevel"/>
+    <w:tmpl w:val="35C08A36"/>
+    <w:lvl w:ilvl="0">
+      <w:start w:val="1"/>
+      <w:numFmt w:val="bullet"/>
+      <w:lvlText w:val=""/>
+      <w:lvlJc w:val="left"/>
+      <w:pPr>
+        <w:tabs>
+          <w:tab w:val="num" w:pos="720"/>
+        </w:tabs>
+        <w:ind w:left="720" w:hanging="360"/>
+      </w:pPr>
+      <w:rPr>
+        <w:rFonts w:ascii="Symbol" w:hAnsi="Symbol" w:hint="default"/>
+        <w:sz w:val="20"/>
+      </w:rPr>
+    </w:lvl>
+    <w:lvl w:ilvl="1" w:tentative="1">
+      <w:start w:val="1"/>
+      <w:numFmt w:val="bullet"/>
+      <w:lvlText w:val="o"/>
+      <w:lvlJc w:val="left"/>
+      <w:pPr>
+        <w:tabs>
+          <w:tab w:val="num" w:pos="1440"/>
+        </w:tabs>
+        <w:ind w:left="1440" w:hanging="360"/>
+      </w:pPr>
+      <w:rPr>
+        <w:rFonts w:ascii="Courier New" w:hAnsi="Courier New" w:hint="default"/>
+        <w:sz w:val="20"/>
+      </w:rPr>
+    </w:lvl>
+    <w:lvl w:ilvl="2" w:tentative="1">
+      <w:start w:val="1"/>
+      <w:numFmt w:val="bullet"/>
+      <w:lvlText w:val=""/>
+      <w:lvlJc w:val="left"/>
+      <w:pPr>
+        <w:tabs>
+          <w:tab w:val="num" w:pos="2160"/>
+        </w:tabs>
+        <w:ind w:left="2160" w:hanging="360"/>
+      </w:pPr>
+      <w:rPr>
+        <w:rFonts w:ascii="Wingdings" w:hAnsi="Wingdings" w:hint="default"/>
+        <w:sz w:val="20"/>
+      </w:rPr>
+    </w:lvl>
+    <w:lvl w:ilvl="3" w:tentative="1">
+      <w:start w:val="1"/>
+      <w:numFmt w:val="bullet"/>
+      <w:lvlText w:val=""/>
+      <w:lvlJc w:val="left"/>
+      <w:pPr>
+        <w:tabs>
+          <w:tab w:val="num" w:pos="2880"/>
+        </w:tabs>
+        <w:ind w:left="2880" w:hanging="360"/>
+      </w:pPr>
+      <w:rPr>
+        <w:rFonts w:ascii="Wingdings" w:hAnsi="Wingdings" w:hint="default"/>
+        <w:sz w:val="20"/>
+      </w:rPr>
+    </w:lvl>
+    <w:lvl w:ilvl="4" w:tentative="1">
+      <w:start w:val="1"/>
+      <w:numFmt w:val="bullet"/>
+      <w:lvlText w:val=""/>
+      <w:lvlJc w:val="left"/>
+      <w:pPr>
+        <w:tabs>
+          <w:tab w:val="num" w:pos="3600"/>
+        </w:tabs>
+        <w:ind w:left="3600" w:hanging="360"/>
+      </w:pPr>
+      <w:rPr>
+        <w:rFonts w:ascii="Wingdings" w:hAnsi="Wingdings" w:hint="default"/>
+        <w:sz w:val="20"/>
+      </w:rPr>
+    </w:lvl>
+    <w:lvl w:ilvl="5" w:tentative="1">
+      <w:start w:val="1"/>
+      <w:numFmt w:val="bullet"/>
+      <w:lvlText w:val=""/>
+      <w:lvlJc w:val="left"/>
+      <w:pPr>
+        <w:tabs>
+          <w:tab w:val="num" w:pos="4320"/>
+        </w:tabs>
+        <w:ind w:left="4320" w:hanging="360"/>
+      </w:pPr>
+      <w:rPr>
+        <w:rFonts w:ascii="Wingdings" w:hAnsi="Wingdings" w:hint="default"/>
+        <w:sz w:val="20"/>
+      </w:rPr>
+    </w:lvl>
+    <w:lvl w:ilvl="6" w:tentative="1">
+      <w:start w:val="1"/>
+      <w:numFmt w:val="bullet"/>
+      <w:lvlText w:val=""/>
+      <w:lvlJc w:val="left"/>
+      <w:pPr>
+        <w:tabs>
+          <w:tab w:val="num" w:pos="5040"/>
+        </w:tabs>
+        <w:ind w:left="5040" w:hanging="360"/>
+      </w:pPr>
+      <w:rPr>
+        <w:rFonts w:ascii="Wingdings" w:hAnsi="Wingdings" w:hint="default"/>
+        <w:sz w:val="20"/>
+      </w:rPr>
+    </w:lvl>
+    <w:lvl w:ilvl="7" w:tentative="1">
+      <w:start w:val="1"/>
+      <w:numFmt w:val="bullet"/>
+      <w:lvlText w:val=""/>
+      <w:lvlJc w:val="left"/>
+      <w:pPr>
+        <w:tabs>
+          <w:tab w:val="num" w:pos="5760"/>
+        </w:tabs>
+        <w:ind w:left="5760" w:hanging="360"/>
+      </w:pPr>
+      <w:rPr>
+        <w:rFonts w:ascii="Wingdings" w:hAnsi="Wingdings" w:hint="default"/>
+        <w:sz w:val="20"/>
+      </w:rPr>
+    </w:lvl>
+    <w:lvl w:ilvl="8" w:tentative="1">
+      <w:start w:val="1"/>
+      <w:numFmt w:val="bullet"/>
+      <w:lvlText w:val=""/>
+      <w:lvlJc w:val="left"/>
+      <w:pPr>
+        <w:tabs>
+          <w:tab w:val="num" w:pos="6480"/>
+        </w:tabs>
+        <w:ind w:left="6480" w:hanging="360"/>
+      </w:pPr>
+      <w:rPr>
+        <w:rFonts w:ascii="Wingdings" w:hAnsi="Wingdings" w:hint="default"/>
+        <w:sz w:val="20"/>
+      </w:rPr>
+    </w:lvl>
+  </w:abstractNum>
+  <w:abstractNum w:abstractNumId="12" w15:restartNumberingAfterBreak="0">
     <w:nsid w:val="424C1DC0"/>
     <w:multiLevelType w:val="multilevel"/>
     <w:tmpl w:val="F8FEB08C"/>
@@ -5889,7 +7009,156 @@
       </w:rPr>
     </w:lvl>
   </w:abstractNum>
-  <w:abstractNum w:abstractNumId="10" w15:restartNumberingAfterBreak="0">
+  <w:abstractNum w:abstractNumId="13" w15:restartNumberingAfterBreak="0">
+    <w:nsid w:val="4D6D016A"/>
+    <w:multiLevelType w:val="multilevel"/>
+    <w:tmpl w:val="FDF0813E"/>
+    <w:lvl w:ilvl="0">
+      <w:start w:val="1"/>
+      <w:numFmt w:val="bullet"/>
+      <w:lvlText w:val=""/>
+      <w:lvlJc w:val="left"/>
+      <w:pPr>
+        <w:tabs>
+          <w:tab w:val="num" w:pos="720"/>
+        </w:tabs>
+        <w:ind w:left="720" w:hanging="360"/>
+      </w:pPr>
+      <w:rPr>
+        <w:rFonts w:ascii="Symbol" w:hAnsi="Symbol" w:hint="default"/>
+        <w:sz w:val="20"/>
+      </w:rPr>
+    </w:lvl>
+    <w:lvl w:ilvl="1" w:tentative="1">
+      <w:start w:val="1"/>
+      <w:numFmt w:val="bullet"/>
+      <w:lvlText w:val="o"/>
+      <w:lvlJc w:val="left"/>
+      <w:pPr>
+        <w:tabs>
+          <w:tab w:val="num" w:pos="1440"/>
+        </w:tabs>
+        <w:ind w:left="1440" w:hanging="360"/>
+      </w:pPr>
+      <w:rPr>
+        <w:rFonts w:ascii="Courier New" w:hAnsi="Courier New" w:hint="default"/>
+        <w:sz w:val="20"/>
+      </w:rPr>
+    </w:lvl>
+    <w:lvl w:ilvl="2" w:tentative="1">
+      <w:start w:val="1"/>
+      <w:numFmt w:val="bullet"/>
+      <w:lvlText w:val=""/>
+      <w:lvlJc w:val="left"/>
+      <w:pPr>
+        <w:tabs>
+          <w:tab w:val="num" w:pos="2160"/>
+        </w:tabs>
+        <w:ind w:left="2160" w:hanging="360"/>
+      </w:pPr>
+      <w:rPr>
+        <w:rFonts w:ascii="Wingdings" w:hAnsi="Wingdings" w:hint="default"/>
+        <w:sz w:val="20"/>
+      </w:rPr>
+    </w:lvl>
+    <w:lvl w:ilvl="3" w:tentative="1">
+      <w:start w:val="1"/>
+      <w:numFmt w:val="bullet"/>
+      <w:lvlText w:val=""/>
+      <w:lvlJc w:val="left"/>
+      <w:pPr>
+        <w:tabs>
+          <w:tab w:val="num" w:pos="2880"/>
+        </w:tabs>
+        <w:ind w:left="2880" w:hanging="360"/>
+      </w:pPr>
+      <w:rPr>
+        <w:rFonts w:ascii="Wingdings" w:hAnsi="Wingdings" w:hint="default"/>
+        <w:sz w:val="20"/>
+      </w:rPr>
+    </w:lvl>
+    <w:lvl w:ilvl="4" w:tentative="1">
+      <w:start w:val="1"/>
+      <w:numFmt w:val="bullet"/>
+      <w:lvlText w:val=""/>
+      <w:lvlJc w:val="left"/>
+      <w:pPr>
+        <w:tabs>
+          <w:tab w:val="num" w:pos="3600"/>
+        </w:tabs>
+        <w:ind w:left="3600" w:hanging="360"/>
+      </w:pPr>
+      <w:rPr>
+        <w:rFonts w:ascii="Wingdings" w:hAnsi="Wingdings" w:hint="default"/>
+        <w:sz w:val="20"/>
+      </w:rPr>
+    </w:lvl>
+    <w:lvl w:ilvl="5" w:tentative="1">
+      <w:start w:val="1"/>
+      <w:numFmt w:val="bullet"/>
+      <w:lvlText w:val=""/>
+      <w:lvlJc w:val="left"/>
+      <w:pPr>
+        <w:tabs>
+          <w:tab w:val="num" w:pos="4320"/>
+        </w:tabs>
+        <w:ind w:left="4320" w:hanging="360"/>
+      </w:pPr>
+      <w:rPr>
+        <w:rFonts w:ascii="Wingdings" w:hAnsi="Wingdings" w:hint="default"/>
+        <w:sz w:val="20"/>
+      </w:rPr>
+    </w:lvl>
+    <w:lvl w:ilvl="6" w:tentative="1">
+      <w:start w:val="1"/>
+      <w:numFmt w:val="bullet"/>
+      <w:lvlText w:val=""/>
+      <w:lvlJc w:val="left"/>
+      <w:pPr>
+        <w:tabs>
+          <w:tab w:val="num" w:pos="5040"/>
+        </w:tabs>
+        <w:ind w:left="5040" w:hanging="360"/>
+      </w:pPr>
+      <w:rPr>
+        <w:rFonts w:ascii="Wingdings" w:hAnsi="Wingdings" w:hint="default"/>
+        <w:sz w:val="20"/>
+      </w:rPr>
+    </w:lvl>
+    <w:lvl w:ilvl="7" w:tentative="1">
+      <w:start w:val="1"/>
+      <w:numFmt w:val="bullet"/>
+      <w:lvlText w:val=""/>
+      <w:lvlJc w:val="left"/>
+      <w:pPr>
+        <w:tabs>
+          <w:tab w:val="num" w:pos="5760"/>
+        </w:tabs>
+        <w:ind w:left="5760" w:hanging="360"/>
+      </w:pPr>
+      <w:rPr>
+        <w:rFonts w:ascii="Wingdings" w:hAnsi="Wingdings" w:hint="default"/>
+        <w:sz w:val="20"/>
+      </w:rPr>
+    </w:lvl>
+    <w:lvl w:ilvl="8" w:tentative="1">
+      <w:start w:val="1"/>
+      <w:numFmt w:val="bullet"/>
+      <w:lvlText w:val=""/>
+      <w:lvlJc w:val="left"/>
+      <w:pPr>
+        <w:tabs>
+          <w:tab w:val="num" w:pos="6480"/>
+        </w:tabs>
+        <w:ind w:left="6480" w:hanging="360"/>
+      </w:pPr>
+      <w:rPr>
+        <w:rFonts w:ascii="Wingdings" w:hAnsi="Wingdings" w:hint="default"/>
+        <w:sz w:val="20"/>
+      </w:rPr>
+    </w:lvl>
+  </w:abstractNum>
+  <w:abstractNum w:abstractNumId="14" w15:restartNumberingAfterBreak="0">
     <w:nsid w:val="531757FC"/>
     <w:multiLevelType w:val="multilevel"/>
     <w:tmpl w:val="38823E20"/>
@@ -6038,7 +7307,7 @@
       </w:rPr>
     </w:lvl>
   </w:abstractNum>
-  <w:abstractNum w:abstractNumId="11" w15:restartNumberingAfterBreak="0">
+  <w:abstractNum w:abstractNumId="15" w15:restartNumberingAfterBreak="0">
     <w:nsid w:val="55AC5DFE"/>
     <w:multiLevelType w:val="hybridMultilevel"/>
     <w:tmpl w:val="36DAD27C"/>
@@ -6150,7 +7419,7 @@
       </w:rPr>
     </w:lvl>
   </w:abstractNum>
-  <w:abstractNum w:abstractNumId="12" w15:restartNumberingAfterBreak="0">
+  <w:abstractNum w:abstractNumId="16" w15:restartNumberingAfterBreak="0">
     <w:nsid w:val="5B8969A3"/>
     <w:multiLevelType w:val="multilevel"/>
     <w:tmpl w:val="9A88E3B8"/>
@@ -6299,7 +7568,7 @@
       </w:rPr>
     </w:lvl>
   </w:abstractNum>
-  <w:abstractNum w:abstractNumId="13" w15:restartNumberingAfterBreak="0">
+  <w:abstractNum w:abstractNumId="17" w15:restartNumberingAfterBreak="0">
     <w:nsid w:val="5D3C081A"/>
     <w:multiLevelType w:val="multilevel"/>
     <w:tmpl w:val="21482DF0"/>
@@ -6448,7 +7717,7 @@
       </w:rPr>
     </w:lvl>
   </w:abstractNum>
-  <w:abstractNum w:abstractNumId="14" w15:restartNumberingAfterBreak="0">
+  <w:abstractNum w:abstractNumId="18" w15:restartNumberingAfterBreak="0">
     <w:nsid w:val="5F811D83"/>
     <w:multiLevelType w:val="multilevel"/>
     <w:tmpl w:val="AF2EF6CA"/>
@@ -6565,7 +7834,7 @@
       </w:pPr>
     </w:lvl>
   </w:abstractNum>
-  <w:abstractNum w:abstractNumId="15" w15:restartNumberingAfterBreak="0">
+  <w:abstractNum w:abstractNumId="19" w15:restartNumberingAfterBreak="0">
     <w:nsid w:val="60D174E8"/>
     <w:multiLevelType w:val="multilevel"/>
     <w:tmpl w:val="596E5D82"/>
@@ -6714,7 +7983,156 @@
       </w:rPr>
     </w:lvl>
   </w:abstractNum>
-  <w:abstractNum w:abstractNumId="16" w15:restartNumberingAfterBreak="0">
+  <w:abstractNum w:abstractNumId="20" w15:restartNumberingAfterBreak="0">
+    <w:nsid w:val="66B03A28"/>
+    <w:multiLevelType w:val="multilevel"/>
+    <w:tmpl w:val="BE80EBE0"/>
+    <w:lvl w:ilvl="0">
+      <w:start w:val="1"/>
+      <w:numFmt w:val="bullet"/>
+      <w:lvlText w:val=""/>
+      <w:lvlJc w:val="left"/>
+      <w:pPr>
+        <w:tabs>
+          <w:tab w:val="num" w:pos="720"/>
+        </w:tabs>
+        <w:ind w:left="720" w:hanging="360"/>
+      </w:pPr>
+      <w:rPr>
+        <w:rFonts w:ascii="Symbol" w:hAnsi="Symbol" w:hint="default"/>
+        <w:sz w:val="20"/>
+      </w:rPr>
+    </w:lvl>
+    <w:lvl w:ilvl="1" w:tentative="1">
+      <w:start w:val="1"/>
+      <w:numFmt w:val="bullet"/>
+      <w:lvlText w:val="o"/>
+      <w:lvlJc w:val="left"/>
+      <w:pPr>
+        <w:tabs>
+          <w:tab w:val="num" w:pos="1440"/>
+        </w:tabs>
+        <w:ind w:left="1440" w:hanging="360"/>
+      </w:pPr>
+      <w:rPr>
+        <w:rFonts w:ascii="Courier New" w:hAnsi="Courier New" w:hint="default"/>
+        <w:sz w:val="20"/>
+      </w:rPr>
+    </w:lvl>
+    <w:lvl w:ilvl="2" w:tentative="1">
+      <w:start w:val="1"/>
+      <w:numFmt w:val="bullet"/>
+      <w:lvlText w:val=""/>
+      <w:lvlJc w:val="left"/>
+      <w:pPr>
+        <w:tabs>
+          <w:tab w:val="num" w:pos="2160"/>
+        </w:tabs>
+        <w:ind w:left="2160" w:hanging="360"/>
+      </w:pPr>
+      <w:rPr>
+        <w:rFonts w:ascii="Wingdings" w:hAnsi="Wingdings" w:hint="default"/>
+        <w:sz w:val="20"/>
+      </w:rPr>
+    </w:lvl>
+    <w:lvl w:ilvl="3" w:tentative="1">
+      <w:start w:val="1"/>
+      <w:numFmt w:val="bullet"/>
+      <w:lvlText w:val=""/>
+      <w:lvlJc w:val="left"/>
+      <w:pPr>
+        <w:tabs>
+          <w:tab w:val="num" w:pos="2880"/>
+        </w:tabs>
+        <w:ind w:left="2880" w:hanging="360"/>
+      </w:pPr>
+      <w:rPr>
+        <w:rFonts w:ascii="Wingdings" w:hAnsi="Wingdings" w:hint="default"/>
+        <w:sz w:val="20"/>
+      </w:rPr>
+    </w:lvl>
+    <w:lvl w:ilvl="4" w:tentative="1">
+      <w:start w:val="1"/>
+      <w:numFmt w:val="bullet"/>
+      <w:lvlText w:val=""/>
+      <w:lvlJc w:val="left"/>
+      <w:pPr>
+        <w:tabs>
+          <w:tab w:val="num" w:pos="3600"/>
+        </w:tabs>
+        <w:ind w:left="3600" w:hanging="360"/>
+      </w:pPr>
+      <w:rPr>
+        <w:rFonts w:ascii="Wingdings" w:hAnsi="Wingdings" w:hint="default"/>
+        <w:sz w:val="20"/>
+      </w:rPr>
+    </w:lvl>
+    <w:lvl w:ilvl="5" w:tentative="1">
+      <w:start w:val="1"/>
+      <w:numFmt w:val="bullet"/>
+      <w:lvlText w:val=""/>
+      <w:lvlJc w:val="left"/>
+      <w:pPr>
+        <w:tabs>
+          <w:tab w:val="num" w:pos="4320"/>
+        </w:tabs>
+        <w:ind w:left="4320" w:hanging="360"/>
+      </w:pPr>
+      <w:rPr>
+        <w:rFonts w:ascii="Wingdings" w:hAnsi="Wingdings" w:hint="default"/>
+        <w:sz w:val="20"/>
+      </w:rPr>
+    </w:lvl>
+    <w:lvl w:ilvl="6" w:tentative="1">
+      <w:start w:val="1"/>
+      <w:numFmt w:val="bullet"/>
+      <w:lvlText w:val=""/>
+      <w:lvlJc w:val="left"/>
+      <w:pPr>
+        <w:tabs>
+          <w:tab w:val="num" w:pos="5040"/>
+        </w:tabs>
+        <w:ind w:left="5040" w:hanging="360"/>
+      </w:pPr>
+      <w:rPr>
+        <w:rFonts w:ascii="Wingdings" w:hAnsi="Wingdings" w:hint="default"/>
+        <w:sz w:val="20"/>
+      </w:rPr>
+    </w:lvl>
+    <w:lvl w:ilvl="7" w:tentative="1">
+      <w:start w:val="1"/>
+      <w:numFmt w:val="bullet"/>
+      <w:lvlText w:val=""/>
+      <w:lvlJc w:val="left"/>
+      <w:pPr>
+        <w:tabs>
+          <w:tab w:val="num" w:pos="5760"/>
+        </w:tabs>
+        <w:ind w:left="5760" w:hanging="360"/>
+      </w:pPr>
+      <w:rPr>
+        <w:rFonts w:ascii="Wingdings" w:hAnsi="Wingdings" w:hint="default"/>
+        <w:sz w:val="20"/>
+      </w:rPr>
+    </w:lvl>
+    <w:lvl w:ilvl="8" w:tentative="1">
+      <w:start w:val="1"/>
+      <w:numFmt w:val="bullet"/>
+      <w:lvlText w:val=""/>
+      <w:lvlJc w:val="left"/>
+      <w:pPr>
+        <w:tabs>
+          <w:tab w:val="num" w:pos="6480"/>
+        </w:tabs>
+        <w:ind w:left="6480" w:hanging="360"/>
+      </w:pPr>
+      <w:rPr>
+        <w:rFonts w:ascii="Wingdings" w:hAnsi="Wingdings" w:hint="default"/>
+        <w:sz w:val="20"/>
+      </w:rPr>
+    </w:lvl>
+  </w:abstractNum>
+  <w:abstractNum w:abstractNumId="21" w15:restartNumberingAfterBreak="0">
     <w:nsid w:val="68990095"/>
     <w:multiLevelType w:val="multilevel"/>
     <w:tmpl w:val="081C9008"/>
@@ -6863,7 +8281,7 @@
       </w:rPr>
     </w:lvl>
   </w:abstractNum>
-  <w:abstractNum w:abstractNumId="17" w15:restartNumberingAfterBreak="0">
+  <w:abstractNum w:abstractNumId="22" w15:restartNumberingAfterBreak="0">
     <w:nsid w:val="695A01FE"/>
     <w:multiLevelType w:val="multilevel"/>
     <w:tmpl w:val="3F341B5A"/>
@@ -7012,7 +8430,7 @@
       </w:rPr>
     </w:lvl>
   </w:abstractNum>
-  <w:abstractNum w:abstractNumId="18" w15:restartNumberingAfterBreak="0">
+  <w:abstractNum w:abstractNumId="23" w15:restartNumberingAfterBreak="0">
     <w:nsid w:val="69B21CF1"/>
     <w:multiLevelType w:val="multilevel"/>
     <w:tmpl w:val="1924DA7A"/>
@@ -7161,7 +8579,7 @@
       </w:rPr>
     </w:lvl>
   </w:abstractNum>
-  <w:abstractNum w:abstractNumId="19" w15:restartNumberingAfterBreak="0">
+  <w:abstractNum w:abstractNumId="24" w15:restartNumberingAfterBreak="0">
     <w:nsid w:val="6C886AE0"/>
     <w:multiLevelType w:val="multilevel"/>
     <w:tmpl w:val="DC88E8B6"/>
@@ -7310,7 +8728,7 @@
       </w:rPr>
     </w:lvl>
   </w:abstractNum>
-  <w:abstractNum w:abstractNumId="20" w15:restartNumberingAfterBreak="0">
+  <w:abstractNum w:abstractNumId="25" w15:restartNumberingAfterBreak="0">
     <w:nsid w:val="727A74E0"/>
     <w:multiLevelType w:val="multilevel"/>
     <w:tmpl w:val="1AAA60C0"/>
@@ -7427,7 +8845,7 @@
       </w:pPr>
     </w:lvl>
   </w:abstractNum>
-  <w:abstractNum w:abstractNumId="21" w15:restartNumberingAfterBreak="0">
+  <w:abstractNum w:abstractNumId="26" w15:restartNumberingAfterBreak="0">
     <w:nsid w:val="72F85B6D"/>
     <w:multiLevelType w:val="multilevel"/>
     <w:tmpl w:val="46BAE0B8"/>
@@ -7544,7 +8962,119 @@
       </w:pPr>
     </w:lvl>
   </w:abstractNum>
-  <w:abstractNum w:abstractNumId="22" w15:restartNumberingAfterBreak="0">
+  <w:abstractNum w:abstractNumId="27" w15:restartNumberingAfterBreak="0">
+    <w:nsid w:val="754D6B88"/>
+    <w:multiLevelType w:val="hybridMultilevel"/>
+    <w:tmpl w:val="191EEA10"/>
+    <w:lvl w:ilvl="0" w:tplc="CDA6DBC6">
+      <w:numFmt w:val="bullet"/>
+      <w:lvlText w:val="-"/>
+      <w:lvlJc w:val="left"/>
+      <w:pPr>
+        <w:ind w:left="720" w:hanging="360"/>
+      </w:pPr>
+      <w:rPr>
+        <w:rFonts w:ascii="Aptos" w:eastAsiaTheme="minorHAnsi" w:hAnsi="Aptos" w:cstheme="minorBidi" w:hint="default"/>
+      </w:rPr>
+    </w:lvl>
+    <w:lvl w:ilvl="1" w:tplc="04100003" w:tentative="1">
+      <w:start w:val="1"/>
+      <w:numFmt w:val="bullet"/>
+      <w:lvlText w:val="o"/>
+      <w:lvlJc w:val="left"/>
+      <w:pPr>
+        <w:ind w:left="1440" w:hanging="360"/>
+      </w:pPr>
+      <w:rPr>
+        <w:rFonts w:ascii="Courier New" w:hAnsi="Courier New" w:cs="Courier New" w:hint="default"/>
+      </w:rPr>
+    </w:lvl>
+    <w:lvl w:ilvl="2" w:tplc="04100005" w:tentative="1">
+      <w:start w:val="1"/>
+      <w:numFmt w:val="bullet"/>
+      <w:lvlText w:val=""/>
+      <w:lvlJc w:val="left"/>
+      <w:pPr>
+        <w:ind w:left="2160" w:hanging="360"/>
+      </w:pPr>
+      <w:rPr>
+        <w:rFonts w:ascii="Wingdings" w:hAnsi="Wingdings" w:hint="default"/>
+      </w:rPr>
+    </w:lvl>
+    <w:lvl w:ilvl="3" w:tplc="04100001" w:tentative="1">
+      <w:start w:val="1"/>
+      <w:numFmt w:val="bullet"/>
+      <w:lvlText w:val=""/>
+      <w:lvlJc w:val="left"/>
+      <w:pPr>
+        <w:ind w:left="2880" w:hanging="360"/>
+      </w:pPr>
+      <w:rPr>
+        <w:rFonts w:ascii="Symbol" w:hAnsi="Symbol" w:hint="default"/>
+      </w:rPr>
+    </w:lvl>
+    <w:lvl w:ilvl="4" w:tplc="04100003" w:tentative="1">
+      <w:start w:val="1"/>
+      <w:numFmt w:val="bullet"/>
+      <w:lvlText w:val="o"/>
+      <w:lvlJc w:val="left"/>
+      <w:pPr>
+        <w:ind w:left="3600" w:hanging="360"/>
+      </w:pPr>
+      <w:rPr>
+        <w:rFonts w:ascii="Courier New" w:hAnsi="Courier New" w:cs="Courier New" w:hint="default"/>
+      </w:rPr>
+    </w:lvl>
+    <w:lvl w:ilvl="5" w:tplc="04100005" w:tentative="1">
+      <w:start w:val="1"/>
+      <w:numFmt w:val="bullet"/>
+      <w:lvlText w:val=""/>
+      <w:lvlJc w:val="left"/>
+      <w:pPr>
+        <w:ind w:left="4320" w:hanging="360"/>
+      </w:pPr>
+      <w:rPr>
+        <w:rFonts w:ascii="Wingdings" w:hAnsi="Wingdings" w:hint="default"/>
+      </w:rPr>
+    </w:lvl>
+    <w:lvl w:ilvl="6" w:tplc="04100001" w:tentative="1">
+      <w:start w:val="1"/>
+      <w:numFmt w:val="bullet"/>
+      <w:lvlText w:val=""/>
+      <w:lvlJc w:val="left"/>
+      <w:pPr>
+        <w:ind w:left="5040" w:hanging="360"/>
+      </w:pPr>
+      <w:rPr>
+        <w:rFonts w:ascii="Symbol" w:hAnsi="Symbol" w:hint="default"/>
+      </w:rPr>
+    </w:lvl>
+    <w:lvl w:ilvl="7" w:tplc="04100003" w:tentative="1">
+      <w:start w:val="1"/>
+      <w:numFmt w:val="bullet"/>
+      <w:lvlText w:val="o"/>
+      <w:lvlJc w:val="left"/>
+      <w:pPr>
+        <w:ind w:left="5760" w:hanging="360"/>
+      </w:pPr>
+      <w:rPr>
+        <w:rFonts w:ascii="Courier New" w:hAnsi="Courier New" w:cs="Courier New" w:hint="default"/>
+      </w:rPr>
+    </w:lvl>
+    <w:lvl w:ilvl="8" w:tplc="04100005" w:tentative="1">
+      <w:start w:val="1"/>
+      <w:numFmt w:val="bullet"/>
+      <w:lvlText w:val=""/>
+      <w:lvlJc w:val="left"/>
+      <w:pPr>
+        <w:ind w:left="6480" w:hanging="360"/>
+      </w:pPr>
+      <w:rPr>
+        <w:rFonts w:ascii="Wingdings" w:hAnsi="Wingdings" w:hint="default"/>
+      </w:rPr>
+    </w:lvl>
+  </w:abstractNum>
+  <w:abstractNum w:abstractNumId="28" w15:restartNumberingAfterBreak="0">
     <w:nsid w:val="76631757"/>
     <w:multiLevelType w:val="multilevel"/>
     <w:tmpl w:val="1AAA60C0"/>
@@ -7661,7 +9191,7 @@
       </w:pPr>
     </w:lvl>
   </w:abstractNum>
-  <w:abstractNum w:abstractNumId="23" w15:restartNumberingAfterBreak="0">
+  <w:abstractNum w:abstractNumId="29" w15:restartNumberingAfterBreak="0">
     <w:nsid w:val="767D5AC3"/>
     <w:multiLevelType w:val="multilevel"/>
     <w:tmpl w:val="8C8C5FFE"/>
@@ -7811,86 +9341,96 @@
     </w:lvl>
   </w:abstractNum>
   <w:num w:numId="1" w16cid:durableId="1880587512">
+    <w:abstractNumId w:val="6"/>
+  </w:num>
+  <w:num w:numId="2" w16cid:durableId="2088964189">
+    <w:abstractNumId w:val="21"/>
+  </w:num>
+  <w:num w:numId="3" w16cid:durableId="201016866">
+    <w:abstractNumId w:val="7"/>
+  </w:num>
+  <w:num w:numId="4" w16cid:durableId="983435067">
+    <w:abstractNumId w:val="26"/>
+  </w:num>
+  <w:num w:numId="5" w16cid:durableId="495923074">
+    <w:abstractNumId w:val="18"/>
+  </w:num>
+  <w:num w:numId="6" w16cid:durableId="909464386">
+    <w:abstractNumId w:val="3"/>
+  </w:num>
+  <w:num w:numId="7" w16cid:durableId="332879790">
+    <w:abstractNumId w:val="28"/>
+  </w:num>
+  <w:num w:numId="8" w16cid:durableId="257757845">
+    <w:abstractNumId w:val="25"/>
+  </w:num>
+  <w:num w:numId="9" w16cid:durableId="718015956">
+    <w:abstractNumId w:val="24"/>
+  </w:num>
+  <w:num w:numId="10" w16cid:durableId="1569148932">
+    <w:abstractNumId w:val="16"/>
+  </w:num>
+  <w:num w:numId="11" w16cid:durableId="275526376">
+    <w:abstractNumId w:val="29"/>
+  </w:num>
+  <w:num w:numId="12" w16cid:durableId="1696805028">
+    <w:abstractNumId w:val="5"/>
+  </w:num>
+  <w:num w:numId="13" w16cid:durableId="231936406">
+    <w:abstractNumId w:val="9"/>
+  </w:num>
+  <w:num w:numId="14" w16cid:durableId="154418669">
+    <w:abstractNumId w:val="23"/>
+  </w:num>
+  <w:num w:numId="15" w16cid:durableId="468479436">
+    <w:abstractNumId w:val="2"/>
+  </w:num>
+  <w:num w:numId="16" w16cid:durableId="171259351">
+    <w:abstractNumId w:val="10"/>
+  </w:num>
+  <w:num w:numId="17" w16cid:durableId="856188124">
+    <w:abstractNumId w:val="12"/>
+  </w:num>
+  <w:num w:numId="18" w16cid:durableId="68432494">
+    <w:abstractNumId w:val="8"/>
+  </w:num>
+  <w:num w:numId="19" w16cid:durableId="1505436379">
+    <w:abstractNumId w:val="17"/>
+  </w:num>
+  <w:num w:numId="20" w16cid:durableId="1411853943">
+    <w:abstractNumId w:val="19"/>
+  </w:num>
+  <w:num w:numId="21" w16cid:durableId="612979665">
     <w:abstractNumId w:val="4"/>
   </w:num>
-  <w:num w:numId="2" w16cid:durableId="2088964189">
-    <w:abstractNumId w:val="16"/>
+  <w:num w:numId="22" w16cid:durableId="1192718642">
+    <w:abstractNumId w:val="22"/>
   </w:num>
-  <w:num w:numId="3" w16cid:durableId="201016866">
-    <w:abstractNumId w:val="5"/>
-  </w:num>
-  <w:num w:numId="4" w16cid:durableId="983435067">
-    <w:abstractNumId w:val="21"/>
-  </w:num>
-  <w:num w:numId="5" w16cid:durableId="495923074">
+  <w:num w:numId="23" w16cid:durableId="1794711655">
     <w:abstractNumId w:val="14"/>
   </w:num>
-  <w:num w:numId="6" w16cid:durableId="909464386">
+  <w:num w:numId="24" w16cid:durableId="1238830158">
+    <w:abstractNumId w:val="15"/>
+  </w:num>
+  <w:num w:numId="25" w16cid:durableId="1024016715">
+    <w:abstractNumId w:val="20"/>
+  </w:num>
+  <w:num w:numId="26" w16cid:durableId="1238781006">
+    <w:abstractNumId w:val="13"/>
+  </w:num>
+  <w:num w:numId="27" w16cid:durableId="1700818853">
     <w:abstractNumId w:val="1"/>
   </w:num>
-  <w:num w:numId="7" w16cid:durableId="332879790">
-    <w:abstractNumId w:val="22"/>
+  <w:num w:numId="28" w16cid:durableId="531385872">
+    <w:abstractNumId w:val="27"/>
   </w:num>
-  <w:num w:numId="8" w16cid:durableId="257757845">
-    <w:abstractNumId w:val="20"/>
+  <w:num w:numId="29" w16cid:durableId="1443525506">
+    <w:abstractNumId w:val="11"/>
   </w:num>
-  <w:num w:numId="9" w16cid:durableId="718015956">
-    <w:abstractNumId w:val="19"/>
-  </w:num>
-  <w:num w:numId="10" w16cid:durableId="1569148932">
-    <w:abstractNumId w:val="12"/>
-  </w:num>
-  <w:num w:numId="11" w16cid:durableId="275526376">
-    <w:abstractNumId w:val="23"/>
-  </w:num>
-  <w:num w:numId="12" w16cid:durableId="1696805028">
-    <w:abstractNumId w:val="3"/>
-  </w:num>
-  <w:num w:numId="13" w16cid:durableId="231936406">
-    <w:abstractNumId w:val="7"/>
-  </w:num>
-  <w:num w:numId="14" w16cid:durableId="154418669">
-    <w:abstractNumId w:val="18"/>
-  </w:num>
-  <w:num w:numId="15" w16cid:durableId="468479436">
+  <w:num w:numId="30" w16cid:durableId="606236502">
     <w:abstractNumId w:val="0"/>
   </w:num>
-  <w:num w:numId="16" w16cid:durableId="171259351">
-    <w:abstractNumId w:val="8"/>
-  </w:num>
-  <w:num w:numId="17" w16cid:durableId="856188124">
-    <w:abstractNumId w:val="9"/>
-  </w:num>
-  <w:num w:numId="18" w16cid:durableId="68432494">
-    <w:abstractNumId w:val="6"/>
-  </w:num>
-  <w:num w:numId="19" w16cid:durableId="1505436379">
-    <w:abstractNumId w:val="13"/>
-  </w:num>
-  <w:num w:numId="20" w16cid:durableId="1411853943">
-    <w:abstractNumId w:val="15"/>
-  </w:num>
-  <w:num w:numId="21" w16cid:durableId="612979665">
-    <w:abstractNumId w:val="2"/>
-  </w:num>
-  <w:num w:numId="22" w16cid:durableId="1192718642">
-    <w:abstractNumId w:val="17"/>
-  </w:num>
-  <w:num w:numId="23" w16cid:durableId="1794711655">
-    <w:abstractNumId w:val="10"/>
-  </w:num>
-  <w:num w:numId="24" w16cid:durableId="1238830158">
-    <w:abstractNumId w:val="11"/>
-  </w:num>
 </w:numbering>
-</file>
-
-<file path=word/people.xml><?xml version="1.0" encoding="utf-8"?>
-<w15:people xmlns:wpc="http://schemas.microsoft.com/office/word/2010/wordprocessingCanvas" xmlns:cx="http://schemas.microsoft.com/office/drawing/2014/chartex" xmlns:cx1="http://schemas.microsoft.com/office/drawing/2015/9/8/chartex" xmlns:cx2="http://schemas.microsoft.com/office/drawing/2015/10/21/chartex" xmlns:cx3="http://schemas.microsoft.com/office/drawing/2016/5/9/chartex" xmlns:cx4="http://schemas.microsoft.com/office/drawing/2016/5/10/chartex" xmlns:cx5="http://schemas.microsoft.com/office/drawing/2016/5/11/chartex" xmlns:cx6="http://schemas.microsoft.com/office/drawing/2016/5/12/chartex" xmlns:cx7="http://schemas.microsoft.com/office/drawing/2016/5/13/chartex" xmlns:cx8="http://schemas.microsoft.com/office/drawing/2016/5/14/chartex" xmlns:mc="http://schemas.openxmlformats.org/markup-compatibility/2006" xmlns:aink="http://schemas.microsoft.com/office/drawing/2016/ink" xmlns:am3d="http://schemas.microsoft.com/office/drawing/2017/model3d" xmlns:o="urn:schemas-microsoft-com:office:office" xmlns:oel="http://schemas.microsoft.com/office/2019/extlst" xmlns:r="http://schemas.openxmlformats.org/officeDocument/2006/relationships" xmlns:m="http://schemas.openxmlformats.org/officeDocument/2006/math" xmlns:v="urn:schemas-microsoft-com:vml" xmlns:wp14="http://schemas.microsoft.com/office/word/2010/wordprocessingDrawing" xmlns:wp="http://schemas.openxmlformats.org/drawingml/2006/wordprocessingDrawing" xmlns:w10="urn:schemas-microsoft-com:office:word" xmlns:w="http://schemas.openxmlformats.org/wordprocessingml/2006/main" xmlns:w14="http://schemas.microsoft.com/office/word/2010/wordml" xmlns:w15="http://schemas.microsoft.com/office/word/2012/wordml" xmlns:w16cei="http://schemas.microsoft.com/office/word/2026/wordml/cei" xmlns:w16cex="http://schemas.microsoft.com/office/word/2018/wordml/cex" xmlns:w16cid="http://schemas.microsoft.com/office/word/2016/wordml/cid" xmlns:w16="http://schemas.microsoft.com/office/word/2018/wordml" xmlns:w16du="http://schemas.microsoft.com/office/word/2023/wordml/word16du" xmlns:w16sdtdh="http://schemas.microsoft.com/office/word/2020/wordml/sdtdatahash" xmlns:w16sdtfl="http://schemas.microsoft.com/office/word/2024/wordml/sdtformatlock" xmlns:w16se="http://schemas.microsoft.com/office/word/2015/wordml/symex" xmlns:wpg="http://schemas.microsoft.com/office/word/2010/wordprocessingGroup" xmlns:wpi="http://schemas.microsoft.com/office/word/2010/wordprocessingInk" xmlns:wne="http://schemas.microsoft.com/office/word/2006/wordml" xmlns:wps="http://schemas.microsoft.com/office/word/2010/wordprocessingShape" mc:Ignorable="w14 w15 w16se w16cid w16 w16cex w16sdtdh w16sdtfl w16du wp14">
-  <w15:person w15:author="Michel Papetti">
-    <w15:presenceInfo w15:providerId="Windows Live" w15:userId="1e1694875a2b2a98"/>
-  </w15:person>
-</w15:people>
 </file>
 
 <file path=word/styles.xml><?xml version="1.0" encoding="utf-8"?>
@@ -8290,15 +9830,16 @@
     <w:lsdException w:name="Unresolved Mention" w:semiHidden="1" w:unhideWhenUsed="1"/>
     <w:lsdException w:name="Smart Link" w:semiHidden="1" w:unhideWhenUsed="1"/>
   </w:latentStyles>
-  <w:style w:type="paragraph" w:default="1" w:styleId="Normal">
+  <w:style w:type="paragraph" w:default="1" w:styleId="Normale">
     <w:name w:val="Normal"/>
     <w:qFormat/>
+    <w:rsid w:val="00696F4B"/>
   </w:style>
-  <w:style w:type="paragraph" w:styleId="Heading1">
+  <w:style w:type="paragraph" w:styleId="Titolo1">
     <w:name w:val="heading 1"/>
-    <w:basedOn w:val="Normal"/>
-    <w:next w:val="Normal"/>
-    <w:link w:val="Heading1Char"/>
+    <w:basedOn w:val="Normale"/>
+    <w:next w:val="Normale"/>
+    <w:link w:val="Titolo1Carattere"/>
     <w:uiPriority w:val="9"/>
     <w:qFormat/>
     <w:rsid w:val="00855DB1"/>
@@ -8315,11 +9856,11 @@
       <w:szCs w:val="40"/>
     </w:rPr>
   </w:style>
-  <w:style w:type="paragraph" w:styleId="Heading2">
+  <w:style w:type="paragraph" w:styleId="Titolo2">
     <w:name w:val="heading 2"/>
-    <w:basedOn w:val="Normal"/>
-    <w:next w:val="Normal"/>
-    <w:link w:val="Heading2Char"/>
+    <w:basedOn w:val="Normale"/>
+    <w:next w:val="Normale"/>
+    <w:link w:val="Titolo2Carattere"/>
     <w:uiPriority w:val="9"/>
     <w:unhideWhenUsed/>
     <w:qFormat/>
@@ -8337,11 +9878,11 @@
       <w:szCs w:val="32"/>
     </w:rPr>
   </w:style>
-  <w:style w:type="paragraph" w:styleId="Heading3">
+  <w:style w:type="paragraph" w:styleId="Titolo3">
     <w:name w:val="heading 3"/>
-    <w:basedOn w:val="Normal"/>
-    <w:next w:val="Normal"/>
-    <w:link w:val="Heading3Char"/>
+    <w:basedOn w:val="Normale"/>
+    <w:next w:val="Normale"/>
+    <w:link w:val="Titolo3Carattere"/>
     <w:uiPriority w:val="9"/>
     <w:unhideWhenUsed/>
     <w:qFormat/>
@@ -8359,11 +9900,11 @@
       <w:szCs w:val="28"/>
     </w:rPr>
   </w:style>
-  <w:style w:type="paragraph" w:styleId="Heading4">
+  <w:style w:type="paragraph" w:styleId="Titolo4">
     <w:name w:val="heading 4"/>
-    <w:basedOn w:val="Normal"/>
-    <w:next w:val="Normal"/>
-    <w:link w:val="Heading4Char"/>
+    <w:basedOn w:val="Normale"/>
+    <w:next w:val="Normale"/>
+    <w:link w:val="Titolo4Carattere"/>
     <w:uiPriority w:val="9"/>
     <w:semiHidden/>
     <w:unhideWhenUsed/>
@@ -8382,11 +9923,11 @@
       <w:color w:val="0F4761" w:themeColor="accent1" w:themeShade="BF"/>
     </w:rPr>
   </w:style>
-  <w:style w:type="paragraph" w:styleId="Heading5">
+  <w:style w:type="paragraph" w:styleId="Titolo5">
     <w:name w:val="heading 5"/>
-    <w:basedOn w:val="Normal"/>
-    <w:next w:val="Normal"/>
-    <w:link w:val="Heading5Char"/>
+    <w:basedOn w:val="Normale"/>
+    <w:next w:val="Normale"/>
+    <w:link w:val="Titolo5Carattere"/>
     <w:uiPriority w:val="9"/>
     <w:semiHidden/>
     <w:unhideWhenUsed/>
@@ -8403,11 +9944,11 @@
       <w:color w:val="0F4761" w:themeColor="accent1" w:themeShade="BF"/>
     </w:rPr>
   </w:style>
-  <w:style w:type="paragraph" w:styleId="Heading6">
+  <w:style w:type="paragraph" w:styleId="Titolo6">
     <w:name w:val="heading 6"/>
-    <w:basedOn w:val="Normal"/>
-    <w:next w:val="Normal"/>
-    <w:link w:val="Heading6Char"/>
+    <w:basedOn w:val="Normale"/>
+    <w:next w:val="Normale"/>
+    <w:link w:val="Titolo6Carattere"/>
     <w:uiPriority w:val="9"/>
     <w:semiHidden/>
     <w:unhideWhenUsed/>
@@ -8426,11 +9967,11 @@
       <w:color w:val="595959" w:themeColor="text1" w:themeTint="A6"/>
     </w:rPr>
   </w:style>
-  <w:style w:type="paragraph" w:styleId="Heading7">
+  <w:style w:type="paragraph" w:styleId="Titolo7">
     <w:name w:val="heading 7"/>
-    <w:basedOn w:val="Normal"/>
-    <w:next w:val="Normal"/>
-    <w:link w:val="Heading7Char"/>
+    <w:basedOn w:val="Normale"/>
+    <w:next w:val="Normale"/>
+    <w:link w:val="Titolo7Carattere"/>
     <w:uiPriority w:val="9"/>
     <w:semiHidden/>
     <w:unhideWhenUsed/>
@@ -8447,11 +9988,11 @@
       <w:color w:val="595959" w:themeColor="text1" w:themeTint="A6"/>
     </w:rPr>
   </w:style>
-  <w:style w:type="paragraph" w:styleId="Heading8">
+  <w:style w:type="paragraph" w:styleId="Titolo8">
     <w:name w:val="heading 8"/>
-    <w:basedOn w:val="Normal"/>
-    <w:next w:val="Normal"/>
-    <w:link w:val="Heading8Char"/>
+    <w:basedOn w:val="Normale"/>
+    <w:next w:val="Normale"/>
+    <w:link w:val="Titolo8Carattere"/>
     <w:uiPriority w:val="9"/>
     <w:semiHidden/>
     <w:unhideWhenUsed/>
@@ -8470,11 +10011,11 @@
       <w:color w:val="272727" w:themeColor="text1" w:themeTint="D8"/>
     </w:rPr>
   </w:style>
-  <w:style w:type="paragraph" w:styleId="Heading9">
+  <w:style w:type="paragraph" w:styleId="Titolo9">
     <w:name w:val="heading 9"/>
-    <w:basedOn w:val="Normal"/>
-    <w:next w:val="Normal"/>
-    <w:link w:val="Heading9Char"/>
+    <w:basedOn w:val="Normale"/>
+    <w:next w:val="Normale"/>
+    <w:link w:val="Titolo9Carattere"/>
     <w:uiPriority w:val="9"/>
     <w:semiHidden/>
     <w:unhideWhenUsed/>
@@ -8491,12 +10032,12 @@
       <w:color w:val="272727" w:themeColor="text1" w:themeTint="D8"/>
     </w:rPr>
   </w:style>
-  <w:style w:type="character" w:default="1" w:styleId="DefaultParagraphFont">
+  <w:style w:type="character" w:default="1" w:styleId="Carpredefinitoparagrafo">
     <w:name w:val="Default Paragraph Font"/>
     <w:uiPriority w:val="1"/>
     <w:unhideWhenUsed/>
   </w:style>
-  <w:style w:type="table" w:default="1" w:styleId="TableNormal">
+  <w:style w:type="table" w:default="1" w:styleId="Tabellanormale">
     <w:name w:val="Normal Table"/>
     <w:uiPriority w:val="99"/>
     <w:semiHidden/>
@@ -8511,16 +10052,16 @@
       </w:tblCellMar>
     </w:tblPr>
   </w:style>
-  <w:style w:type="numbering" w:default="1" w:styleId="NoList">
+  <w:style w:type="numbering" w:default="1" w:styleId="Nessunelenco">
     <w:name w:val="No List"/>
     <w:uiPriority w:val="99"/>
     <w:semiHidden/>
     <w:unhideWhenUsed/>
   </w:style>
-  <w:style w:type="character" w:customStyle="1" w:styleId="Heading1Char">
-    <w:name w:val="Heading 1 Char"/>
-    <w:basedOn w:val="DefaultParagraphFont"/>
-    <w:link w:val="Heading1"/>
+  <w:style w:type="character" w:customStyle="1" w:styleId="Titolo1Carattere">
+    <w:name w:val="Titolo 1 Carattere"/>
+    <w:basedOn w:val="Carpredefinitoparagrafo"/>
+    <w:link w:val="Titolo1"/>
     <w:uiPriority w:val="9"/>
     <w:rsid w:val="00855DB1"/>
     <w:rPr>
@@ -8530,10 +10071,10 @@
       <w:szCs w:val="40"/>
     </w:rPr>
   </w:style>
-  <w:style w:type="character" w:customStyle="1" w:styleId="Heading2Char">
-    <w:name w:val="Heading 2 Char"/>
-    <w:basedOn w:val="DefaultParagraphFont"/>
-    <w:link w:val="Heading2"/>
+  <w:style w:type="character" w:customStyle="1" w:styleId="Titolo2Carattere">
+    <w:name w:val="Titolo 2 Carattere"/>
+    <w:basedOn w:val="Carpredefinitoparagrafo"/>
+    <w:link w:val="Titolo2"/>
     <w:uiPriority w:val="9"/>
     <w:rsid w:val="00855DB1"/>
     <w:rPr>
@@ -8543,10 +10084,10 @@
       <w:szCs w:val="32"/>
     </w:rPr>
   </w:style>
-  <w:style w:type="character" w:customStyle="1" w:styleId="Heading3Char">
-    <w:name w:val="Heading 3 Char"/>
-    <w:basedOn w:val="DefaultParagraphFont"/>
-    <w:link w:val="Heading3"/>
+  <w:style w:type="character" w:customStyle="1" w:styleId="Titolo3Carattere">
+    <w:name w:val="Titolo 3 Carattere"/>
+    <w:basedOn w:val="Carpredefinitoparagrafo"/>
+    <w:link w:val="Titolo3"/>
     <w:uiPriority w:val="9"/>
     <w:rsid w:val="00855DB1"/>
     <w:rPr>
@@ -8556,10 +10097,10 @@
       <w:szCs w:val="28"/>
     </w:rPr>
   </w:style>
-  <w:style w:type="character" w:customStyle="1" w:styleId="Heading4Char">
-    <w:name w:val="Heading 4 Char"/>
-    <w:basedOn w:val="DefaultParagraphFont"/>
-    <w:link w:val="Heading4"/>
+  <w:style w:type="character" w:customStyle="1" w:styleId="Titolo4Carattere">
+    <w:name w:val="Titolo 4 Carattere"/>
+    <w:basedOn w:val="Carpredefinitoparagrafo"/>
+    <w:link w:val="Titolo4"/>
     <w:uiPriority w:val="9"/>
     <w:semiHidden/>
     <w:rsid w:val="00855DB1"/>
@@ -8570,10 +10111,10 @@
       <w:color w:val="0F4761" w:themeColor="accent1" w:themeShade="BF"/>
     </w:rPr>
   </w:style>
-  <w:style w:type="character" w:customStyle="1" w:styleId="Heading5Char">
-    <w:name w:val="Heading 5 Char"/>
-    <w:basedOn w:val="DefaultParagraphFont"/>
-    <w:link w:val="Heading5"/>
+  <w:style w:type="character" w:customStyle="1" w:styleId="Titolo5Carattere">
+    <w:name w:val="Titolo 5 Carattere"/>
+    <w:basedOn w:val="Carpredefinitoparagrafo"/>
+    <w:link w:val="Titolo5"/>
     <w:uiPriority w:val="9"/>
     <w:semiHidden/>
     <w:rsid w:val="00855DB1"/>
@@ -8582,10 +10123,10 @@
       <w:color w:val="0F4761" w:themeColor="accent1" w:themeShade="BF"/>
     </w:rPr>
   </w:style>
-  <w:style w:type="character" w:customStyle="1" w:styleId="Heading6Char">
-    <w:name w:val="Heading 6 Char"/>
-    <w:basedOn w:val="DefaultParagraphFont"/>
-    <w:link w:val="Heading6"/>
+  <w:style w:type="character" w:customStyle="1" w:styleId="Titolo6Carattere">
+    <w:name w:val="Titolo 6 Carattere"/>
+    <w:basedOn w:val="Carpredefinitoparagrafo"/>
+    <w:link w:val="Titolo6"/>
     <w:uiPriority w:val="9"/>
     <w:semiHidden/>
     <w:rsid w:val="00855DB1"/>
@@ -8596,10 +10137,10 @@
       <w:color w:val="595959" w:themeColor="text1" w:themeTint="A6"/>
     </w:rPr>
   </w:style>
-  <w:style w:type="character" w:customStyle="1" w:styleId="Heading7Char">
-    <w:name w:val="Heading 7 Char"/>
-    <w:basedOn w:val="DefaultParagraphFont"/>
-    <w:link w:val="Heading7"/>
+  <w:style w:type="character" w:customStyle="1" w:styleId="Titolo7Carattere">
+    <w:name w:val="Titolo 7 Carattere"/>
+    <w:basedOn w:val="Carpredefinitoparagrafo"/>
+    <w:link w:val="Titolo7"/>
     <w:uiPriority w:val="9"/>
     <w:semiHidden/>
     <w:rsid w:val="00855DB1"/>
@@ -8608,10 +10149,10 @@
       <w:color w:val="595959" w:themeColor="text1" w:themeTint="A6"/>
     </w:rPr>
   </w:style>
-  <w:style w:type="character" w:customStyle="1" w:styleId="Heading8Char">
-    <w:name w:val="Heading 8 Char"/>
-    <w:basedOn w:val="DefaultParagraphFont"/>
-    <w:link w:val="Heading8"/>
+  <w:style w:type="character" w:customStyle="1" w:styleId="Titolo8Carattere">
+    <w:name w:val="Titolo 8 Carattere"/>
+    <w:basedOn w:val="Carpredefinitoparagrafo"/>
+    <w:link w:val="Titolo8"/>
     <w:uiPriority w:val="9"/>
     <w:semiHidden/>
     <w:rsid w:val="00855DB1"/>
@@ -8622,10 +10163,10 @@
       <w:color w:val="272727" w:themeColor="text1" w:themeTint="D8"/>
     </w:rPr>
   </w:style>
-  <w:style w:type="character" w:customStyle="1" w:styleId="Heading9Char">
-    <w:name w:val="Heading 9 Char"/>
-    <w:basedOn w:val="DefaultParagraphFont"/>
-    <w:link w:val="Heading9"/>
+  <w:style w:type="character" w:customStyle="1" w:styleId="Titolo9Carattere">
+    <w:name w:val="Titolo 9 Carattere"/>
+    <w:basedOn w:val="Carpredefinitoparagrafo"/>
+    <w:link w:val="Titolo9"/>
     <w:uiPriority w:val="9"/>
     <w:semiHidden/>
     <w:rsid w:val="00855DB1"/>
@@ -8634,11 +10175,11 @@
       <w:color w:val="272727" w:themeColor="text1" w:themeTint="D8"/>
     </w:rPr>
   </w:style>
-  <w:style w:type="paragraph" w:styleId="Title">
+  <w:style w:type="paragraph" w:styleId="Titolo">
     <w:name w:val="Title"/>
-    <w:basedOn w:val="Normal"/>
-    <w:next w:val="Normal"/>
-    <w:link w:val="TitleChar"/>
+    <w:basedOn w:val="Normale"/>
+    <w:next w:val="Normale"/>
+    <w:link w:val="TitoloCarattere"/>
     <w:uiPriority w:val="10"/>
     <w:qFormat/>
     <w:rsid w:val="00855DB1"/>
@@ -8654,10 +10195,10 @@
       <w:szCs w:val="56"/>
     </w:rPr>
   </w:style>
-  <w:style w:type="character" w:customStyle="1" w:styleId="TitleChar">
-    <w:name w:val="Title Char"/>
-    <w:basedOn w:val="DefaultParagraphFont"/>
-    <w:link w:val="Title"/>
+  <w:style w:type="character" w:customStyle="1" w:styleId="TitoloCarattere">
+    <w:name w:val="Titolo Carattere"/>
+    <w:basedOn w:val="Carpredefinitoparagrafo"/>
+    <w:link w:val="Titolo"/>
     <w:uiPriority w:val="10"/>
     <w:rsid w:val="00855DB1"/>
     <w:rPr>
@@ -8668,11 +10209,11 @@
       <w:szCs w:val="56"/>
     </w:rPr>
   </w:style>
-  <w:style w:type="paragraph" w:styleId="Subtitle">
+  <w:style w:type="paragraph" w:styleId="Sottotitolo">
     <w:name w:val="Subtitle"/>
-    <w:basedOn w:val="Normal"/>
-    <w:next w:val="Normal"/>
-    <w:link w:val="SubtitleChar"/>
+    <w:basedOn w:val="Normale"/>
+    <w:next w:val="Normale"/>
+    <w:link w:val="SottotitoloCarattere"/>
     <w:uiPriority w:val="11"/>
     <w:qFormat/>
     <w:rsid w:val="00855DB1"/>
@@ -8689,10 +10230,10 @@
       <w:szCs w:val="28"/>
     </w:rPr>
   </w:style>
-  <w:style w:type="character" w:customStyle="1" w:styleId="SubtitleChar">
-    <w:name w:val="Subtitle Char"/>
-    <w:basedOn w:val="DefaultParagraphFont"/>
-    <w:link w:val="Subtitle"/>
+  <w:style w:type="character" w:customStyle="1" w:styleId="SottotitoloCarattere">
+    <w:name w:val="Sottotitolo Carattere"/>
+    <w:basedOn w:val="Carpredefinitoparagrafo"/>
+    <w:link w:val="Sottotitolo"/>
     <w:uiPriority w:val="11"/>
     <w:rsid w:val="00855DB1"/>
     <w:rPr>
@@ -8703,11 +10244,11 @@
       <w:szCs w:val="28"/>
     </w:rPr>
   </w:style>
-  <w:style w:type="paragraph" w:styleId="Quote">
+  <w:style w:type="paragraph" w:styleId="Citazione">
     <w:name w:val="Quote"/>
-    <w:basedOn w:val="Normal"/>
-    <w:next w:val="Normal"/>
-    <w:link w:val="QuoteChar"/>
+    <w:basedOn w:val="Normale"/>
+    <w:next w:val="Normale"/>
+    <w:link w:val="CitazioneCarattere"/>
     <w:uiPriority w:val="29"/>
     <w:qFormat/>
     <w:rsid w:val="00855DB1"/>
@@ -8721,10 +10262,10 @@
       <w:color w:val="404040" w:themeColor="text1" w:themeTint="BF"/>
     </w:rPr>
   </w:style>
-  <w:style w:type="character" w:customStyle="1" w:styleId="QuoteChar">
-    <w:name w:val="Quote Char"/>
-    <w:basedOn w:val="DefaultParagraphFont"/>
-    <w:link w:val="Quote"/>
+  <w:style w:type="character" w:customStyle="1" w:styleId="CitazioneCarattere">
+    <w:name w:val="Citazione Carattere"/>
+    <w:basedOn w:val="Carpredefinitoparagrafo"/>
+    <w:link w:val="Citazione"/>
     <w:uiPriority w:val="29"/>
     <w:rsid w:val="00855DB1"/>
     <w:rPr>
@@ -8733,9 +10274,9 @@
       <w:color w:val="404040" w:themeColor="text1" w:themeTint="BF"/>
     </w:rPr>
   </w:style>
-  <w:style w:type="paragraph" w:styleId="ListParagraph">
+  <w:style w:type="paragraph" w:styleId="Paragrafoelenco">
     <w:name w:val="List Paragraph"/>
-    <w:basedOn w:val="Normal"/>
+    <w:basedOn w:val="Normale"/>
     <w:uiPriority w:val="34"/>
     <w:qFormat/>
     <w:rsid w:val="00855DB1"/>
@@ -8744,9 +10285,9 @@
       <w:contextualSpacing/>
     </w:pPr>
   </w:style>
-  <w:style w:type="character" w:styleId="IntenseEmphasis">
+  <w:style w:type="character" w:styleId="Enfasiintensa">
     <w:name w:val="Intense Emphasis"/>
-    <w:basedOn w:val="DefaultParagraphFont"/>
+    <w:basedOn w:val="Carpredefinitoparagrafo"/>
     <w:uiPriority w:val="21"/>
     <w:qFormat/>
     <w:rsid w:val="00855DB1"/>
@@ -8756,11 +10297,11 @@
       <w:color w:val="0F4761" w:themeColor="accent1" w:themeShade="BF"/>
     </w:rPr>
   </w:style>
-  <w:style w:type="paragraph" w:styleId="IntenseQuote">
+  <w:style w:type="paragraph" w:styleId="Citazioneintensa">
     <w:name w:val="Intense Quote"/>
-    <w:basedOn w:val="Normal"/>
-    <w:next w:val="Normal"/>
-    <w:link w:val="IntenseQuoteChar"/>
+    <w:basedOn w:val="Normale"/>
+    <w:next w:val="Normale"/>
+    <w:link w:val="CitazioneintensaCarattere"/>
     <w:uiPriority w:val="30"/>
     <w:qFormat/>
     <w:rsid w:val="00855DB1"/>
@@ -8779,10 +10320,10 @@
       <w:color w:val="0F4761" w:themeColor="accent1" w:themeShade="BF"/>
     </w:rPr>
   </w:style>
-  <w:style w:type="character" w:customStyle="1" w:styleId="IntenseQuoteChar">
-    <w:name w:val="Intense Quote Char"/>
-    <w:basedOn w:val="DefaultParagraphFont"/>
-    <w:link w:val="IntenseQuote"/>
+  <w:style w:type="character" w:customStyle="1" w:styleId="CitazioneintensaCarattere">
+    <w:name w:val="Citazione intensa Carattere"/>
+    <w:basedOn w:val="Carpredefinitoparagrafo"/>
+    <w:link w:val="Citazioneintensa"/>
     <w:uiPriority w:val="30"/>
     <w:rsid w:val="00855DB1"/>
     <w:rPr>
@@ -8791,9 +10332,9 @@
       <w:color w:val="0F4761" w:themeColor="accent1" w:themeShade="BF"/>
     </w:rPr>
   </w:style>
-  <w:style w:type="character" w:styleId="IntenseReference">
+  <w:style w:type="character" w:styleId="Riferimentointenso">
     <w:name w:val="Intense Reference"/>
-    <w:basedOn w:val="DefaultParagraphFont"/>
+    <w:basedOn w:val="Carpredefinitoparagrafo"/>
     <w:uiPriority w:val="32"/>
     <w:qFormat/>
     <w:rsid w:val="00855DB1"/>
@@ -8805,11 +10346,10 @@
       <w:spacing w:val="5"/>
     </w:rPr>
   </w:style>
-  <w:style w:type="paragraph" w:styleId="NormalWeb">
+  <w:style w:type="paragraph" w:styleId="NormaleWeb">
     <w:name w:val="Normal (Web)"/>
-    <w:basedOn w:val="Normal"/>
+    <w:basedOn w:val="Normale"/>
     <w:uiPriority w:val="99"/>
-    <w:semiHidden/>
     <w:unhideWhenUsed/>
     <w:rsid w:val="006B45C2"/>
     <w:pPr>
@@ -8821,9 +10361,9 @@
       <w14:ligatures w14:val="none"/>
     </w:rPr>
   </w:style>
-  <w:style w:type="character" w:styleId="Strong">
+  <w:style w:type="character" w:styleId="Enfasigrassetto">
     <w:name w:val="Strong"/>
-    <w:basedOn w:val="DefaultParagraphFont"/>
+    <w:basedOn w:val="Carpredefinitoparagrafo"/>
     <w:uiPriority w:val="22"/>
     <w:qFormat/>
     <w:rsid w:val="006B45C2"/>
@@ -8832,9 +10372,9 @@
       <w:bCs/>
     </w:rPr>
   </w:style>
-  <w:style w:type="table" w:styleId="GridTable1Light">
+  <w:style w:type="table" w:styleId="Tabellagriglia1chiara">
     <w:name w:val="Grid Table 1 Light"/>
-    <w:basedOn w:val="TableNormal"/>
+    <w:basedOn w:val="Tabellanormale"/>
     <w:uiPriority w:val="46"/>
     <w:rsid w:val="006B45C2"/>
     <w:pPr>
@@ -8889,9 +10429,9 @@
       </w:rPr>
     </w:tblStylePr>
   </w:style>
-  <w:style w:type="table" w:styleId="GridTable1Light-Accent1">
+  <w:style w:type="table" w:styleId="Tabellagriglia1chiara-colore1">
     <w:name w:val="Grid Table 1 Light Accent 1"/>
-    <w:basedOn w:val="TableNormal"/>
+    <w:basedOn w:val="Tabellanormale"/>
     <w:uiPriority w:val="46"/>
     <w:rsid w:val="006B45C2"/>
     <w:pPr>
@@ -8946,9 +10486,9 @@
       </w:rPr>
     </w:tblStylePr>
   </w:style>
-  <w:style w:type="table" w:styleId="GridTable1Light-Accent4">
+  <w:style w:type="table" w:styleId="Tabellagriglia1chiara-colore4">
     <w:name w:val="Grid Table 1 Light Accent 4"/>
-    <w:basedOn w:val="TableNormal"/>
+    <w:basedOn w:val="Tabellanormale"/>
     <w:uiPriority w:val="46"/>
     <w:rsid w:val="006B45C2"/>
     <w:pPr>
@@ -9003,9 +10543,9 @@
       </w:rPr>
     </w:tblStylePr>
   </w:style>
-  <w:style w:type="table" w:styleId="GridTable4-Accent1">
+  <w:style w:type="table" w:styleId="Tabellagriglia4-colore1">
     <w:name w:val="Grid Table 4 Accent 1"/>
-    <w:basedOn w:val="TableNormal"/>
+    <w:basedOn w:val="Tabellanormale"/>
     <w:uiPriority w:val="49"/>
     <w:rsid w:val="006B45C2"/>
     <w:pPr>
@@ -9079,9 +10619,9 @@
       </w:tcPr>
     </w:tblStylePr>
   </w:style>
-  <w:style w:type="table" w:styleId="ListTable3-Accent1">
+  <w:style w:type="table" w:styleId="Tabellaelenco3-colore1">
     <w:name w:val="List Table 3 Accent 1"/>
-    <w:basedOn w:val="TableNormal"/>
+    <w:basedOn w:val="Tabellanormale"/>
     <w:uiPriority w:val="48"/>
     <w:rsid w:val="00D12B66"/>
     <w:pPr>
@@ -9203,9 +10743,9 @@
       </w:tcPr>
     </w:tblStylePr>
   </w:style>
-  <w:style w:type="character" w:styleId="CommentReference">
+  <w:style w:type="character" w:styleId="Rimandocommento">
     <w:name w:val="annotation reference"/>
-    <w:basedOn w:val="DefaultParagraphFont"/>
+    <w:basedOn w:val="Carpredefinitoparagrafo"/>
     <w:uiPriority w:val="99"/>
     <w:semiHidden/>
     <w:unhideWhenUsed/>
@@ -9215,10 +10755,10 @@
       <w:szCs w:val="16"/>
     </w:rPr>
   </w:style>
-  <w:style w:type="paragraph" w:styleId="CommentText">
+  <w:style w:type="paragraph" w:styleId="Testocommento">
     <w:name w:val="annotation text"/>
-    <w:basedOn w:val="Normal"/>
-    <w:link w:val="CommentTextChar"/>
+    <w:basedOn w:val="Normale"/>
+    <w:link w:val="TestocommentoCarattere"/>
     <w:uiPriority w:val="99"/>
     <w:semiHidden/>
     <w:unhideWhenUsed/>
@@ -9231,10 +10771,10 @@
       <w:szCs w:val="20"/>
     </w:rPr>
   </w:style>
-  <w:style w:type="character" w:customStyle="1" w:styleId="CommentTextChar">
-    <w:name w:val="Comment Text Char"/>
-    <w:basedOn w:val="DefaultParagraphFont"/>
-    <w:link w:val="CommentText"/>
+  <w:style w:type="character" w:customStyle="1" w:styleId="TestocommentoCarattere">
+    <w:name w:val="Testo commento Carattere"/>
+    <w:basedOn w:val="Carpredefinitoparagrafo"/>
+    <w:link w:val="Testocommento"/>
     <w:uiPriority w:val="99"/>
     <w:semiHidden/>
     <w:rsid w:val="004A52E0"/>
@@ -9243,11 +10783,11 @@
       <w:szCs w:val="20"/>
     </w:rPr>
   </w:style>
-  <w:style w:type="paragraph" w:styleId="CommentSubject">
+  <w:style w:type="paragraph" w:styleId="Soggettocommento">
     <w:name w:val="annotation subject"/>
-    <w:basedOn w:val="CommentText"/>
-    <w:next w:val="CommentText"/>
-    <w:link w:val="CommentSubjectChar"/>
+    <w:basedOn w:val="Testocommento"/>
+    <w:next w:val="Testocommento"/>
+    <w:link w:val="SoggettocommentoCarattere"/>
     <w:uiPriority w:val="99"/>
     <w:semiHidden/>
     <w:unhideWhenUsed/>
@@ -9257,16 +10797,29 @@
       <w:bCs/>
     </w:rPr>
   </w:style>
-  <w:style w:type="character" w:customStyle="1" w:styleId="CommentSubjectChar">
-    <w:name w:val="Comment Subject Char"/>
-    <w:basedOn w:val="CommentTextChar"/>
-    <w:link w:val="CommentSubject"/>
+  <w:style w:type="character" w:customStyle="1" w:styleId="SoggettocommentoCarattere">
+    <w:name w:val="Soggetto commento Carattere"/>
+    <w:basedOn w:val="TestocommentoCarattere"/>
+    <w:link w:val="Soggettocommento"/>
     <w:uiPriority w:val="99"/>
     <w:semiHidden/>
     <w:rsid w:val="004A52E0"/>
     <w:rPr>
       <w:b/>
       <w:bCs/>
+      <w:sz w:val="20"/>
+      <w:szCs w:val="20"/>
+    </w:rPr>
+  </w:style>
+  <w:style w:type="character" w:styleId="CodiceHTML">
+    <w:name w:val="HTML Code"/>
+    <w:basedOn w:val="Carpredefinitoparagrafo"/>
+    <w:uiPriority w:val="99"/>
+    <w:semiHidden/>
+    <w:unhideWhenUsed/>
+    <w:rsid w:val="0067346A"/>
+    <w:rPr>
+      <w:rFonts w:ascii="Courier New" w:eastAsia="Times New Roman" w:hAnsi="Courier New" w:cs="Courier New"/>
       <w:sz w:val="20"/>
       <w:szCs w:val="20"/>
     </w:rPr>

</xml_diff>